<commit_message>
Revert some of the reactivity changes
  - Keep dropdownButton for plot settings
</commit_message>
<xml_diff>
--- a/www/template_officer.docx
+++ b/www/template_officer.docx
@@ -59,7 +59,6 @@
       <w:jc w:val="center"/>
       <w:rPr>
         <w:rFonts w:eastAsia="Times New Roman" w:cs="Times New Roman"/>
-        <w:lang w:eastAsia="en-US"/>
       </w:rPr>
     </w:pPr>
   </w:p>
@@ -1424,7 +1423,8 @@
   <w:docDefaults>
     <w:rPrDefault>
       <w:rPr>
-        <w:rFonts w:ascii="Times New Roman" w:eastAsia="Times New Roman" w:hAnsi="Times New Roman" w:cs="Times New Roman"/>
+        <w:rFonts w:ascii="Arial" w:eastAsia="Times New Roman" w:hAnsi="Arial" w:cs="Times New Roman"/>
+        <w:sz w:val="18"/>
         <w:lang w:val="en-US" w:eastAsia="en-US" w:bidi="ar-SA"/>
       </w:rPr>
     </w:rPrDefault>
@@ -1814,11 +1814,6 @@
     <w:pPr>
       <w:spacing w:before="40"/>
     </w:pPr>
-    <w:rPr>
-      <w:rFonts w:eastAsia="MS Mincho"/>
-      <w:sz w:val="24"/>
-      <w:lang w:eastAsia="zh-CN"/>
-    </w:rPr>
   </w:style>
   <w:style w:type="paragraph" w:styleId="Heading1">
     <w:name w:val="heading 1"/>
@@ -1836,7 +1831,7 @@
       <w:outlineLvl w:val="0"/>
     </w:pPr>
     <w:rPr>
-      <w:rFonts w:ascii="Arial" w:eastAsia="MS Gothic" w:hAnsi="Arial" w:cs="Arial"/>
+      <w:rFonts w:eastAsia="MS Gothic" w:cs="Arial"/>
       <w:b/>
       <w:sz w:val="28"/>
     </w:rPr>
@@ -1859,7 +1854,7 @@
       <w:outlineLvl w:val="1"/>
     </w:pPr>
     <w:rPr>
-      <w:rFonts w:ascii="Arial" w:eastAsia="MS Gothic" w:hAnsi="Arial" w:cs="Arial"/>
+      <w:rFonts w:eastAsia="MS Gothic" w:cs="Arial"/>
       <w:b/>
       <w:sz w:val="26"/>
     </w:rPr>
@@ -1882,7 +1877,7 @@
       <w:outlineLvl w:val="2"/>
     </w:pPr>
     <w:rPr>
-      <w:rFonts w:ascii="Arial" w:eastAsia="MS Gothic" w:hAnsi="Arial" w:cs="Arial"/>
+      <w:rFonts w:eastAsia="MS Gothic" w:cs="Arial"/>
       <w:b/>
     </w:rPr>
   </w:style>
@@ -1903,7 +1898,7 @@
       <w:outlineLvl w:val="3"/>
     </w:pPr>
     <w:rPr>
-      <w:rFonts w:ascii="Arial" w:eastAsia="MS Gothic" w:hAnsi="Arial" w:cs="Arial"/>
+      <w:rFonts w:eastAsia="MS Gothic" w:cs="Arial"/>
       <w:b/>
     </w:rPr>
   </w:style>
@@ -1938,7 +1933,7 @@
       <w:outlineLvl w:val="5"/>
     </w:pPr>
     <w:rPr>
-      <w:rFonts w:ascii="Arial" w:eastAsia="MS Gothic" w:hAnsi="Arial" w:cs="Arial"/>
+      <w:rFonts w:eastAsia="MS Gothic" w:cs="Arial"/>
       <w:b/>
       <w:sz w:val="22"/>
     </w:rPr>
@@ -1957,7 +1952,7 @@
       <w:outlineLvl w:val="6"/>
     </w:pPr>
     <w:rPr>
-      <w:rFonts w:ascii="Arial" w:eastAsia="MS Gothic" w:hAnsi="Arial" w:cs="Arial"/>
+      <w:rFonts w:eastAsia="MS Gothic" w:cs="Arial"/>
       <w:b/>
       <w:sz w:val="22"/>
     </w:rPr>
@@ -1989,7 +1984,7 @@
       <w:outlineLvl w:val="8"/>
     </w:pPr>
     <w:rPr>
-      <w:rFonts w:ascii="Arial" w:hAnsi="Arial" w:cs="Arial"/>
+      <w:rFonts w:cs="Arial"/>
       <w:sz w:val="22"/>
       <w:szCs w:val="22"/>
     </w:rPr>
@@ -2044,7 +2039,7 @@
       <w:spacing w:before="240" w:after="60"/>
     </w:pPr>
     <w:rPr>
-      <w:rFonts w:ascii="Arial" w:eastAsia="MS Gothic" w:hAnsi="Arial" w:cs="Arial"/>
+      <w:rFonts w:eastAsia="MS Gothic" w:cs="Arial"/>
       <w:b/>
       <w:szCs w:val="24"/>
     </w:rPr>
@@ -2058,7 +2053,7 @@
       <w:spacing w:before="240"/>
     </w:pPr>
     <w:rPr>
-      <w:rFonts w:ascii="Arial" w:eastAsia="MS Gothic" w:hAnsi="Arial" w:cs="Arial"/>
+      <w:rFonts w:eastAsia="MS Gothic" w:cs="Arial"/>
     </w:rPr>
   </w:style>
   <w:style w:type="paragraph" w:customStyle="1" w:styleId="Listlevel1">
@@ -2108,7 +2103,7 @@
       <w:jc w:val="center"/>
     </w:pPr>
     <w:rPr>
-      <w:rFonts w:ascii="Arial" w:eastAsia="MS Gothic" w:hAnsi="Arial" w:cs="Arial"/>
+      <w:rFonts w:eastAsia="MS Gothic" w:cs="Arial"/>
       <w:sz w:val="32"/>
     </w:rPr>
   </w:style>
@@ -2122,7 +2117,7 @@
       <w:jc w:val="center"/>
     </w:pPr>
     <w:rPr>
-      <w:rFonts w:ascii="Arial" w:eastAsia="MS Gothic" w:hAnsi="Arial" w:cs="Arial"/>
+      <w:rFonts w:eastAsia="MS Gothic" w:cs="Arial"/>
       <w:sz w:val="28"/>
     </w:rPr>
   </w:style>
@@ -2136,7 +2131,7 @@
       <w:jc w:val="center"/>
     </w:pPr>
     <w:rPr>
-      <w:rFonts w:ascii="Arial" w:eastAsia="MS Gothic" w:hAnsi="Arial" w:cs="Arial"/>
+      <w:rFonts w:eastAsia="MS Gothic" w:cs="Arial"/>
       <w:sz w:val="28"/>
     </w:rPr>
   </w:style>
@@ -2149,7 +2144,7 @@
       <w:spacing w:before="240"/>
     </w:pPr>
     <w:rPr>
-      <w:rFonts w:ascii="Arial" w:eastAsia="MS Gothic" w:hAnsi="Arial" w:cs="Arial"/>
+      <w:rFonts w:eastAsia="MS Gothic" w:cs="Arial"/>
     </w:rPr>
   </w:style>
   <w:style w:type="paragraph" w:customStyle="1" w:styleId="Doctype">
@@ -2201,7 +2196,7 @@
       </w:tabs>
     </w:pPr>
     <w:rPr>
-      <w:rFonts w:ascii="Arial" w:eastAsia="MS Gothic" w:hAnsi="Arial" w:cs="Arial"/>
+      <w:rFonts w:eastAsia="MS Gothic" w:cs="Arial"/>
       <w:sz w:val="20"/>
     </w:rPr>
   </w:style>
@@ -2214,7 +2209,7 @@
       <w:spacing w:before="240"/>
     </w:pPr>
     <w:rPr>
-      <w:rFonts w:ascii="Arial" w:eastAsia="MS Gothic" w:hAnsi="Arial" w:cs="Arial"/>
+      <w:rFonts w:eastAsia="MS Gothic" w:cs="Arial"/>
       <w:szCs w:val="24"/>
     </w:rPr>
   </w:style>
@@ -2261,7 +2256,7 @@
       <w:jc w:val="center"/>
     </w:pPr>
     <w:rPr>
-      <w:rFonts w:ascii="Arial" w:eastAsia="MS Gothic" w:hAnsi="Arial" w:cs="Arial"/>
+      <w:rFonts w:eastAsia="MS Gothic" w:cs="Arial"/>
       <w:b/>
       <w:sz w:val="32"/>
     </w:rPr>
@@ -2355,7 +2350,6 @@
     <w:rPr>
       <w:rFonts w:ascii="Courier New" w:hAnsi="Courier New"/>
       <w:spacing w:val="-10"/>
-      <w:sz w:val="18"/>
     </w:rPr>
   </w:style>
   <w:style w:type="paragraph" w:customStyle="1" w:styleId="Reference">
@@ -2428,7 +2422,7 @@
     <w:basedOn w:val="Text"/>
     <w:rsid w:val="00093D29"/>
     <w:rPr>
-      <w:rFonts w:ascii="Arial" w:eastAsia="MS Gothic" w:hAnsi="Arial"/>
+      <w:rFonts w:eastAsia="MS Gothic"/>
       <w:sz w:val="20"/>
     </w:rPr>
   </w:style>
@@ -2630,7 +2624,7 @@
       <w:ind w:left="2880"/>
     </w:pPr>
     <w:rPr>
-      <w:rFonts w:ascii="Arial" w:hAnsi="Arial" w:cs="Arial"/>
+      <w:rFonts w:cs="Arial"/>
       <w:szCs w:val="24"/>
     </w:rPr>
   </w:style>
@@ -2640,7 +2634,7 @@
     <w:semiHidden/>
     <w:rsid w:val="00093D29"/>
     <w:rPr>
-      <w:rFonts w:ascii="Arial" w:hAnsi="Arial" w:cs="Arial"/>
+      <w:rFonts w:cs="Arial"/>
       <w:sz w:val="20"/>
     </w:rPr>
   </w:style>
@@ -2935,7 +2929,7 @@
       <w:ind w:left="1080" w:hanging="1080"/>
     </w:pPr>
     <w:rPr>
-      <w:rFonts w:ascii="Arial" w:hAnsi="Arial" w:cs="Arial"/>
+      <w:rFonts w:cs="Arial"/>
       <w:szCs w:val="24"/>
     </w:rPr>
   </w:style>
@@ -3000,7 +2994,7 @@
       <w:outlineLvl w:val="1"/>
     </w:pPr>
     <w:rPr>
-      <w:rFonts w:ascii="Arial" w:hAnsi="Arial" w:cs="Arial"/>
+      <w:rFonts w:cs="Arial"/>
       <w:szCs w:val="24"/>
     </w:rPr>
   </w:style>
@@ -5974,7 +5968,6 @@
     <w:basedOn w:val="SAStext"/>
     <w:rsid w:val="00093D29"/>
     <w:rPr>
-      <w:sz w:val="18"/>
       <w:szCs w:val="18"/>
     </w:rPr>
   </w:style>
@@ -6249,7 +6242,7 @@
     <w:semiHidden/>
     <w:rsid w:val="00093D29"/>
     <w:rPr>
-      <w:rFonts w:ascii="Arial" w:hAnsi="Arial" w:cs="Arial"/>
+      <w:rFonts w:cs="Arial"/>
       <w:b/>
       <w:bCs/>
     </w:rPr>
@@ -6303,7 +6296,7 @@
       <w:spacing w:before="120"/>
     </w:pPr>
     <w:rPr>
-      <w:rFonts w:ascii="Arial" w:hAnsi="Arial" w:cs="Arial"/>
+      <w:rFonts w:cs="Arial"/>
       <w:b/>
       <w:bCs/>
       <w:szCs w:val="24"/>
@@ -16866,6 +16859,15 @@
 </file>
 
 <file path=customXml/item1.xml><?xml version="1.0" encoding="utf-8"?>
+<?mso-contentType ?>
+<FormTemplates xmlns="http://schemas.microsoft.com/sharepoint/v3/contenttype/forms">
+  <Display>DocumentLibraryForm</Display>
+  <Edit>DocumentLibraryForm</Edit>
+  <New>DocumentLibraryForm</New>
+</FormTemplates>
+</file>
+
+<file path=customXml/item2.xml><?xml version="1.0" encoding="utf-8"?>
 <ct:contentTypeSchema xmlns:ct="http://schemas.microsoft.com/office/2006/metadata/contentType" xmlns:ma="http://schemas.microsoft.com/office/2006/metadata/properties/metaAttributes" ct:_="" ma:_="" ma:contentTypeName="Document" ma:contentTypeID="0x0101006CD819919156C74F9E80DEFAAA1872C9" ma:contentTypeVersion="13" ma:contentTypeDescription="Create a new document." ma:contentTypeScope="" ma:versionID="50fe0e456e6faea8f88245a91881c3b5">
   <xsd:schema xmlns:xsd="http://www.w3.org/2001/XMLSchema" xmlns:xs="http://www.w3.org/2001/XMLSchema" xmlns:p="http://schemas.microsoft.com/office/2006/metadata/properties" xmlns:ns3="ad003f3d-2e17-4db5-b60d-526df86ad0f0" xmlns:ns4="fe03d810-5ba5-4302-839c-9214d405f10a" targetNamespace="http://schemas.microsoft.com/office/2006/metadata/properties" ma:root="true" ma:fieldsID="6e6e107fec7a88999611c5ac4043d74e" ns3:_="" ns4:_="">
     <xsd:import namespace="ad003f3d-2e17-4db5-b60d-526df86ad0f0"/>
@@ -17088,26 +17090,25 @@
 </ct:contentTypeSchema>
 </file>
 
-<file path=customXml/item2.xml><?xml version="1.0" encoding="utf-8"?>
-<?mso-contentType ?>
-<FormTemplates xmlns="http://schemas.microsoft.com/sharepoint/v3/contenttype/forms">
-  <Display>DocumentLibraryForm</Display>
-  <Edit>DocumentLibraryForm</Edit>
-  <New>DocumentLibraryForm</New>
-</FormTemplates>
+<file path=customXml/item3.xml><?xml version="1.0" encoding="utf-8"?>
+<b:Sources xmlns:b="http://schemas.openxmlformats.org/officeDocument/2006/bibliography" xmlns="http://schemas.openxmlformats.org/officeDocument/2006/bibliography" SelectedStyle="\APA.XSL" StyleName="APA"/>
 </file>
 
-<file path=customXml/item3.xml><?xml version="1.0" encoding="utf-8"?>
+<file path=customXml/item4.xml><?xml version="1.0" encoding="utf-8"?>
 <p:properties xmlns:p="http://schemas.microsoft.com/office/2006/metadata/properties" xmlns:xsi="http://www.w3.org/2001/XMLSchema-instance" xmlns:pc="http://schemas.microsoft.com/office/infopath/2007/PartnerControls">
   <documentManagement/>
 </p:properties>
 </file>
 
-<file path=customXml/item4.xml><?xml version="1.0" encoding="utf-8"?>
-<b:Sources xmlns:b="http://schemas.openxmlformats.org/officeDocument/2006/bibliography" xmlns="http://schemas.openxmlformats.org/officeDocument/2006/bibliography" SelectedStyle="\APA.XSL" StyleName="APA"/>
+<file path=customXml/itemProps1.xml><?xml version="1.0" encoding="utf-8"?>
+<ds:datastoreItem xmlns:ds="http://schemas.openxmlformats.org/officeDocument/2006/customXml" ds:itemID="{33FCBF9B-6E0C-4F57-AC32-FF1FD3666DDF}">
+  <ds:schemaRefs>
+    <ds:schemaRef ds:uri="http://schemas.microsoft.com/sharepoint/v3/contenttype/forms"/>
+  </ds:schemaRefs>
+</ds:datastoreItem>
 </file>
 
-<file path=customXml/itemProps1.xml><?xml version="1.0" encoding="utf-8"?>
+<file path=customXml/itemProps2.xml><?xml version="1.0" encoding="utf-8"?>
 <ds:datastoreItem xmlns:ds="http://schemas.openxmlformats.org/officeDocument/2006/customXml" ds:itemID="{6920E0C2-09F2-44E2-A637-8E6DCD4CC191}">
   <ds:schemaRefs>
     <ds:schemaRef ds:uri="http://schemas.microsoft.com/office/2006/metadata/contentType"/>
@@ -17126,27 +17127,19 @@
 </ds:datastoreItem>
 </file>
 
-<file path=customXml/itemProps2.xml><?xml version="1.0" encoding="utf-8"?>
-<ds:datastoreItem xmlns:ds="http://schemas.openxmlformats.org/officeDocument/2006/customXml" ds:itemID="{33FCBF9B-6E0C-4F57-AC32-FF1FD3666DDF}">
+<file path=customXml/itemProps3.xml><?xml version="1.0" encoding="utf-8"?>
+<ds:datastoreItem xmlns:ds="http://schemas.openxmlformats.org/officeDocument/2006/customXml" ds:itemID="{1C73CA8F-0D0F-4C99-8EE8-8C153284B2D9}">
   <ds:schemaRefs>
-    <ds:schemaRef ds:uri="http://schemas.microsoft.com/sharepoint/v3/contenttype/forms"/>
+    <ds:schemaRef ds:uri="http://schemas.openxmlformats.org/officeDocument/2006/bibliography"/>
   </ds:schemaRefs>
 </ds:datastoreItem>
 </file>
 
-<file path=customXml/itemProps3.xml><?xml version="1.0" encoding="utf-8"?>
+<file path=customXml/itemProps4.xml><?xml version="1.0" encoding="utf-8"?>
 <ds:datastoreItem xmlns:ds="http://schemas.openxmlformats.org/officeDocument/2006/customXml" ds:itemID="{FCF06B24-A51F-4A21-B53C-33296C61BF86}">
   <ds:schemaRefs>
     <ds:schemaRef ds:uri="http://schemas.microsoft.com/office/2006/metadata/properties"/>
     <ds:schemaRef ds:uri="http://schemas.microsoft.com/office/infopath/2007/PartnerControls"/>
   </ds:schemaRefs>
 </ds:datastoreItem>
-</file>
-
-<file path=customXml/itemProps4.xml><?xml version="1.0" encoding="utf-8"?>
-<ds:datastoreItem xmlns:ds="http://schemas.openxmlformats.org/officeDocument/2006/customXml" ds:itemID="{1C73CA8F-0D0F-4C99-8EE8-8C153284B2D9}">
-  <ds:schemaRefs>
-    <ds:schemaRef ds:uri="http://schemas.openxmlformats.org/officeDocument/2006/bibliography"/>
-  </ds:schemaRefs>
-</ds:datastoreItem>
 </file>
</xml_diff>

<commit_message>
Add section titles in the report
</commit_message>
<xml_diff>
--- a/www/template_officer.docx
+++ b/www/template_officer.docx
@@ -1,6 +1,6 @@
 
 <file path=word/document.xml><?xml version="1.0" encoding="utf-8"?>
-<w:document xmlns:wpc="http://schemas.microsoft.com/office/word/2010/wordprocessingCanvas" xmlns:cx="http://schemas.microsoft.com/office/drawing/2014/chartex" xmlns:cx1="http://schemas.microsoft.com/office/drawing/2015/9/8/chartex" xmlns:cx2="http://schemas.microsoft.com/office/drawing/2015/10/21/chartex" xmlns:cx3="http://schemas.microsoft.com/office/drawing/2016/5/9/chartex" xmlns:cx4="http://schemas.microsoft.com/office/drawing/2016/5/10/chartex" xmlns:cx5="http://schemas.microsoft.com/office/drawing/2016/5/11/chartex" xmlns:cx6="http://schemas.microsoft.com/office/drawing/2016/5/12/chartex" xmlns:cx7="http://schemas.microsoft.com/office/drawing/2016/5/13/chartex" xmlns:cx8="http://schemas.microsoft.com/office/drawing/2016/5/14/chartex" xmlns:mc="http://schemas.openxmlformats.org/markup-compatibility/2006" xmlns:aink="http://schemas.microsoft.com/office/drawing/2016/ink" xmlns:am3d="http://schemas.microsoft.com/office/drawing/2017/model3d" xmlns:o="urn:schemas-microsoft-com:office:office" xmlns:r="http://schemas.openxmlformats.org/officeDocument/2006/relationships" xmlns:m="http://schemas.openxmlformats.org/officeDocument/2006/math" xmlns:v="urn:schemas-microsoft-com:vml" xmlns:wp14="http://schemas.microsoft.com/office/word/2010/wordprocessingDrawing" xmlns:wp="http://schemas.openxmlformats.org/drawingml/2006/wordprocessingDrawing" xmlns:w10="urn:schemas-microsoft-com:office:word" xmlns:w="http://schemas.openxmlformats.org/wordprocessingml/2006/main" xmlns:w14="http://schemas.microsoft.com/office/word/2010/wordml" xmlns:w15="http://schemas.microsoft.com/office/word/2012/wordml" xmlns:w16cex="http://schemas.microsoft.com/office/word/2018/wordml/cex" xmlns:w16cid="http://schemas.microsoft.com/office/word/2016/wordml/cid" xmlns:w16="http://schemas.microsoft.com/office/word/2018/wordml" xmlns:w16se="http://schemas.microsoft.com/office/word/2015/wordml/symex" xmlns:wpg="http://schemas.microsoft.com/office/word/2010/wordprocessingGroup" xmlns:wpi="http://schemas.microsoft.com/office/word/2010/wordprocessingInk" xmlns:wne="http://schemas.microsoft.com/office/word/2006/wordml" xmlns:wps="http://schemas.microsoft.com/office/word/2010/wordprocessingShape" mc:Ignorable="w14 w15 w16se w16cid w16 w16cex wp14">
+<w:document xmlns:wpc="http://schemas.microsoft.com/office/word/2010/wordprocessingCanvas" xmlns:cx="http://schemas.microsoft.com/office/drawing/2014/chartex" xmlns:cx1="http://schemas.microsoft.com/office/drawing/2015/9/8/chartex" xmlns:cx2="http://schemas.microsoft.com/office/drawing/2015/10/21/chartex" xmlns:cx3="http://schemas.microsoft.com/office/drawing/2016/5/9/chartex" xmlns:cx4="http://schemas.microsoft.com/office/drawing/2016/5/10/chartex" xmlns:cx5="http://schemas.microsoft.com/office/drawing/2016/5/11/chartex" xmlns:cx6="http://schemas.microsoft.com/office/drawing/2016/5/12/chartex" xmlns:cx7="http://schemas.microsoft.com/office/drawing/2016/5/13/chartex" xmlns:cx8="http://schemas.microsoft.com/office/drawing/2016/5/14/chartex" xmlns:mc="http://schemas.openxmlformats.org/markup-compatibility/2006" xmlns:aink="http://schemas.microsoft.com/office/drawing/2016/ink" xmlns:am3d="http://schemas.microsoft.com/office/drawing/2017/model3d" xmlns:o="urn:schemas-microsoft-com:office:office" xmlns:r="http://schemas.openxmlformats.org/officeDocument/2006/relationships" xmlns:m="http://schemas.openxmlformats.org/officeDocument/2006/math" xmlns:v="urn:schemas-microsoft-com:vml" xmlns:wp14="http://schemas.microsoft.com/office/word/2010/wordprocessingDrawing" xmlns:wp="http://schemas.openxmlformats.org/drawingml/2006/wordprocessingDrawing" xmlns:w10="urn:schemas-microsoft-com:office:word" xmlns:w="http://schemas.openxmlformats.org/wordprocessingml/2006/main" xmlns:w14="http://schemas.microsoft.com/office/word/2010/wordml" xmlns:w15="http://schemas.microsoft.com/office/word/2012/wordml" xmlns:w16cex="http://schemas.microsoft.com/office/word/2018/wordml/cex" xmlns:w16cid="http://schemas.microsoft.com/office/word/2016/wordml/cid" xmlns:w16="http://schemas.microsoft.com/office/word/2018/wordml" xmlns:w16sdtdh="http://schemas.microsoft.com/office/word/2020/wordml/sdtdatahash" xmlns:w16se="http://schemas.microsoft.com/office/word/2015/wordml/symex" xmlns:wpg="http://schemas.microsoft.com/office/word/2010/wordprocessingGroup" xmlns:wpi="http://schemas.microsoft.com/office/word/2010/wordprocessingInk" xmlns:wne="http://schemas.microsoft.com/office/word/2006/wordml" xmlns:wps="http://schemas.microsoft.com/office/word/2010/wordprocessingShape" mc:Ignorable="w14 w15 w16se w16cid w16 w16cex w16sdtdh wp14">
   <w:body>
     <w:p/>
     <w:sectPr>
@@ -23,7 +23,7 @@
 </file>
 
 <file path=word/endnotes.xml><?xml version="1.0" encoding="utf-8"?>
-<w:endnotes xmlns:wpc="http://schemas.microsoft.com/office/word/2010/wordprocessingCanvas" xmlns:cx="http://schemas.microsoft.com/office/drawing/2014/chartex" xmlns:cx1="http://schemas.microsoft.com/office/drawing/2015/9/8/chartex" xmlns:cx2="http://schemas.microsoft.com/office/drawing/2015/10/21/chartex" xmlns:cx3="http://schemas.microsoft.com/office/drawing/2016/5/9/chartex" xmlns:cx4="http://schemas.microsoft.com/office/drawing/2016/5/10/chartex" xmlns:cx5="http://schemas.microsoft.com/office/drawing/2016/5/11/chartex" xmlns:cx6="http://schemas.microsoft.com/office/drawing/2016/5/12/chartex" xmlns:cx7="http://schemas.microsoft.com/office/drawing/2016/5/13/chartex" xmlns:cx8="http://schemas.microsoft.com/office/drawing/2016/5/14/chartex" xmlns:mc="http://schemas.openxmlformats.org/markup-compatibility/2006" xmlns:aink="http://schemas.microsoft.com/office/drawing/2016/ink" xmlns:am3d="http://schemas.microsoft.com/office/drawing/2017/model3d" xmlns:o="urn:schemas-microsoft-com:office:office" xmlns:r="http://schemas.openxmlformats.org/officeDocument/2006/relationships" xmlns:m="http://schemas.openxmlformats.org/officeDocument/2006/math" xmlns:v="urn:schemas-microsoft-com:vml" xmlns:wp14="http://schemas.microsoft.com/office/word/2010/wordprocessingDrawing" xmlns:wp="http://schemas.openxmlformats.org/drawingml/2006/wordprocessingDrawing" xmlns:w10="urn:schemas-microsoft-com:office:word" xmlns:w="http://schemas.openxmlformats.org/wordprocessingml/2006/main" xmlns:w14="http://schemas.microsoft.com/office/word/2010/wordml" xmlns:w15="http://schemas.microsoft.com/office/word/2012/wordml" xmlns:w16cex="http://schemas.microsoft.com/office/word/2018/wordml/cex" xmlns:w16cid="http://schemas.microsoft.com/office/word/2016/wordml/cid" xmlns:w16="http://schemas.microsoft.com/office/word/2018/wordml" xmlns:w16se="http://schemas.microsoft.com/office/word/2015/wordml/symex" xmlns:wpg="http://schemas.microsoft.com/office/word/2010/wordprocessingGroup" xmlns:wpi="http://schemas.microsoft.com/office/word/2010/wordprocessingInk" xmlns:wne="http://schemas.microsoft.com/office/word/2006/wordml" xmlns:wps="http://schemas.microsoft.com/office/word/2010/wordprocessingShape" mc:Ignorable="w14 w15 w16se w16cid w16 w16cex wp14">
+<w:endnotes xmlns:wpc="http://schemas.microsoft.com/office/word/2010/wordprocessingCanvas" xmlns:cx="http://schemas.microsoft.com/office/drawing/2014/chartex" xmlns:cx1="http://schemas.microsoft.com/office/drawing/2015/9/8/chartex" xmlns:cx2="http://schemas.microsoft.com/office/drawing/2015/10/21/chartex" xmlns:cx3="http://schemas.microsoft.com/office/drawing/2016/5/9/chartex" xmlns:cx4="http://schemas.microsoft.com/office/drawing/2016/5/10/chartex" xmlns:cx5="http://schemas.microsoft.com/office/drawing/2016/5/11/chartex" xmlns:cx6="http://schemas.microsoft.com/office/drawing/2016/5/12/chartex" xmlns:cx7="http://schemas.microsoft.com/office/drawing/2016/5/13/chartex" xmlns:cx8="http://schemas.microsoft.com/office/drawing/2016/5/14/chartex" xmlns:mc="http://schemas.openxmlformats.org/markup-compatibility/2006" xmlns:aink="http://schemas.microsoft.com/office/drawing/2016/ink" xmlns:am3d="http://schemas.microsoft.com/office/drawing/2017/model3d" xmlns:o="urn:schemas-microsoft-com:office:office" xmlns:r="http://schemas.openxmlformats.org/officeDocument/2006/relationships" xmlns:m="http://schemas.openxmlformats.org/officeDocument/2006/math" xmlns:v="urn:schemas-microsoft-com:vml" xmlns:wp14="http://schemas.microsoft.com/office/word/2010/wordprocessingDrawing" xmlns:wp="http://schemas.openxmlformats.org/drawingml/2006/wordprocessingDrawing" xmlns:w10="urn:schemas-microsoft-com:office:word" xmlns:w="http://schemas.openxmlformats.org/wordprocessingml/2006/main" xmlns:w14="http://schemas.microsoft.com/office/word/2010/wordml" xmlns:w15="http://schemas.microsoft.com/office/word/2012/wordml" xmlns:w16cex="http://schemas.microsoft.com/office/word/2018/wordml/cex" xmlns:w16cid="http://schemas.microsoft.com/office/word/2016/wordml/cid" xmlns:w16="http://schemas.microsoft.com/office/word/2018/wordml" xmlns:w16sdtdh="http://schemas.microsoft.com/office/word/2020/wordml/sdtdatahash" xmlns:w16se="http://schemas.microsoft.com/office/word/2015/wordml/symex" xmlns:wpg="http://schemas.microsoft.com/office/word/2010/wordprocessingGroup" xmlns:wpi="http://schemas.microsoft.com/office/word/2010/wordprocessingInk" xmlns:wne="http://schemas.microsoft.com/office/word/2006/wordml" xmlns:wps="http://schemas.microsoft.com/office/word/2010/wordprocessingShape" mc:Ignorable="w14 w15 w16se w16cid w16 w16cex w16sdtdh wp14">
   <w:endnote w:type="separator" w:id="-1">
     <w:p>
       <w:r>
@@ -42,7 +42,7 @@
 </file>
 
 <file path=word/footer1.xml><?xml version="1.0" encoding="utf-8"?>
-<w:ftr xmlns:wpc="http://schemas.microsoft.com/office/word/2010/wordprocessingCanvas" xmlns:cx="http://schemas.microsoft.com/office/drawing/2014/chartex" xmlns:cx1="http://schemas.microsoft.com/office/drawing/2015/9/8/chartex" xmlns:cx2="http://schemas.microsoft.com/office/drawing/2015/10/21/chartex" xmlns:cx3="http://schemas.microsoft.com/office/drawing/2016/5/9/chartex" xmlns:cx4="http://schemas.microsoft.com/office/drawing/2016/5/10/chartex" xmlns:cx5="http://schemas.microsoft.com/office/drawing/2016/5/11/chartex" xmlns:cx6="http://schemas.microsoft.com/office/drawing/2016/5/12/chartex" xmlns:cx7="http://schemas.microsoft.com/office/drawing/2016/5/13/chartex" xmlns:cx8="http://schemas.microsoft.com/office/drawing/2016/5/14/chartex" xmlns:mc="http://schemas.openxmlformats.org/markup-compatibility/2006" xmlns:aink="http://schemas.microsoft.com/office/drawing/2016/ink" xmlns:am3d="http://schemas.microsoft.com/office/drawing/2017/model3d" xmlns:o="urn:schemas-microsoft-com:office:office" xmlns:r="http://schemas.openxmlformats.org/officeDocument/2006/relationships" xmlns:m="http://schemas.openxmlformats.org/officeDocument/2006/math" xmlns:v="urn:schemas-microsoft-com:vml" xmlns:wp14="http://schemas.microsoft.com/office/word/2010/wordprocessingDrawing" xmlns:wp="http://schemas.openxmlformats.org/drawingml/2006/wordprocessingDrawing" xmlns:w10="urn:schemas-microsoft-com:office:word" xmlns:w="http://schemas.openxmlformats.org/wordprocessingml/2006/main" xmlns:w14="http://schemas.microsoft.com/office/word/2010/wordml" xmlns:w15="http://schemas.microsoft.com/office/word/2012/wordml" xmlns:w16cex="http://schemas.microsoft.com/office/word/2018/wordml/cex" xmlns:w16cid="http://schemas.microsoft.com/office/word/2016/wordml/cid" xmlns:w16="http://schemas.microsoft.com/office/word/2018/wordml" xmlns:w16se="http://schemas.microsoft.com/office/word/2015/wordml/symex" xmlns:wpg="http://schemas.microsoft.com/office/word/2010/wordprocessingGroup" xmlns:wpi="http://schemas.microsoft.com/office/word/2010/wordprocessingInk" xmlns:wne="http://schemas.microsoft.com/office/word/2006/wordml" xmlns:wps="http://schemas.microsoft.com/office/word/2010/wordprocessingShape" mc:Ignorable="w14 w15 w16se w16cid w16 w16cex wp14">
+<w:ftr xmlns:wpc="http://schemas.microsoft.com/office/word/2010/wordprocessingCanvas" xmlns:cx="http://schemas.microsoft.com/office/drawing/2014/chartex" xmlns:cx1="http://schemas.microsoft.com/office/drawing/2015/9/8/chartex" xmlns:cx2="http://schemas.microsoft.com/office/drawing/2015/10/21/chartex" xmlns:cx3="http://schemas.microsoft.com/office/drawing/2016/5/9/chartex" xmlns:cx4="http://schemas.microsoft.com/office/drawing/2016/5/10/chartex" xmlns:cx5="http://schemas.microsoft.com/office/drawing/2016/5/11/chartex" xmlns:cx6="http://schemas.microsoft.com/office/drawing/2016/5/12/chartex" xmlns:cx7="http://schemas.microsoft.com/office/drawing/2016/5/13/chartex" xmlns:cx8="http://schemas.microsoft.com/office/drawing/2016/5/14/chartex" xmlns:mc="http://schemas.openxmlformats.org/markup-compatibility/2006" xmlns:aink="http://schemas.microsoft.com/office/drawing/2016/ink" xmlns:am3d="http://schemas.microsoft.com/office/drawing/2017/model3d" xmlns:o="urn:schemas-microsoft-com:office:office" xmlns:r="http://schemas.openxmlformats.org/officeDocument/2006/relationships" xmlns:m="http://schemas.openxmlformats.org/officeDocument/2006/math" xmlns:v="urn:schemas-microsoft-com:vml" xmlns:wp14="http://schemas.microsoft.com/office/word/2010/wordprocessingDrawing" xmlns:wp="http://schemas.openxmlformats.org/drawingml/2006/wordprocessingDrawing" xmlns:w10="urn:schemas-microsoft-com:office:word" xmlns:w="http://schemas.openxmlformats.org/wordprocessingml/2006/main" xmlns:w14="http://schemas.microsoft.com/office/word/2010/wordml" xmlns:w15="http://schemas.microsoft.com/office/word/2012/wordml" xmlns:w16cex="http://schemas.microsoft.com/office/word/2018/wordml/cex" xmlns:w16cid="http://schemas.microsoft.com/office/word/2016/wordml/cid" xmlns:w16="http://schemas.microsoft.com/office/word/2018/wordml" xmlns:w16sdtdh="http://schemas.microsoft.com/office/word/2020/wordml/sdtdatahash" xmlns:w16se="http://schemas.microsoft.com/office/word/2015/wordml/symex" xmlns:wpg="http://schemas.microsoft.com/office/word/2010/wordprocessingGroup" xmlns:wpi="http://schemas.microsoft.com/office/word/2010/wordprocessingInk" xmlns:wne="http://schemas.microsoft.com/office/word/2006/wordml" xmlns:wps="http://schemas.microsoft.com/office/word/2010/wordprocessingShape" mc:Ignorable="w14 w15 w16se w16cid w16 w16cex w16sdtdh wp14">
   <w:p>
     <w:pPr>
       <w:pStyle w:val="Footer"/>
@@ -52,7 +52,7 @@
 </file>
 
 <file path=word/footer2.xml><?xml version="1.0" encoding="utf-8"?>
-<w:ftr xmlns:wpc="http://schemas.microsoft.com/office/word/2010/wordprocessingCanvas" xmlns:cx="http://schemas.microsoft.com/office/drawing/2014/chartex" xmlns:cx1="http://schemas.microsoft.com/office/drawing/2015/9/8/chartex" xmlns:cx2="http://schemas.microsoft.com/office/drawing/2015/10/21/chartex" xmlns:cx3="http://schemas.microsoft.com/office/drawing/2016/5/9/chartex" xmlns:cx4="http://schemas.microsoft.com/office/drawing/2016/5/10/chartex" xmlns:cx5="http://schemas.microsoft.com/office/drawing/2016/5/11/chartex" xmlns:cx6="http://schemas.microsoft.com/office/drawing/2016/5/12/chartex" xmlns:cx7="http://schemas.microsoft.com/office/drawing/2016/5/13/chartex" xmlns:cx8="http://schemas.microsoft.com/office/drawing/2016/5/14/chartex" xmlns:mc="http://schemas.openxmlformats.org/markup-compatibility/2006" xmlns:aink="http://schemas.microsoft.com/office/drawing/2016/ink" xmlns:am3d="http://schemas.microsoft.com/office/drawing/2017/model3d" xmlns:o="urn:schemas-microsoft-com:office:office" xmlns:r="http://schemas.openxmlformats.org/officeDocument/2006/relationships" xmlns:m="http://schemas.openxmlformats.org/officeDocument/2006/math" xmlns:v="urn:schemas-microsoft-com:vml" xmlns:wp14="http://schemas.microsoft.com/office/word/2010/wordprocessingDrawing" xmlns:wp="http://schemas.openxmlformats.org/drawingml/2006/wordprocessingDrawing" xmlns:w10="urn:schemas-microsoft-com:office:word" xmlns:w="http://schemas.openxmlformats.org/wordprocessingml/2006/main" xmlns:w14="http://schemas.microsoft.com/office/word/2010/wordml" xmlns:w15="http://schemas.microsoft.com/office/word/2012/wordml" xmlns:w16cex="http://schemas.microsoft.com/office/word/2018/wordml/cex" xmlns:w16cid="http://schemas.microsoft.com/office/word/2016/wordml/cid" xmlns:w16="http://schemas.microsoft.com/office/word/2018/wordml" xmlns:w16se="http://schemas.microsoft.com/office/word/2015/wordml/symex" xmlns:wpg="http://schemas.microsoft.com/office/word/2010/wordprocessingGroup" xmlns:wpi="http://schemas.microsoft.com/office/word/2010/wordprocessingInk" xmlns:wne="http://schemas.microsoft.com/office/word/2006/wordml" xmlns:wps="http://schemas.microsoft.com/office/word/2010/wordprocessingShape" mc:Ignorable="w14 w15 w16se w16cid w16 w16cex wp14">
+<w:ftr xmlns:wpc="http://schemas.microsoft.com/office/word/2010/wordprocessingCanvas" xmlns:cx="http://schemas.microsoft.com/office/drawing/2014/chartex" xmlns:cx1="http://schemas.microsoft.com/office/drawing/2015/9/8/chartex" xmlns:cx2="http://schemas.microsoft.com/office/drawing/2015/10/21/chartex" xmlns:cx3="http://schemas.microsoft.com/office/drawing/2016/5/9/chartex" xmlns:cx4="http://schemas.microsoft.com/office/drawing/2016/5/10/chartex" xmlns:cx5="http://schemas.microsoft.com/office/drawing/2016/5/11/chartex" xmlns:cx6="http://schemas.microsoft.com/office/drawing/2016/5/12/chartex" xmlns:cx7="http://schemas.microsoft.com/office/drawing/2016/5/13/chartex" xmlns:cx8="http://schemas.microsoft.com/office/drawing/2016/5/14/chartex" xmlns:mc="http://schemas.openxmlformats.org/markup-compatibility/2006" xmlns:aink="http://schemas.microsoft.com/office/drawing/2016/ink" xmlns:am3d="http://schemas.microsoft.com/office/drawing/2017/model3d" xmlns:o="urn:schemas-microsoft-com:office:office" xmlns:r="http://schemas.openxmlformats.org/officeDocument/2006/relationships" xmlns:m="http://schemas.openxmlformats.org/officeDocument/2006/math" xmlns:v="urn:schemas-microsoft-com:vml" xmlns:wp14="http://schemas.microsoft.com/office/word/2010/wordprocessingDrawing" xmlns:wp="http://schemas.openxmlformats.org/drawingml/2006/wordprocessingDrawing" xmlns:w10="urn:schemas-microsoft-com:office:word" xmlns:w="http://schemas.openxmlformats.org/wordprocessingml/2006/main" xmlns:w14="http://schemas.microsoft.com/office/word/2010/wordml" xmlns:w15="http://schemas.microsoft.com/office/word/2012/wordml" xmlns:w16cex="http://schemas.microsoft.com/office/word/2018/wordml/cex" xmlns:w16cid="http://schemas.microsoft.com/office/word/2016/wordml/cid" xmlns:w16="http://schemas.microsoft.com/office/word/2018/wordml" xmlns:w16sdtdh="http://schemas.microsoft.com/office/word/2020/wordml/sdtdatahash" xmlns:w16se="http://schemas.microsoft.com/office/word/2015/wordml/symex" xmlns:wpg="http://schemas.microsoft.com/office/word/2010/wordprocessingGroup" xmlns:wpi="http://schemas.microsoft.com/office/word/2010/wordprocessingInk" xmlns:wne="http://schemas.microsoft.com/office/word/2006/wordml" xmlns:wps="http://schemas.microsoft.com/office/word/2010/wordprocessingShape" mc:Ignorable="w14 w15 w16se w16cid w16 w16cex w16sdtdh wp14">
   <w:p>
     <w:pPr>
       <w:pStyle w:val="Footer"/>
@@ -71,103 +71,136 @@
       </w:rPr>
     </w:pPr>
   </w:p>
-  <w:p>
-    <w:pPr>
-      <w:pStyle w:val="Footer"/>
-      <w:jc w:val="center"/>
-      <w:rPr>
-        <w:rFonts w:asciiTheme="minorHAnsi" w:eastAsiaTheme="minorHAnsi" w:hAnsiTheme="minorHAnsi" w:cstheme="minorBidi"/>
-        <w:sz w:val="22"/>
-        <w:szCs w:val="22"/>
-        <w:lang w:val="de-DE"/>
-      </w:rPr>
-    </w:pPr>
-    <w:r>
-      <w:rPr>
-        <w:rFonts w:eastAsia="Times New Roman" w:cs="Times New Roman"/>
-      </w:rPr>
-      <w:t xml:space="preserve">Page </w:t>
-    </w:r>
-    <w:r>
-      <w:rPr>
-        <w:rFonts w:eastAsia="Times New Roman" w:cs="Times New Roman"/>
-      </w:rPr>
-      <w:fldChar w:fldCharType="begin"/>
-    </w:r>
-    <w:r>
-      <w:rPr>
-        <w:rFonts w:eastAsia="Times New Roman" w:cs="Times New Roman"/>
-      </w:rPr>
-      <w:instrText xml:space="preserve"> PAGE  \* MERGEFORMAT </w:instrText>
-    </w:r>
-    <w:r>
-      <w:rPr>
-        <w:rFonts w:eastAsia="Times New Roman" w:cs="Times New Roman"/>
-      </w:rPr>
-      <w:fldChar w:fldCharType="separate"/>
-    </w:r>
-    <w:r>
-      <w:rPr>
-        <w:rFonts w:eastAsia="Times New Roman" w:cs="Times New Roman"/>
-        <w:noProof/>
-      </w:rPr>
-      <w:t>4</w:t>
-    </w:r>
-    <w:r>
-      <w:rPr>
-        <w:rFonts w:eastAsia="Times New Roman" w:cs="Times New Roman"/>
-      </w:rPr>
-      <w:fldChar w:fldCharType="end"/>
-    </w:r>
-    <w:r>
-      <w:rPr>
-        <w:rFonts w:eastAsia="Times New Roman" w:cs="Times New Roman"/>
-      </w:rPr>
-      <w:t xml:space="preserve"> of </w:t>
-    </w:r>
-    <w:r>
-      <w:rPr>
-        <w:rFonts w:eastAsia="Times New Roman" w:cs="Times New Roman"/>
-      </w:rPr>
-      <w:fldChar w:fldCharType="begin"/>
-    </w:r>
-    <w:r>
-      <w:rPr>
-        <w:rFonts w:eastAsia="Times New Roman" w:cs="Times New Roman"/>
-      </w:rPr>
-      <w:instrText xml:space="preserve"> NUMPAGES  \* MERGEFORMAT </w:instrText>
-    </w:r>
-    <w:r>
-      <w:rPr>
-        <w:rFonts w:eastAsia="Times New Roman" w:cs="Times New Roman"/>
-      </w:rPr>
-      <w:fldChar w:fldCharType="separate"/>
-    </w:r>
-    <w:r>
-      <w:rPr>
-        <w:rFonts w:eastAsia="Times New Roman" w:cs="Times New Roman"/>
-        <w:noProof/>
-      </w:rPr>
-      <w:t>4</w:t>
-    </w:r>
-    <w:r>
-      <w:rPr>
-        <w:rFonts w:eastAsia="Times New Roman" w:cs="Times New Roman"/>
-        <w:noProof/>
-      </w:rPr>
-      <w:fldChar w:fldCharType="end"/>
-    </w:r>
-  </w:p>
-  <w:p>
-    <w:pPr>
-      <w:pStyle w:val="Footer"/>
-    </w:pPr>
-  </w:p>
+  <w:tbl>
+    <w:tblPr>
+      <w:tblStyle w:val="TableGrid"/>
+      <w:tblW w:w="0" w:type="auto"/>
+      <w:tblBorders>
+        <w:top w:val="none" w:sz="0" w:space="0" w:color="auto"/>
+        <w:left w:val="none" w:sz="0" w:space="0" w:color="auto"/>
+        <w:bottom w:val="none" w:sz="0" w:space="0" w:color="auto"/>
+        <w:right w:val="none" w:sz="0" w:space="0" w:color="auto"/>
+        <w:insideH w:val="none" w:sz="0" w:space="0" w:color="auto"/>
+        <w:insideV w:val="none" w:sz="0" w:space="0" w:color="auto"/>
+      </w:tblBorders>
+      <w:tblLook w:val="04A0" w:firstRow="1" w:lastRow="0" w:firstColumn="1" w:lastColumn="0" w:noHBand="0" w:noVBand="1"/>
+    </w:tblPr>
+    <w:tblGrid>
+      <w:gridCol w:w="4536"/>
+      <w:gridCol w:w="4536"/>
+    </w:tblGrid>
+    <w:tr>
+      <w:tc>
+        <w:tcPr>
+          <w:tcW w:w="4536" w:type="dxa"/>
+        </w:tcPr>
+        <w:p>
+          <w:pPr>
+            <w:pStyle w:val="Footer"/>
+            <w:rPr>
+              <w:rFonts w:eastAsia="Times New Roman" w:cs="Times New Roman"/>
+            </w:rPr>
+          </w:pPr>
+          <w:r>
+            <w:rPr>
+              <w:rFonts w:eastAsia="Times New Roman" w:cs="Times New Roman"/>
+            </w:rPr>
+            <w:t>version</w:t>
+          </w:r>
+        </w:p>
+      </w:tc>
+      <w:tc>
+        <w:tcPr>
+          <w:tcW w:w="4536" w:type="dxa"/>
+        </w:tcPr>
+        <w:p>
+          <w:pPr>
+            <w:pStyle w:val="Footer"/>
+            <w:jc w:val="right"/>
+          </w:pPr>
+          <w:r>
+            <w:rPr>
+              <w:rFonts w:eastAsia="Times New Roman" w:cs="Times New Roman"/>
+            </w:rPr>
+            <w:t xml:space="preserve">Page </w:t>
+          </w:r>
+          <w:r>
+            <w:rPr>
+              <w:rFonts w:eastAsia="Times New Roman" w:cs="Times New Roman"/>
+            </w:rPr>
+            <w:fldChar w:fldCharType="begin"/>
+          </w:r>
+          <w:r>
+            <w:rPr>
+              <w:rFonts w:eastAsia="Times New Roman" w:cs="Times New Roman"/>
+            </w:rPr>
+            <w:instrText xml:space="preserve"> PAGE  \* MERGEFORMAT </w:instrText>
+          </w:r>
+          <w:r>
+            <w:rPr>
+              <w:rFonts w:eastAsia="Times New Roman" w:cs="Times New Roman"/>
+            </w:rPr>
+            <w:fldChar w:fldCharType="separate"/>
+          </w:r>
+          <w:r>
+            <w:rPr>
+              <w:rFonts w:eastAsia="Times New Roman" w:cs="Times New Roman"/>
+            </w:rPr>
+            <w:t>1</w:t>
+          </w:r>
+          <w:r>
+            <w:rPr>
+              <w:rFonts w:eastAsia="Times New Roman" w:cs="Times New Roman"/>
+            </w:rPr>
+            <w:fldChar w:fldCharType="end"/>
+          </w:r>
+          <w:r>
+            <w:rPr>
+              <w:rFonts w:eastAsia="Times New Roman" w:cs="Times New Roman"/>
+            </w:rPr>
+            <w:t xml:space="preserve"> of </w:t>
+          </w:r>
+          <w:r>
+            <w:rPr>
+              <w:rFonts w:eastAsia="Times New Roman" w:cs="Times New Roman"/>
+            </w:rPr>
+            <w:fldChar w:fldCharType="begin"/>
+          </w:r>
+          <w:r>
+            <w:rPr>
+              <w:rFonts w:eastAsia="Times New Roman" w:cs="Times New Roman"/>
+            </w:rPr>
+            <w:instrText xml:space="preserve"> NUMPAGES  \* MERGEFORMAT </w:instrText>
+          </w:r>
+          <w:r>
+            <w:rPr>
+              <w:rFonts w:eastAsia="Times New Roman" w:cs="Times New Roman"/>
+            </w:rPr>
+            <w:fldChar w:fldCharType="separate"/>
+          </w:r>
+          <w:r>
+            <w:rPr>
+              <w:rFonts w:eastAsia="Times New Roman" w:cs="Times New Roman"/>
+            </w:rPr>
+            <w:t>1</w:t>
+          </w:r>
+          <w:r>
+            <w:rPr>
+              <w:rFonts w:eastAsia="Times New Roman" w:cs="Times New Roman"/>
+              <w:noProof/>
+            </w:rPr>
+            <w:fldChar w:fldCharType="end"/>
+          </w:r>
+        </w:p>
+      </w:tc>
+    </w:tr>
+  </w:tbl>
+  <w:p/>
 </w:ftr>
 </file>
 
 <file path=word/footer3.xml><?xml version="1.0" encoding="utf-8"?>
-<w:ftr xmlns:wpc="http://schemas.microsoft.com/office/word/2010/wordprocessingCanvas" xmlns:cx="http://schemas.microsoft.com/office/drawing/2014/chartex" xmlns:cx1="http://schemas.microsoft.com/office/drawing/2015/9/8/chartex" xmlns:cx2="http://schemas.microsoft.com/office/drawing/2015/10/21/chartex" xmlns:cx3="http://schemas.microsoft.com/office/drawing/2016/5/9/chartex" xmlns:cx4="http://schemas.microsoft.com/office/drawing/2016/5/10/chartex" xmlns:cx5="http://schemas.microsoft.com/office/drawing/2016/5/11/chartex" xmlns:cx6="http://schemas.microsoft.com/office/drawing/2016/5/12/chartex" xmlns:cx7="http://schemas.microsoft.com/office/drawing/2016/5/13/chartex" xmlns:cx8="http://schemas.microsoft.com/office/drawing/2016/5/14/chartex" xmlns:mc="http://schemas.openxmlformats.org/markup-compatibility/2006" xmlns:aink="http://schemas.microsoft.com/office/drawing/2016/ink" xmlns:am3d="http://schemas.microsoft.com/office/drawing/2017/model3d" xmlns:o="urn:schemas-microsoft-com:office:office" xmlns:r="http://schemas.openxmlformats.org/officeDocument/2006/relationships" xmlns:m="http://schemas.openxmlformats.org/officeDocument/2006/math" xmlns:v="urn:schemas-microsoft-com:vml" xmlns:wp14="http://schemas.microsoft.com/office/word/2010/wordprocessingDrawing" xmlns:wp="http://schemas.openxmlformats.org/drawingml/2006/wordprocessingDrawing" xmlns:w10="urn:schemas-microsoft-com:office:word" xmlns:w="http://schemas.openxmlformats.org/wordprocessingml/2006/main" xmlns:w14="http://schemas.microsoft.com/office/word/2010/wordml" xmlns:w15="http://schemas.microsoft.com/office/word/2012/wordml" xmlns:w16cex="http://schemas.microsoft.com/office/word/2018/wordml/cex" xmlns:w16cid="http://schemas.microsoft.com/office/word/2016/wordml/cid" xmlns:w16="http://schemas.microsoft.com/office/word/2018/wordml" xmlns:w16se="http://schemas.microsoft.com/office/word/2015/wordml/symex" xmlns:wpg="http://schemas.microsoft.com/office/word/2010/wordprocessingGroup" xmlns:wpi="http://schemas.microsoft.com/office/word/2010/wordprocessingInk" xmlns:wne="http://schemas.microsoft.com/office/word/2006/wordml" xmlns:wps="http://schemas.microsoft.com/office/word/2010/wordprocessingShape" mc:Ignorable="w14 w15 w16se w16cid w16 w16cex wp14">
+<w:ftr xmlns:wpc="http://schemas.microsoft.com/office/word/2010/wordprocessingCanvas" xmlns:cx="http://schemas.microsoft.com/office/drawing/2014/chartex" xmlns:cx1="http://schemas.microsoft.com/office/drawing/2015/9/8/chartex" xmlns:cx2="http://schemas.microsoft.com/office/drawing/2015/10/21/chartex" xmlns:cx3="http://schemas.microsoft.com/office/drawing/2016/5/9/chartex" xmlns:cx4="http://schemas.microsoft.com/office/drawing/2016/5/10/chartex" xmlns:cx5="http://schemas.microsoft.com/office/drawing/2016/5/11/chartex" xmlns:cx6="http://schemas.microsoft.com/office/drawing/2016/5/12/chartex" xmlns:cx7="http://schemas.microsoft.com/office/drawing/2016/5/13/chartex" xmlns:cx8="http://schemas.microsoft.com/office/drawing/2016/5/14/chartex" xmlns:mc="http://schemas.openxmlformats.org/markup-compatibility/2006" xmlns:aink="http://schemas.microsoft.com/office/drawing/2016/ink" xmlns:am3d="http://schemas.microsoft.com/office/drawing/2017/model3d" xmlns:o="urn:schemas-microsoft-com:office:office" xmlns:r="http://schemas.openxmlformats.org/officeDocument/2006/relationships" xmlns:m="http://schemas.openxmlformats.org/officeDocument/2006/math" xmlns:v="urn:schemas-microsoft-com:vml" xmlns:wp14="http://schemas.microsoft.com/office/word/2010/wordprocessingDrawing" xmlns:wp="http://schemas.openxmlformats.org/drawingml/2006/wordprocessingDrawing" xmlns:w10="urn:schemas-microsoft-com:office:word" xmlns:w="http://schemas.openxmlformats.org/wordprocessingml/2006/main" xmlns:w14="http://schemas.microsoft.com/office/word/2010/wordml" xmlns:w15="http://schemas.microsoft.com/office/word/2012/wordml" xmlns:w16cex="http://schemas.microsoft.com/office/word/2018/wordml/cex" xmlns:w16cid="http://schemas.microsoft.com/office/word/2016/wordml/cid" xmlns:w16="http://schemas.microsoft.com/office/word/2018/wordml" xmlns:w16sdtdh="http://schemas.microsoft.com/office/word/2020/wordml/sdtdatahash" xmlns:w16se="http://schemas.microsoft.com/office/word/2015/wordml/symex" xmlns:wpg="http://schemas.microsoft.com/office/word/2010/wordprocessingGroup" xmlns:wpi="http://schemas.microsoft.com/office/word/2010/wordprocessingInk" xmlns:wne="http://schemas.microsoft.com/office/word/2006/wordml" xmlns:wps="http://schemas.microsoft.com/office/word/2010/wordprocessingShape" mc:Ignorable="w14 w15 w16se w16cid w16 w16cex w16sdtdh wp14">
   <w:p>
     <w:pPr>
       <w:pStyle w:val="Footer"/>
@@ -177,7 +210,7 @@
 </file>
 
 <file path=word/footnotes.xml><?xml version="1.0" encoding="utf-8"?>
-<w:footnotes xmlns:wpc="http://schemas.microsoft.com/office/word/2010/wordprocessingCanvas" xmlns:cx="http://schemas.microsoft.com/office/drawing/2014/chartex" xmlns:cx1="http://schemas.microsoft.com/office/drawing/2015/9/8/chartex" xmlns:cx2="http://schemas.microsoft.com/office/drawing/2015/10/21/chartex" xmlns:cx3="http://schemas.microsoft.com/office/drawing/2016/5/9/chartex" xmlns:cx4="http://schemas.microsoft.com/office/drawing/2016/5/10/chartex" xmlns:cx5="http://schemas.microsoft.com/office/drawing/2016/5/11/chartex" xmlns:cx6="http://schemas.microsoft.com/office/drawing/2016/5/12/chartex" xmlns:cx7="http://schemas.microsoft.com/office/drawing/2016/5/13/chartex" xmlns:cx8="http://schemas.microsoft.com/office/drawing/2016/5/14/chartex" xmlns:mc="http://schemas.openxmlformats.org/markup-compatibility/2006" xmlns:aink="http://schemas.microsoft.com/office/drawing/2016/ink" xmlns:am3d="http://schemas.microsoft.com/office/drawing/2017/model3d" xmlns:o="urn:schemas-microsoft-com:office:office" xmlns:r="http://schemas.openxmlformats.org/officeDocument/2006/relationships" xmlns:m="http://schemas.openxmlformats.org/officeDocument/2006/math" xmlns:v="urn:schemas-microsoft-com:vml" xmlns:wp14="http://schemas.microsoft.com/office/word/2010/wordprocessingDrawing" xmlns:wp="http://schemas.openxmlformats.org/drawingml/2006/wordprocessingDrawing" xmlns:w10="urn:schemas-microsoft-com:office:word" xmlns:w="http://schemas.openxmlformats.org/wordprocessingml/2006/main" xmlns:w14="http://schemas.microsoft.com/office/word/2010/wordml" xmlns:w15="http://schemas.microsoft.com/office/word/2012/wordml" xmlns:w16cex="http://schemas.microsoft.com/office/word/2018/wordml/cex" xmlns:w16cid="http://schemas.microsoft.com/office/word/2016/wordml/cid" xmlns:w16="http://schemas.microsoft.com/office/word/2018/wordml" xmlns:w16se="http://schemas.microsoft.com/office/word/2015/wordml/symex" xmlns:wpg="http://schemas.microsoft.com/office/word/2010/wordprocessingGroup" xmlns:wpi="http://schemas.microsoft.com/office/word/2010/wordprocessingInk" xmlns:wne="http://schemas.microsoft.com/office/word/2006/wordml" xmlns:wps="http://schemas.microsoft.com/office/word/2010/wordprocessingShape" mc:Ignorable="w14 w15 w16se w16cid w16 w16cex wp14">
+<w:footnotes xmlns:wpc="http://schemas.microsoft.com/office/word/2010/wordprocessingCanvas" xmlns:cx="http://schemas.microsoft.com/office/drawing/2014/chartex" xmlns:cx1="http://schemas.microsoft.com/office/drawing/2015/9/8/chartex" xmlns:cx2="http://schemas.microsoft.com/office/drawing/2015/10/21/chartex" xmlns:cx3="http://schemas.microsoft.com/office/drawing/2016/5/9/chartex" xmlns:cx4="http://schemas.microsoft.com/office/drawing/2016/5/10/chartex" xmlns:cx5="http://schemas.microsoft.com/office/drawing/2016/5/11/chartex" xmlns:cx6="http://schemas.microsoft.com/office/drawing/2016/5/12/chartex" xmlns:cx7="http://schemas.microsoft.com/office/drawing/2016/5/13/chartex" xmlns:cx8="http://schemas.microsoft.com/office/drawing/2016/5/14/chartex" xmlns:mc="http://schemas.openxmlformats.org/markup-compatibility/2006" xmlns:aink="http://schemas.microsoft.com/office/drawing/2016/ink" xmlns:am3d="http://schemas.microsoft.com/office/drawing/2017/model3d" xmlns:o="urn:schemas-microsoft-com:office:office" xmlns:r="http://schemas.openxmlformats.org/officeDocument/2006/relationships" xmlns:m="http://schemas.openxmlformats.org/officeDocument/2006/math" xmlns:v="urn:schemas-microsoft-com:vml" xmlns:wp14="http://schemas.microsoft.com/office/word/2010/wordprocessingDrawing" xmlns:wp="http://schemas.openxmlformats.org/drawingml/2006/wordprocessingDrawing" xmlns:w10="urn:schemas-microsoft-com:office:word" xmlns:w="http://schemas.openxmlformats.org/wordprocessingml/2006/main" xmlns:w14="http://schemas.microsoft.com/office/word/2010/wordml" xmlns:w15="http://schemas.microsoft.com/office/word/2012/wordml" xmlns:w16cex="http://schemas.microsoft.com/office/word/2018/wordml/cex" xmlns:w16cid="http://schemas.microsoft.com/office/word/2016/wordml/cid" xmlns:w16="http://schemas.microsoft.com/office/word/2018/wordml" xmlns:w16sdtdh="http://schemas.microsoft.com/office/word/2020/wordml/sdtdatahash" xmlns:w16se="http://schemas.microsoft.com/office/word/2015/wordml/symex" xmlns:wpg="http://schemas.microsoft.com/office/word/2010/wordprocessingGroup" xmlns:wpi="http://schemas.microsoft.com/office/word/2010/wordprocessingInk" xmlns:wne="http://schemas.microsoft.com/office/word/2006/wordml" xmlns:wps="http://schemas.microsoft.com/office/word/2010/wordprocessingShape" mc:Ignorable="w14 w15 w16se w16cid w16 w16cex w16sdtdh wp14">
   <w:footnote w:type="separator" w:id="-1">
     <w:p>
       <w:r>
@@ -196,7 +229,7 @@
 </file>
 
 <file path=word/header1.xml><?xml version="1.0" encoding="utf-8"?>
-<w:hdr xmlns:wpc="http://schemas.microsoft.com/office/word/2010/wordprocessingCanvas" xmlns:cx="http://schemas.microsoft.com/office/drawing/2014/chartex" xmlns:cx1="http://schemas.microsoft.com/office/drawing/2015/9/8/chartex" xmlns:cx2="http://schemas.microsoft.com/office/drawing/2015/10/21/chartex" xmlns:cx3="http://schemas.microsoft.com/office/drawing/2016/5/9/chartex" xmlns:cx4="http://schemas.microsoft.com/office/drawing/2016/5/10/chartex" xmlns:cx5="http://schemas.microsoft.com/office/drawing/2016/5/11/chartex" xmlns:cx6="http://schemas.microsoft.com/office/drawing/2016/5/12/chartex" xmlns:cx7="http://schemas.microsoft.com/office/drawing/2016/5/13/chartex" xmlns:cx8="http://schemas.microsoft.com/office/drawing/2016/5/14/chartex" xmlns:mc="http://schemas.openxmlformats.org/markup-compatibility/2006" xmlns:aink="http://schemas.microsoft.com/office/drawing/2016/ink" xmlns:am3d="http://schemas.microsoft.com/office/drawing/2017/model3d" xmlns:o="urn:schemas-microsoft-com:office:office" xmlns:r="http://schemas.openxmlformats.org/officeDocument/2006/relationships" xmlns:m="http://schemas.openxmlformats.org/officeDocument/2006/math" xmlns:v="urn:schemas-microsoft-com:vml" xmlns:wp14="http://schemas.microsoft.com/office/word/2010/wordprocessingDrawing" xmlns:wp="http://schemas.openxmlformats.org/drawingml/2006/wordprocessingDrawing" xmlns:w10="urn:schemas-microsoft-com:office:word" xmlns:w="http://schemas.openxmlformats.org/wordprocessingml/2006/main" xmlns:w14="http://schemas.microsoft.com/office/word/2010/wordml" xmlns:w15="http://schemas.microsoft.com/office/word/2012/wordml" xmlns:w16cex="http://schemas.microsoft.com/office/word/2018/wordml/cex" xmlns:w16cid="http://schemas.microsoft.com/office/word/2016/wordml/cid" xmlns:w16="http://schemas.microsoft.com/office/word/2018/wordml" xmlns:w16se="http://schemas.microsoft.com/office/word/2015/wordml/symex" xmlns:wpg="http://schemas.microsoft.com/office/word/2010/wordprocessingGroup" xmlns:wpi="http://schemas.microsoft.com/office/word/2010/wordprocessingInk" xmlns:wne="http://schemas.microsoft.com/office/word/2006/wordml" xmlns:wps="http://schemas.microsoft.com/office/word/2010/wordprocessingShape" mc:Ignorable="w14 w15 w16se w16cid w16 w16cex wp14">
+<w:hdr xmlns:wpc="http://schemas.microsoft.com/office/word/2010/wordprocessingCanvas" xmlns:cx="http://schemas.microsoft.com/office/drawing/2014/chartex" xmlns:cx1="http://schemas.microsoft.com/office/drawing/2015/9/8/chartex" xmlns:cx2="http://schemas.microsoft.com/office/drawing/2015/10/21/chartex" xmlns:cx3="http://schemas.microsoft.com/office/drawing/2016/5/9/chartex" xmlns:cx4="http://schemas.microsoft.com/office/drawing/2016/5/10/chartex" xmlns:cx5="http://schemas.microsoft.com/office/drawing/2016/5/11/chartex" xmlns:cx6="http://schemas.microsoft.com/office/drawing/2016/5/12/chartex" xmlns:cx7="http://schemas.microsoft.com/office/drawing/2016/5/13/chartex" xmlns:cx8="http://schemas.microsoft.com/office/drawing/2016/5/14/chartex" xmlns:mc="http://schemas.openxmlformats.org/markup-compatibility/2006" xmlns:aink="http://schemas.microsoft.com/office/drawing/2016/ink" xmlns:am3d="http://schemas.microsoft.com/office/drawing/2017/model3d" xmlns:o="urn:schemas-microsoft-com:office:office" xmlns:r="http://schemas.openxmlformats.org/officeDocument/2006/relationships" xmlns:m="http://schemas.openxmlformats.org/officeDocument/2006/math" xmlns:v="urn:schemas-microsoft-com:vml" xmlns:wp14="http://schemas.microsoft.com/office/word/2010/wordprocessingDrawing" xmlns:wp="http://schemas.openxmlformats.org/drawingml/2006/wordprocessingDrawing" xmlns:w10="urn:schemas-microsoft-com:office:word" xmlns:w="http://schemas.openxmlformats.org/wordprocessingml/2006/main" xmlns:w14="http://schemas.microsoft.com/office/word/2010/wordml" xmlns:w15="http://schemas.microsoft.com/office/word/2012/wordml" xmlns:w16cex="http://schemas.microsoft.com/office/word/2018/wordml/cex" xmlns:w16cid="http://schemas.microsoft.com/office/word/2016/wordml/cid" xmlns:w16="http://schemas.microsoft.com/office/word/2018/wordml" xmlns:w16sdtdh="http://schemas.microsoft.com/office/word/2020/wordml/sdtdatahash" xmlns:w16se="http://schemas.microsoft.com/office/word/2015/wordml/symex" xmlns:wpg="http://schemas.microsoft.com/office/word/2010/wordprocessingGroup" xmlns:wpi="http://schemas.microsoft.com/office/word/2010/wordprocessingInk" xmlns:wne="http://schemas.microsoft.com/office/word/2006/wordml" xmlns:wps="http://schemas.microsoft.com/office/word/2010/wordprocessingShape" mc:Ignorable="w14 w15 w16se w16cid w16 w16cex w16sdtdh wp14">
   <w:p>
     <w:pPr>
       <w:pStyle w:val="Header"/>
@@ -206,17 +239,103 @@
 </file>
 
 <file path=word/header2.xml><?xml version="1.0" encoding="utf-8"?>
-<w:hdr xmlns:wpc="http://schemas.microsoft.com/office/word/2010/wordprocessingCanvas" xmlns:cx="http://schemas.microsoft.com/office/drawing/2014/chartex" xmlns:cx1="http://schemas.microsoft.com/office/drawing/2015/9/8/chartex" xmlns:cx2="http://schemas.microsoft.com/office/drawing/2015/10/21/chartex" xmlns:cx3="http://schemas.microsoft.com/office/drawing/2016/5/9/chartex" xmlns:cx4="http://schemas.microsoft.com/office/drawing/2016/5/10/chartex" xmlns:cx5="http://schemas.microsoft.com/office/drawing/2016/5/11/chartex" xmlns:cx6="http://schemas.microsoft.com/office/drawing/2016/5/12/chartex" xmlns:cx7="http://schemas.microsoft.com/office/drawing/2016/5/13/chartex" xmlns:cx8="http://schemas.microsoft.com/office/drawing/2016/5/14/chartex" xmlns:mc="http://schemas.openxmlformats.org/markup-compatibility/2006" xmlns:aink="http://schemas.microsoft.com/office/drawing/2016/ink" xmlns:am3d="http://schemas.microsoft.com/office/drawing/2017/model3d" xmlns:o="urn:schemas-microsoft-com:office:office" xmlns:r="http://schemas.openxmlformats.org/officeDocument/2006/relationships" xmlns:m="http://schemas.openxmlformats.org/officeDocument/2006/math" xmlns:v="urn:schemas-microsoft-com:vml" xmlns:wp14="http://schemas.microsoft.com/office/word/2010/wordprocessingDrawing" xmlns:wp="http://schemas.openxmlformats.org/drawingml/2006/wordprocessingDrawing" xmlns:w10="urn:schemas-microsoft-com:office:word" xmlns:w="http://schemas.openxmlformats.org/wordprocessingml/2006/main" xmlns:w14="http://schemas.microsoft.com/office/word/2010/wordml" xmlns:w15="http://schemas.microsoft.com/office/word/2012/wordml" xmlns:w16cex="http://schemas.microsoft.com/office/word/2018/wordml/cex" xmlns:w16cid="http://schemas.microsoft.com/office/word/2016/wordml/cid" xmlns:w16="http://schemas.microsoft.com/office/word/2018/wordml" xmlns:w16se="http://schemas.microsoft.com/office/word/2015/wordml/symex" xmlns:wpg="http://schemas.microsoft.com/office/word/2010/wordprocessingGroup" xmlns:wpi="http://schemas.microsoft.com/office/word/2010/wordprocessingInk" xmlns:wne="http://schemas.microsoft.com/office/word/2006/wordml" xmlns:wps="http://schemas.microsoft.com/office/word/2010/wordprocessingShape" mc:Ignorable="w14 w15 w16se w16cid w16 w16cex wp14">
+<w:hdr xmlns:wpc="http://schemas.microsoft.com/office/word/2010/wordprocessingCanvas" xmlns:cx="http://schemas.microsoft.com/office/drawing/2014/chartex" xmlns:cx1="http://schemas.microsoft.com/office/drawing/2015/9/8/chartex" xmlns:cx2="http://schemas.microsoft.com/office/drawing/2015/10/21/chartex" xmlns:cx3="http://schemas.microsoft.com/office/drawing/2016/5/9/chartex" xmlns:cx4="http://schemas.microsoft.com/office/drawing/2016/5/10/chartex" xmlns:cx5="http://schemas.microsoft.com/office/drawing/2016/5/11/chartex" xmlns:cx6="http://schemas.microsoft.com/office/drawing/2016/5/12/chartex" xmlns:cx7="http://schemas.microsoft.com/office/drawing/2016/5/13/chartex" xmlns:cx8="http://schemas.microsoft.com/office/drawing/2016/5/14/chartex" xmlns:mc="http://schemas.openxmlformats.org/markup-compatibility/2006" xmlns:aink="http://schemas.microsoft.com/office/drawing/2016/ink" xmlns:am3d="http://schemas.microsoft.com/office/drawing/2017/model3d" xmlns:o="urn:schemas-microsoft-com:office:office" xmlns:r="http://schemas.openxmlformats.org/officeDocument/2006/relationships" xmlns:m="http://schemas.openxmlformats.org/officeDocument/2006/math" xmlns:v="urn:schemas-microsoft-com:vml" xmlns:wp14="http://schemas.microsoft.com/office/word/2010/wordprocessingDrawing" xmlns:wp="http://schemas.openxmlformats.org/drawingml/2006/wordprocessingDrawing" xmlns:w10="urn:schemas-microsoft-com:office:word" xmlns:w="http://schemas.openxmlformats.org/wordprocessingml/2006/main" xmlns:w14="http://schemas.microsoft.com/office/word/2010/wordml" xmlns:w15="http://schemas.microsoft.com/office/word/2012/wordml" xmlns:w16cex="http://schemas.microsoft.com/office/word/2018/wordml/cex" xmlns:w16cid="http://schemas.microsoft.com/office/word/2016/wordml/cid" xmlns:w16="http://schemas.microsoft.com/office/word/2018/wordml" xmlns:w16sdtdh="http://schemas.microsoft.com/office/word/2020/wordml/sdtdatahash" xmlns:w16se="http://schemas.microsoft.com/office/word/2015/wordml/symex" xmlns:wpg="http://schemas.microsoft.com/office/word/2010/wordprocessingGroup" xmlns:wpi="http://schemas.microsoft.com/office/word/2010/wordprocessingInk" xmlns:wne="http://schemas.microsoft.com/office/word/2006/wordml" xmlns:wps="http://schemas.microsoft.com/office/word/2010/wordprocessingShape" mc:Ignorable="w14 w15 w16se w16cid w16 w16cex w16sdtdh wp14">
+  <w:tbl>
+    <w:tblPr>
+      <w:tblStyle w:val="TableGrid"/>
+      <w:tblW w:w="0" w:type="auto"/>
+      <w:tblBorders>
+        <w:top w:val="none" w:sz="0" w:space="0" w:color="auto"/>
+        <w:left w:val="none" w:sz="0" w:space="0" w:color="auto"/>
+        <w:bottom w:val="none" w:sz="0" w:space="0" w:color="auto"/>
+        <w:right w:val="none" w:sz="0" w:space="0" w:color="auto"/>
+        <w:insideH w:val="none" w:sz="0" w:space="0" w:color="auto"/>
+        <w:insideV w:val="none" w:sz="0" w:space="0" w:color="auto"/>
+      </w:tblBorders>
+      <w:tblLook w:val="04A0" w:firstRow="1" w:lastRow="0" w:firstColumn="1" w:lastColumn="0" w:noHBand="0" w:noVBand="1"/>
+    </w:tblPr>
+    <w:tblGrid>
+      <w:gridCol w:w="3256"/>
+      <w:gridCol w:w="2551"/>
+      <w:gridCol w:w="3265"/>
+    </w:tblGrid>
+    <w:tr>
+      <w:tc>
+        <w:tcPr>
+          <w:tcW w:w="3256" w:type="dxa"/>
+        </w:tcPr>
+        <w:p>
+          <w:pPr>
+            <w:pStyle w:val="Header"/>
+            <w:rPr>
+              <w:lang w:val="de-CH"/>
+            </w:rPr>
+          </w:pPr>
+          <w:r>
+            <w:rPr>
+              <w:lang w:val="de-CH"/>
+            </w:rPr>
+            <w:t>title</w:t>
+          </w:r>
+        </w:p>
+      </w:tc>
+      <w:tc>
+        <w:tcPr>
+          <w:tcW w:w="2551" w:type="dxa"/>
+        </w:tcPr>
+        <w:p>
+          <w:pPr>
+            <w:pStyle w:val="Header"/>
+            <w:jc w:val="center"/>
+            <w:rPr>
+              <w:lang w:val="de-CH"/>
+            </w:rPr>
+          </w:pPr>
+          <w:r>
+            <w:rPr>
+              <w:lang w:val="de-CH"/>
+            </w:rPr>
+            <w:t>date</w:t>
+          </w:r>
+        </w:p>
+      </w:tc>
+      <w:tc>
+        <w:tcPr>
+          <w:tcW w:w="3265" w:type="dxa"/>
+        </w:tcPr>
+        <w:p>
+          <w:pPr>
+            <w:pStyle w:val="Header"/>
+            <w:jc w:val="right"/>
+            <w:rPr>
+              <w:lang w:val="de-CH"/>
+            </w:rPr>
+          </w:pPr>
+          <w:r>
+            <w:rPr>
+              <w:lang w:val="de-CH"/>
+            </w:rPr>
+            <w:t>author_name</w:t>
+          </w:r>
+        </w:p>
+      </w:tc>
+    </w:tr>
+  </w:tbl>
   <w:p>
     <w:pPr>
       <w:pStyle w:val="Header"/>
+      <w:rPr>
+        <w:sz w:val="2"/>
+        <w:szCs w:val="2"/>
+        <w:lang w:val="de-CH"/>
+      </w:rPr>
     </w:pPr>
   </w:p>
 </w:hdr>
 </file>
 
 <file path=word/header3.xml><?xml version="1.0" encoding="utf-8"?>
-<w:hdr xmlns:wpc="http://schemas.microsoft.com/office/word/2010/wordprocessingCanvas" xmlns:cx="http://schemas.microsoft.com/office/drawing/2014/chartex" xmlns:cx1="http://schemas.microsoft.com/office/drawing/2015/9/8/chartex" xmlns:cx2="http://schemas.microsoft.com/office/drawing/2015/10/21/chartex" xmlns:cx3="http://schemas.microsoft.com/office/drawing/2016/5/9/chartex" xmlns:cx4="http://schemas.microsoft.com/office/drawing/2016/5/10/chartex" xmlns:cx5="http://schemas.microsoft.com/office/drawing/2016/5/11/chartex" xmlns:cx6="http://schemas.microsoft.com/office/drawing/2016/5/12/chartex" xmlns:cx7="http://schemas.microsoft.com/office/drawing/2016/5/13/chartex" xmlns:cx8="http://schemas.microsoft.com/office/drawing/2016/5/14/chartex" xmlns:mc="http://schemas.openxmlformats.org/markup-compatibility/2006" xmlns:aink="http://schemas.microsoft.com/office/drawing/2016/ink" xmlns:am3d="http://schemas.microsoft.com/office/drawing/2017/model3d" xmlns:o="urn:schemas-microsoft-com:office:office" xmlns:r="http://schemas.openxmlformats.org/officeDocument/2006/relationships" xmlns:m="http://schemas.openxmlformats.org/officeDocument/2006/math" xmlns:v="urn:schemas-microsoft-com:vml" xmlns:wp14="http://schemas.microsoft.com/office/word/2010/wordprocessingDrawing" xmlns:wp="http://schemas.openxmlformats.org/drawingml/2006/wordprocessingDrawing" xmlns:w10="urn:schemas-microsoft-com:office:word" xmlns:w="http://schemas.openxmlformats.org/wordprocessingml/2006/main" xmlns:w14="http://schemas.microsoft.com/office/word/2010/wordml" xmlns:w15="http://schemas.microsoft.com/office/word/2012/wordml" xmlns:w16cex="http://schemas.microsoft.com/office/word/2018/wordml/cex" xmlns:w16cid="http://schemas.microsoft.com/office/word/2016/wordml/cid" xmlns:w16="http://schemas.microsoft.com/office/word/2018/wordml" xmlns:w16se="http://schemas.microsoft.com/office/word/2015/wordml/symex" xmlns:wpg="http://schemas.microsoft.com/office/word/2010/wordprocessingGroup" xmlns:wpi="http://schemas.microsoft.com/office/word/2010/wordprocessingInk" xmlns:wne="http://schemas.microsoft.com/office/word/2006/wordml" xmlns:wps="http://schemas.microsoft.com/office/word/2010/wordprocessingShape" mc:Ignorable="w14 w15 w16se w16cid w16 w16cex wp14">
+<w:hdr xmlns:wpc="http://schemas.microsoft.com/office/word/2010/wordprocessingCanvas" xmlns:cx="http://schemas.microsoft.com/office/drawing/2014/chartex" xmlns:cx1="http://schemas.microsoft.com/office/drawing/2015/9/8/chartex" xmlns:cx2="http://schemas.microsoft.com/office/drawing/2015/10/21/chartex" xmlns:cx3="http://schemas.microsoft.com/office/drawing/2016/5/9/chartex" xmlns:cx4="http://schemas.microsoft.com/office/drawing/2016/5/10/chartex" xmlns:cx5="http://schemas.microsoft.com/office/drawing/2016/5/11/chartex" xmlns:cx6="http://schemas.microsoft.com/office/drawing/2016/5/12/chartex" xmlns:cx7="http://schemas.microsoft.com/office/drawing/2016/5/13/chartex" xmlns:cx8="http://schemas.microsoft.com/office/drawing/2016/5/14/chartex" xmlns:mc="http://schemas.openxmlformats.org/markup-compatibility/2006" xmlns:aink="http://schemas.microsoft.com/office/drawing/2016/ink" xmlns:am3d="http://schemas.microsoft.com/office/drawing/2017/model3d" xmlns:o="urn:schemas-microsoft-com:office:office" xmlns:r="http://schemas.openxmlformats.org/officeDocument/2006/relationships" xmlns:m="http://schemas.openxmlformats.org/officeDocument/2006/math" xmlns:v="urn:schemas-microsoft-com:vml" xmlns:wp14="http://schemas.microsoft.com/office/word/2010/wordprocessingDrawing" xmlns:wp="http://schemas.openxmlformats.org/drawingml/2006/wordprocessingDrawing" xmlns:w10="urn:schemas-microsoft-com:office:word" xmlns:w="http://schemas.openxmlformats.org/wordprocessingml/2006/main" xmlns:w14="http://schemas.microsoft.com/office/word/2010/wordml" xmlns:w15="http://schemas.microsoft.com/office/word/2012/wordml" xmlns:w16cex="http://schemas.microsoft.com/office/word/2018/wordml/cex" xmlns:w16cid="http://schemas.microsoft.com/office/word/2016/wordml/cid" xmlns:w16="http://schemas.microsoft.com/office/word/2018/wordml" xmlns:w16sdtdh="http://schemas.microsoft.com/office/word/2020/wordml/sdtdatahash" xmlns:w16se="http://schemas.microsoft.com/office/word/2015/wordml/symex" xmlns:wpg="http://schemas.microsoft.com/office/word/2010/wordprocessingGroup" xmlns:wpi="http://schemas.microsoft.com/office/word/2010/wordprocessingInk" xmlns:wne="http://schemas.microsoft.com/office/word/2006/wordml" xmlns:wps="http://schemas.microsoft.com/office/word/2010/wordprocessingShape" mc:Ignorable="w14 w15 w16se w16cid w16 w16cex w16sdtdh wp14">
   <w:p>
     <w:pPr>
       <w:pStyle w:val="Header"/>
@@ -226,7 +345,7 @@
 </file>
 
 <file path=word/numbering.xml><?xml version="1.0" encoding="utf-8"?>
-<w:numbering xmlns:wpc="http://schemas.microsoft.com/office/word/2010/wordprocessingCanvas" xmlns:cx="http://schemas.microsoft.com/office/drawing/2014/chartex" xmlns:cx1="http://schemas.microsoft.com/office/drawing/2015/9/8/chartex" xmlns:cx2="http://schemas.microsoft.com/office/drawing/2015/10/21/chartex" xmlns:cx3="http://schemas.microsoft.com/office/drawing/2016/5/9/chartex" xmlns:cx4="http://schemas.microsoft.com/office/drawing/2016/5/10/chartex" xmlns:cx5="http://schemas.microsoft.com/office/drawing/2016/5/11/chartex" xmlns:cx6="http://schemas.microsoft.com/office/drawing/2016/5/12/chartex" xmlns:cx7="http://schemas.microsoft.com/office/drawing/2016/5/13/chartex" xmlns:cx8="http://schemas.microsoft.com/office/drawing/2016/5/14/chartex" xmlns:mc="http://schemas.openxmlformats.org/markup-compatibility/2006" xmlns:aink="http://schemas.microsoft.com/office/drawing/2016/ink" xmlns:am3d="http://schemas.microsoft.com/office/drawing/2017/model3d" xmlns:o="urn:schemas-microsoft-com:office:office" xmlns:r="http://schemas.openxmlformats.org/officeDocument/2006/relationships" xmlns:m="http://schemas.openxmlformats.org/officeDocument/2006/math" xmlns:v="urn:schemas-microsoft-com:vml" xmlns:wp14="http://schemas.microsoft.com/office/word/2010/wordprocessingDrawing" xmlns:wp="http://schemas.openxmlformats.org/drawingml/2006/wordprocessingDrawing" xmlns:w10="urn:schemas-microsoft-com:office:word" xmlns:w="http://schemas.openxmlformats.org/wordprocessingml/2006/main" xmlns:w14="http://schemas.microsoft.com/office/word/2010/wordml" xmlns:w15="http://schemas.microsoft.com/office/word/2012/wordml" xmlns:w16cex="http://schemas.microsoft.com/office/word/2018/wordml/cex" xmlns:w16cid="http://schemas.microsoft.com/office/word/2016/wordml/cid" xmlns:w16="http://schemas.microsoft.com/office/word/2018/wordml" xmlns:w16se="http://schemas.microsoft.com/office/word/2015/wordml/symex" xmlns:wpg="http://schemas.microsoft.com/office/word/2010/wordprocessingGroup" xmlns:wpi="http://schemas.microsoft.com/office/word/2010/wordprocessingInk" xmlns:wne="http://schemas.microsoft.com/office/word/2006/wordml" xmlns:wps="http://schemas.microsoft.com/office/word/2010/wordprocessingShape" mc:Ignorable="w14 w15 w16se w16cid w16 w16cex wp14">
+<w:numbering xmlns:wpc="http://schemas.microsoft.com/office/word/2010/wordprocessingCanvas" xmlns:cx="http://schemas.microsoft.com/office/drawing/2014/chartex" xmlns:cx1="http://schemas.microsoft.com/office/drawing/2015/9/8/chartex" xmlns:cx2="http://schemas.microsoft.com/office/drawing/2015/10/21/chartex" xmlns:cx3="http://schemas.microsoft.com/office/drawing/2016/5/9/chartex" xmlns:cx4="http://schemas.microsoft.com/office/drawing/2016/5/10/chartex" xmlns:cx5="http://schemas.microsoft.com/office/drawing/2016/5/11/chartex" xmlns:cx6="http://schemas.microsoft.com/office/drawing/2016/5/12/chartex" xmlns:cx7="http://schemas.microsoft.com/office/drawing/2016/5/13/chartex" xmlns:cx8="http://schemas.microsoft.com/office/drawing/2016/5/14/chartex" xmlns:mc="http://schemas.openxmlformats.org/markup-compatibility/2006" xmlns:aink="http://schemas.microsoft.com/office/drawing/2016/ink" xmlns:am3d="http://schemas.microsoft.com/office/drawing/2017/model3d" xmlns:o="urn:schemas-microsoft-com:office:office" xmlns:r="http://schemas.openxmlformats.org/officeDocument/2006/relationships" xmlns:m="http://schemas.openxmlformats.org/officeDocument/2006/math" xmlns:v="urn:schemas-microsoft-com:vml" xmlns:wp14="http://schemas.microsoft.com/office/word/2010/wordprocessingDrawing" xmlns:wp="http://schemas.openxmlformats.org/drawingml/2006/wordprocessingDrawing" xmlns:w10="urn:schemas-microsoft-com:office:word" xmlns:w="http://schemas.openxmlformats.org/wordprocessingml/2006/main" xmlns:w14="http://schemas.microsoft.com/office/word/2010/wordml" xmlns:w15="http://schemas.microsoft.com/office/word/2012/wordml" xmlns:w16cex="http://schemas.microsoft.com/office/word/2018/wordml/cex" xmlns:w16cid="http://schemas.microsoft.com/office/word/2016/wordml/cid" xmlns:w16="http://schemas.microsoft.com/office/word/2018/wordml" xmlns:w16sdtdh="http://schemas.microsoft.com/office/word/2020/wordml/sdtdatahash" xmlns:w16se="http://schemas.microsoft.com/office/word/2015/wordml/symex" xmlns:wpg="http://schemas.microsoft.com/office/word/2010/wordprocessingGroup" xmlns:wpi="http://schemas.microsoft.com/office/word/2010/wordprocessingInk" xmlns:wne="http://schemas.microsoft.com/office/word/2006/wordml" xmlns:wps="http://schemas.microsoft.com/office/word/2010/wordprocessingShape" mc:Ignorable="w14 w15 w16se w16cid w16 w16cex w16sdtdh wp14">
   <w:abstractNum w:abstractNumId="0" w15:restartNumberingAfterBreak="0">
     <w:nsid w:val="062F70A5"/>
     <w:multiLevelType w:val="singleLevel"/>
@@ -400,7 +519,7 @@
   <w:abstractNum w:abstractNumId="4" w15:restartNumberingAfterBreak="0">
     <w:nsid w:val="27163CD8"/>
     <w:multiLevelType w:val="multilevel"/>
-    <w:tmpl w:val="0F6E47EE"/>
+    <w:tmpl w:val="46E63528"/>
     <w:lvl w:ilvl="0">
       <w:start w:val="1"/>
       <w:numFmt w:val="decimal"/>
@@ -441,9 +560,9 @@
       <w:lvlJc w:val="left"/>
       <w:pPr>
         <w:tabs>
-          <w:tab w:val="num" w:pos="1008"/>
+          <w:tab w:val="num" w:pos="2852"/>
         </w:tabs>
-        <w:ind w:left="1008" w:hanging="1008"/>
+        <w:ind w:left="2852" w:hanging="1008"/>
       </w:pPr>
       <w:rPr>
         <w:rFonts w:hint="default"/>
@@ -1414,17 +1533,21 @@
   <w:num w:numId="23">
     <w:abstractNumId w:val="4"/>
   </w:num>
+  <w:num w:numId="24">
+    <w:abstractNumId w:val="4"/>
+  </w:num>
   <w:numIdMacAtCleanup w:val="11"/>
 </w:numbering>
 </file>
 
 <file path=word/styles.xml><?xml version="1.0" encoding="utf-8"?>
-<w:styles xmlns:mc="http://schemas.openxmlformats.org/markup-compatibility/2006" xmlns:r="http://schemas.openxmlformats.org/officeDocument/2006/relationships" xmlns:w="http://schemas.openxmlformats.org/wordprocessingml/2006/main" xmlns:w14="http://schemas.microsoft.com/office/word/2010/wordml" xmlns:w15="http://schemas.microsoft.com/office/word/2012/wordml" xmlns:w16cex="http://schemas.microsoft.com/office/word/2018/wordml/cex" xmlns:w16cid="http://schemas.microsoft.com/office/word/2016/wordml/cid" xmlns:w16="http://schemas.microsoft.com/office/word/2018/wordml" xmlns:w16se="http://schemas.microsoft.com/office/word/2015/wordml/symex" mc:Ignorable="w14 w15 w16se w16cid w16 w16cex">
+<w:styles xmlns:mc="http://schemas.openxmlformats.org/markup-compatibility/2006" xmlns:r="http://schemas.openxmlformats.org/officeDocument/2006/relationships" xmlns:w="http://schemas.openxmlformats.org/wordprocessingml/2006/main" xmlns:w14="http://schemas.microsoft.com/office/word/2010/wordml" xmlns:w15="http://schemas.microsoft.com/office/word/2012/wordml" xmlns:w16cex="http://schemas.microsoft.com/office/word/2018/wordml/cex" xmlns:w16cid="http://schemas.microsoft.com/office/word/2016/wordml/cid" xmlns:w16="http://schemas.microsoft.com/office/word/2018/wordml" xmlns:w16sdtdh="http://schemas.microsoft.com/office/word/2020/wordml/sdtdatahash" xmlns:w16se="http://schemas.microsoft.com/office/word/2015/wordml/symex" mc:Ignorable="w14 w15 w16se w16cid w16 w16cex w16sdtdh">
   <w:docDefaults>
     <w:rPrDefault>
       <w:rPr>
         <w:rFonts w:ascii="Arial" w:eastAsia="Times New Roman" w:hAnsi="Arial" w:cs="Times New Roman"/>
         <w:sz w:val="18"/>
+        <w:szCs w:val="18"/>
         <w:lang w:val="en-US" w:eastAsia="en-US" w:bidi="ar-SA"/>
       </w:rPr>
     </w:rPrDefault>
@@ -1810,7 +1933,7 @@
   <w:style w:type="paragraph" w:default="1" w:styleId="Normal">
     <w:name w:val="Normal"/>
     <w:qFormat/>
-    <w:rsid w:val="00093D29"/>
+    <w:rsid w:val="007F550B"/>
     <w:pPr>
       <w:spacing w:before="40"/>
     </w:pPr>
@@ -1819,13 +1942,14 @@
     <w:name w:val="heading 1"/>
     <w:basedOn w:val="Normal"/>
     <w:next w:val="Text"/>
+    <w:link w:val="Heading1Char"/>
     <w:qFormat/>
-    <w:rsid w:val="00093D29"/>
+    <w:rsid w:val="002E2E79"/>
     <w:pPr>
       <w:keepNext/>
       <w:keepLines/>
       <w:numPr>
-        <w:numId w:val="23"/>
+        <w:numId w:val="24"/>
       </w:numPr>
       <w:spacing w:before="360"/>
       <w:outlineLvl w:val="0"/>
@@ -1834,6 +1958,8 @@
       <w:rFonts w:eastAsia="MS Gothic" w:cs="Arial"/>
       <w:b/>
       <w:sz w:val="28"/>
+      <w:szCs w:val="20"/>
+      <w:lang w:eastAsia="zh-CN"/>
     </w:rPr>
   </w:style>
   <w:style w:type="paragraph" w:styleId="Heading2">
@@ -1848,7 +1974,7 @@
       <w:keepLines/>
       <w:numPr>
         <w:ilvl w:val="1"/>
-        <w:numId w:val="23"/>
+        <w:numId w:val="24"/>
       </w:numPr>
       <w:spacing w:before="240"/>
       <w:outlineLvl w:val="1"/>
@@ -1871,7 +1997,7 @@
       <w:keepLines/>
       <w:numPr>
         <w:ilvl w:val="2"/>
-        <w:numId w:val="23"/>
+        <w:numId w:val="24"/>
       </w:numPr>
       <w:spacing w:before="240"/>
       <w:outlineLvl w:val="2"/>
@@ -1892,7 +2018,7 @@
       <w:keepLines/>
       <w:numPr>
         <w:ilvl w:val="3"/>
-        <w:numId w:val="23"/>
+        <w:numId w:val="24"/>
       </w:numPr>
       <w:spacing w:before="240"/>
       <w:outlineLvl w:val="3"/>
@@ -5967,9 +6093,6 @@
     <w:name w:val="JP SAS text"/>
     <w:basedOn w:val="SAStext"/>
     <w:rsid w:val="00093D29"/>
-    <w:rPr>
-      <w:szCs w:val="18"/>
-    </w:rPr>
   </w:style>
   <w:style w:type="paragraph" w:customStyle="1" w:styleId="JPTable">
     <w:name w:val="JP Table"/>
@@ -6480,7 +6603,6 @@
       <w:rFonts w:ascii="Courier New" w:eastAsia="SimSun" w:hAnsi="Courier New" w:cs="Courier New"/>
       <w:spacing w:val="-10"/>
       <w:sz w:val="21"/>
-      <w:szCs w:val="18"/>
       <w:lang w:eastAsia="zh-CN"/>
     </w:rPr>
   </w:style>
@@ -6525,7 +6647,6 @@
     <w:rPr>
       <w:rFonts w:eastAsia="SimSun"/>
       <w:sz w:val="21"/>
-      <w:szCs w:val="18"/>
       <w:lang w:eastAsia="zh-CN"/>
     </w:rPr>
   </w:style>
@@ -16502,9 +16623,6 @@
     <w:qFormat/>
     <w:rsid w:val="00093D29"/>
     <w:pPr>
-      <w:numPr>
-        <w:numId w:val="0"/>
-      </w:numPr>
       <w:spacing w:before="480"/>
       <w:outlineLvl w:val="9"/>
     </w:pPr>
@@ -16567,6 +16685,19 @@
     <w:rPr>
       <w:rFonts w:eastAsia="MS Mincho"/>
       <w:sz w:val="24"/>
+      <w:lang w:eastAsia="zh-CN"/>
+    </w:rPr>
+  </w:style>
+  <w:style w:type="character" w:customStyle="1" w:styleId="Heading1Char">
+    <w:name w:val="Heading 1 Char"/>
+    <w:basedOn w:val="DefaultParagraphFont"/>
+    <w:link w:val="Heading1"/>
+    <w:rsid w:val="002E2E79"/>
+    <w:rPr>
+      <w:rFonts w:eastAsia="MS Gothic" w:cs="Arial"/>
+      <w:b/>
+      <w:sz w:val="28"/>
+      <w:szCs w:val="20"/>
       <w:lang w:eastAsia="zh-CN"/>
     </w:rPr>
   </w:style>
@@ -16859,6 +16990,12 @@
 </file>
 
 <file path=customXml/item1.xml><?xml version="1.0" encoding="utf-8"?>
+<p:properties xmlns:p="http://schemas.microsoft.com/office/2006/metadata/properties" xmlns:xsi="http://www.w3.org/2001/XMLSchema-instance" xmlns:pc="http://schemas.microsoft.com/office/infopath/2007/PartnerControls">
+  <documentManagement/>
+</p:properties>
+</file>
+
+<file path=customXml/item2.xml><?xml version="1.0" encoding="utf-8"?>
 <?mso-contentType ?>
 <FormTemplates xmlns="http://schemas.microsoft.com/sharepoint/v3/contenttype/forms">
   <Display>DocumentLibraryForm</Display>
@@ -16867,7 +17004,7 @@
 </FormTemplates>
 </file>
 
-<file path=customXml/item2.xml><?xml version="1.0" encoding="utf-8"?>
+<file path=customXml/item3.xml><?xml version="1.0" encoding="utf-8"?>
 <ct:contentTypeSchema xmlns:ct="http://schemas.microsoft.com/office/2006/metadata/contentType" xmlns:ma="http://schemas.microsoft.com/office/2006/metadata/properties/metaAttributes" ct:_="" ma:_="" ma:contentTypeName="Document" ma:contentTypeID="0x0101006CD819919156C74F9E80DEFAAA1872C9" ma:contentTypeVersion="13" ma:contentTypeDescription="Create a new document." ma:contentTypeScope="" ma:versionID="50fe0e456e6faea8f88245a91881c3b5">
   <xsd:schema xmlns:xsd="http://www.w3.org/2001/XMLSchema" xmlns:xs="http://www.w3.org/2001/XMLSchema" xmlns:p="http://schemas.microsoft.com/office/2006/metadata/properties" xmlns:ns3="ad003f3d-2e17-4db5-b60d-526df86ad0f0" xmlns:ns4="fe03d810-5ba5-4302-839c-9214d405f10a" targetNamespace="http://schemas.microsoft.com/office/2006/metadata/properties" ma:root="true" ma:fieldsID="6e6e107fec7a88999611c5ac4043d74e" ns3:_="" ns4:_="">
     <xsd:import namespace="ad003f3d-2e17-4db5-b60d-526df86ad0f0"/>
@@ -17090,17 +17227,20 @@
 </ct:contentTypeSchema>
 </file>
 
-<file path=customXml/item3.xml><?xml version="1.0" encoding="utf-8"?>
+<file path=customXml/item4.xml><?xml version="1.0" encoding="utf-8"?>
 <b:Sources xmlns:b="http://schemas.openxmlformats.org/officeDocument/2006/bibliography" xmlns="http://schemas.openxmlformats.org/officeDocument/2006/bibliography" SelectedStyle="\APA.XSL" StyleName="APA"/>
 </file>
 
-<file path=customXml/item4.xml><?xml version="1.0" encoding="utf-8"?>
-<p:properties xmlns:p="http://schemas.microsoft.com/office/2006/metadata/properties" xmlns:xsi="http://www.w3.org/2001/XMLSchema-instance" xmlns:pc="http://schemas.microsoft.com/office/infopath/2007/PartnerControls">
-  <documentManagement/>
-</p:properties>
+<file path=customXml/itemProps1.xml><?xml version="1.0" encoding="utf-8"?>
+<ds:datastoreItem xmlns:ds="http://schemas.openxmlformats.org/officeDocument/2006/customXml" ds:itemID="{FCF06B24-A51F-4A21-B53C-33296C61BF86}">
+  <ds:schemaRefs>
+    <ds:schemaRef ds:uri="http://schemas.microsoft.com/office/2006/metadata/properties"/>
+    <ds:schemaRef ds:uri="http://schemas.microsoft.com/office/infopath/2007/PartnerControls"/>
+  </ds:schemaRefs>
+</ds:datastoreItem>
 </file>
 
-<file path=customXml/itemProps1.xml><?xml version="1.0" encoding="utf-8"?>
+<file path=customXml/itemProps2.xml><?xml version="1.0" encoding="utf-8"?>
 <ds:datastoreItem xmlns:ds="http://schemas.openxmlformats.org/officeDocument/2006/customXml" ds:itemID="{33FCBF9B-6E0C-4F57-AC32-FF1FD3666DDF}">
   <ds:schemaRefs>
     <ds:schemaRef ds:uri="http://schemas.microsoft.com/sharepoint/v3/contenttype/forms"/>
@@ -17108,7 +17248,7 @@
 </ds:datastoreItem>
 </file>
 
-<file path=customXml/itemProps2.xml><?xml version="1.0" encoding="utf-8"?>
+<file path=customXml/itemProps3.xml><?xml version="1.0" encoding="utf-8"?>
 <ds:datastoreItem xmlns:ds="http://schemas.openxmlformats.org/officeDocument/2006/customXml" ds:itemID="{6920E0C2-09F2-44E2-A637-8E6DCD4CC191}">
   <ds:schemaRefs>
     <ds:schemaRef ds:uri="http://schemas.microsoft.com/office/2006/metadata/contentType"/>
@@ -17127,19 +17267,10 @@
 </ds:datastoreItem>
 </file>
 
-<file path=customXml/itemProps3.xml><?xml version="1.0" encoding="utf-8"?>
+<file path=customXml/itemProps4.xml><?xml version="1.0" encoding="utf-8"?>
 <ds:datastoreItem xmlns:ds="http://schemas.openxmlformats.org/officeDocument/2006/customXml" ds:itemID="{1C73CA8F-0D0F-4C99-8EE8-8C153284B2D9}">
   <ds:schemaRefs>
     <ds:schemaRef ds:uri="http://schemas.openxmlformats.org/officeDocument/2006/bibliography"/>
   </ds:schemaRefs>
 </ds:datastoreItem>
-</file>
-
-<file path=customXml/itemProps4.xml><?xml version="1.0" encoding="utf-8"?>
-<ds:datastoreItem xmlns:ds="http://schemas.openxmlformats.org/officeDocument/2006/customXml" ds:itemID="{FCF06B24-A51F-4A21-B53C-33296C61BF86}">
-  <ds:schemaRefs>
-    <ds:schemaRef ds:uri="http://schemas.microsoft.com/office/2006/metadata/properties"/>
-    <ds:schemaRef ds:uri="http://schemas.microsoft.com/office/infopath/2007/PartnerControls"/>
-  </ds:schemaRefs>
-</ds:datastoreItem>
 </file>
</xml_diff>

<commit_message>
Temporarily remove version from the report
</commit_message>
<xml_diff>
--- a/www/template_officer.docx
+++ b/www/template_officer.docx
@@ -101,12 +101,6 @@
               <w:rFonts w:eastAsia="Times New Roman" w:cs="Times New Roman"/>
             </w:rPr>
           </w:pPr>
-          <w:r>
-            <w:rPr>
-              <w:rFonts w:eastAsia="Times New Roman" w:cs="Times New Roman"/>
-            </w:rPr>
-            <w:t>version</w:t>
-          </w:r>
         </w:p>
       </w:tc>
       <w:tc>
@@ -16990,21 +16984,10 @@
 </file>
 
 <file path=customXml/item1.xml><?xml version="1.0" encoding="utf-8"?>
-<p:properties xmlns:p="http://schemas.microsoft.com/office/2006/metadata/properties" xmlns:xsi="http://www.w3.org/2001/XMLSchema-instance" xmlns:pc="http://schemas.microsoft.com/office/infopath/2007/PartnerControls">
-  <documentManagement/>
-</p:properties>
+<b:Sources xmlns:b="http://schemas.openxmlformats.org/officeDocument/2006/bibliography" xmlns="http://schemas.openxmlformats.org/officeDocument/2006/bibliography" SelectedStyle="\APA.XSL" StyleName="APA"/>
 </file>
 
 <file path=customXml/item2.xml><?xml version="1.0" encoding="utf-8"?>
-<?mso-contentType ?>
-<FormTemplates xmlns="http://schemas.microsoft.com/sharepoint/v3/contenttype/forms">
-  <Display>DocumentLibraryForm</Display>
-  <Edit>DocumentLibraryForm</Edit>
-  <New>DocumentLibraryForm</New>
-</FormTemplates>
-</file>
-
-<file path=customXml/item3.xml><?xml version="1.0" encoding="utf-8"?>
 <ct:contentTypeSchema xmlns:ct="http://schemas.microsoft.com/office/2006/metadata/contentType" xmlns:ma="http://schemas.microsoft.com/office/2006/metadata/properties/metaAttributes" ct:_="" ma:_="" ma:contentTypeName="Document" ma:contentTypeID="0x0101006CD819919156C74F9E80DEFAAA1872C9" ma:contentTypeVersion="13" ma:contentTypeDescription="Create a new document." ma:contentTypeScope="" ma:versionID="50fe0e456e6faea8f88245a91881c3b5">
   <xsd:schema xmlns:xsd="http://www.w3.org/2001/XMLSchema" xmlns:xs="http://www.w3.org/2001/XMLSchema" xmlns:p="http://schemas.microsoft.com/office/2006/metadata/properties" xmlns:ns3="ad003f3d-2e17-4db5-b60d-526df86ad0f0" xmlns:ns4="fe03d810-5ba5-4302-839c-9214d405f10a" targetNamespace="http://schemas.microsoft.com/office/2006/metadata/properties" ma:root="true" ma:fieldsID="6e6e107fec7a88999611c5ac4043d74e" ns3:_="" ns4:_="">
     <xsd:import namespace="ad003f3d-2e17-4db5-b60d-526df86ad0f0"/>
@@ -17227,28 +17210,30 @@
 </ct:contentTypeSchema>
 </file>
 
+<file path=customXml/item3.xml><?xml version="1.0" encoding="utf-8"?>
+<?mso-contentType ?>
+<FormTemplates xmlns="http://schemas.microsoft.com/sharepoint/v3/contenttype/forms">
+  <Display>DocumentLibraryForm</Display>
+  <Edit>DocumentLibraryForm</Edit>
+  <New>DocumentLibraryForm</New>
+</FormTemplates>
+</file>
+
 <file path=customXml/item4.xml><?xml version="1.0" encoding="utf-8"?>
-<b:Sources xmlns:b="http://schemas.openxmlformats.org/officeDocument/2006/bibliography" xmlns="http://schemas.openxmlformats.org/officeDocument/2006/bibliography" SelectedStyle="\APA.XSL" StyleName="APA"/>
+<p:properties xmlns:p="http://schemas.microsoft.com/office/2006/metadata/properties" xmlns:xsi="http://www.w3.org/2001/XMLSchema-instance" xmlns:pc="http://schemas.microsoft.com/office/infopath/2007/PartnerControls">
+  <documentManagement/>
+</p:properties>
 </file>
 
 <file path=customXml/itemProps1.xml><?xml version="1.0" encoding="utf-8"?>
-<ds:datastoreItem xmlns:ds="http://schemas.openxmlformats.org/officeDocument/2006/customXml" ds:itemID="{FCF06B24-A51F-4A21-B53C-33296C61BF86}">
+<ds:datastoreItem xmlns:ds="http://schemas.openxmlformats.org/officeDocument/2006/customXml" ds:itemID="{1C73CA8F-0D0F-4C99-8EE8-8C153284B2D9}">
   <ds:schemaRefs>
-    <ds:schemaRef ds:uri="http://schemas.microsoft.com/office/2006/metadata/properties"/>
-    <ds:schemaRef ds:uri="http://schemas.microsoft.com/office/infopath/2007/PartnerControls"/>
+    <ds:schemaRef ds:uri="http://schemas.openxmlformats.org/officeDocument/2006/bibliography"/>
   </ds:schemaRefs>
 </ds:datastoreItem>
 </file>
 
 <file path=customXml/itemProps2.xml><?xml version="1.0" encoding="utf-8"?>
-<ds:datastoreItem xmlns:ds="http://schemas.openxmlformats.org/officeDocument/2006/customXml" ds:itemID="{33FCBF9B-6E0C-4F57-AC32-FF1FD3666DDF}">
-  <ds:schemaRefs>
-    <ds:schemaRef ds:uri="http://schemas.microsoft.com/sharepoint/v3/contenttype/forms"/>
-  </ds:schemaRefs>
-</ds:datastoreItem>
-</file>
-
-<file path=customXml/itemProps3.xml><?xml version="1.0" encoding="utf-8"?>
 <ds:datastoreItem xmlns:ds="http://schemas.openxmlformats.org/officeDocument/2006/customXml" ds:itemID="{6920E0C2-09F2-44E2-A637-8E6DCD4CC191}">
   <ds:schemaRefs>
     <ds:schemaRef ds:uri="http://schemas.microsoft.com/office/2006/metadata/contentType"/>
@@ -17267,10 +17252,19 @@
 </ds:datastoreItem>
 </file>
 
+<file path=customXml/itemProps3.xml><?xml version="1.0" encoding="utf-8"?>
+<ds:datastoreItem xmlns:ds="http://schemas.openxmlformats.org/officeDocument/2006/customXml" ds:itemID="{33FCBF9B-6E0C-4F57-AC32-FF1FD3666DDF}">
+  <ds:schemaRefs>
+    <ds:schemaRef ds:uri="http://schemas.microsoft.com/sharepoint/v3/contenttype/forms"/>
+  </ds:schemaRefs>
+</ds:datastoreItem>
+</file>
+
 <file path=customXml/itemProps4.xml><?xml version="1.0" encoding="utf-8"?>
-<ds:datastoreItem xmlns:ds="http://schemas.openxmlformats.org/officeDocument/2006/customXml" ds:itemID="{1C73CA8F-0D0F-4C99-8EE8-8C153284B2D9}">
+<ds:datastoreItem xmlns:ds="http://schemas.openxmlformats.org/officeDocument/2006/customXml" ds:itemID="{FCF06B24-A51F-4A21-B53C-33296C61BF86}">
   <ds:schemaRefs>
-    <ds:schemaRef ds:uri="http://schemas.openxmlformats.org/officeDocument/2006/bibliography"/>
+    <ds:schemaRef ds:uri="http://schemas.microsoft.com/office/2006/metadata/properties"/>
+    <ds:schemaRef ds:uri="http://schemas.microsoft.com/office/infopath/2007/PartnerControls"/>
   </ds:schemaRefs>
 </ds:datastoreItem>
 </file>
</xml_diff>

<commit_message>
Optimize splitting across pages for assay results
</commit_message>
<xml_diff>
--- a/www/template_officer.docx
+++ b/www/template_officer.docx
@@ -1,15 +1,11 @@
 
 <file path=word/document.xml><?xml version="1.0" encoding="utf-8"?>
-<w:document xmlns:wpc="http://schemas.microsoft.com/office/word/2010/wordprocessingCanvas" xmlns:cx="http://schemas.microsoft.com/office/drawing/2014/chartex" xmlns:cx1="http://schemas.microsoft.com/office/drawing/2015/9/8/chartex" xmlns:cx2="http://schemas.microsoft.com/office/drawing/2015/10/21/chartex" xmlns:cx3="http://schemas.microsoft.com/office/drawing/2016/5/9/chartex" xmlns:cx4="http://schemas.microsoft.com/office/drawing/2016/5/10/chartex" xmlns:cx5="http://schemas.microsoft.com/office/drawing/2016/5/11/chartex" xmlns:cx6="http://schemas.microsoft.com/office/drawing/2016/5/12/chartex" xmlns:cx7="http://schemas.microsoft.com/office/drawing/2016/5/13/chartex" xmlns:cx8="http://schemas.microsoft.com/office/drawing/2016/5/14/chartex" xmlns:mc="http://schemas.openxmlformats.org/markup-compatibility/2006" xmlns:aink="http://schemas.microsoft.com/office/drawing/2016/ink" xmlns:am3d="http://schemas.microsoft.com/office/drawing/2017/model3d" xmlns:o="urn:schemas-microsoft-com:office:office" xmlns:r="http://schemas.openxmlformats.org/officeDocument/2006/relationships" xmlns:m="http://schemas.openxmlformats.org/officeDocument/2006/math" xmlns:v="urn:schemas-microsoft-com:vml" xmlns:wp14="http://schemas.microsoft.com/office/word/2010/wordprocessingDrawing" xmlns:wp="http://schemas.openxmlformats.org/drawingml/2006/wordprocessingDrawing" xmlns:w10="urn:schemas-microsoft-com:office:word" xmlns:w="http://schemas.openxmlformats.org/wordprocessingml/2006/main" xmlns:w14="http://schemas.microsoft.com/office/word/2010/wordml" xmlns:w15="http://schemas.microsoft.com/office/word/2012/wordml" xmlns:w16cex="http://schemas.microsoft.com/office/word/2018/wordml/cex" xmlns:w16cid="http://schemas.microsoft.com/office/word/2016/wordml/cid" xmlns:w16="http://schemas.microsoft.com/office/word/2018/wordml" xmlns:w16sdtdh="http://schemas.microsoft.com/office/word/2020/wordml/sdtdatahash" xmlns:w16se="http://schemas.microsoft.com/office/word/2015/wordml/symex" xmlns:wpg="http://schemas.microsoft.com/office/word/2010/wordprocessingGroup" xmlns:wpi="http://schemas.microsoft.com/office/word/2010/wordprocessingInk" xmlns:wne="http://schemas.microsoft.com/office/word/2006/wordml" xmlns:wps="http://schemas.microsoft.com/office/word/2010/wordprocessingShape" mc:Ignorable="w14 w15 w16se w16cid w16 w16cex w16sdtdh wp14">
+<w:document xmlns:wpc="http://schemas.microsoft.com/office/word/2010/wordprocessingCanvas" xmlns:cx="http://schemas.microsoft.com/office/drawing/2014/chartex" xmlns:cx1="http://schemas.microsoft.com/office/drawing/2015/9/8/chartex" xmlns:cx2="http://schemas.microsoft.com/office/drawing/2015/10/21/chartex" xmlns:cx3="http://schemas.microsoft.com/office/drawing/2016/5/9/chartex" xmlns:cx4="http://schemas.microsoft.com/office/drawing/2016/5/10/chartex" xmlns:cx5="http://schemas.microsoft.com/office/drawing/2016/5/11/chartex" xmlns:cx6="http://schemas.microsoft.com/office/drawing/2016/5/12/chartex" xmlns:cx7="http://schemas.microsoft.com/office/drawing/2016/5/13/chartex" xmlns:cx8="http://schemas.microsoft.com/office/drawing/2016/5/14/chartex" xmlns:mc="http://schemas.openxmlformats.org/markup-compatibility/2006" xmlns:aink="http://schemas.microsoft.com/office/drawing/2016/ink" xmlns:am3d="http://schemas.microsoft.com/office/drawing/2017/model3d" xmlns:o="urn:schemas-microsoft-com:office:office" xmlns:oel="http://schemas.microsoft.com/office/2019/extlst" xmlns:r="http://schemas.openxmlformats.org/officeDocument/2006/relationships" xmlns:m="http://schemas.openxmlformats.org/officeDocument/2006/math" xmlns:v="urn:schemas-microsoft-com:vml" xmlns:wp14="http://schemas.microsoft.com/office/word/2010/wordprocessingDrawing" xmlns:wp="http://schemas.openxmlformats.org/drawingml/2006/wordprocessingDrawing" xmlns:w10="urn:schemas-microsoft-com:office:word" xmlns:w="http://schemas.openxmlformats.org/wordprocessingml/2006/main" xmlns:w14="http://schemas.microsoft.com/office/word/2010/wordml" xmlns:w15="http://schemas.microsoft.com/office/word/2012/wordml" xmlns:w16cex="http://schemas.microsoft.com/office/word/2018/wordml/cex" xmlns:w16cid="http://schemas.microsoft.com/office/word/2016/wordml/cid" xmlns:w16="http://schemas.microsoft.com/office/word/2018/wordml" xmlns:w16sdtdh="http://schemas.microsoft.com/office/word/2020/wordml/sdtdatahash" xmlns:w16se="http://schemas.microsoft.com/office/word/2015/wordml/symex" xmlns:wpg="http://schemas.microsoft.com/office/word/2010/wordprocessingGroup" xmlns:wpi="http://schemas.microsoft.com/office/word/2010/wordprocessingInk" xmlns:wne="http://schemas.microsoft.com/office/word/2006/wordml" xmlns:wps="http://schemas.microsoft.com/office/word/2010/wordprocessingShape" mc:Ignorable="w14 w15 w16se w16cid w16 w16cex w16sdtdh wp14">
   <w:body>
     <w:p/>
     <w:sectPr>
-      <w:headerReference w:type="even" r:id="rId11"/>
-      <w:headerReference w:type="default" r:id="rId12"/>
-      <w:footerReference w:type="even" r:id="rId13"/>
-      <w:footerReference w:type="default" r:id="rId14"/>
-      <w:headerReference w:type="first" r:id="rId15"/>
-      <w:footerReference w:type="first" r:id="rId16"/>
+      <w:headerReference w:type="default" r:id="rId11"/>
+      <w:footerReference w:type="default" r:id="rId12"/>
       <w:endnotePr>
         <w:numFmt w:val="decimal"/>
       </w:endnotePr>
@@ -23,7 +19,7 @@
 </file>
 
 <file path=word/endnotes.xml><?xml version="1.0" encoding="utf-8"?>
-<w:endnotes xmlns:wpc="http://schemas.microsoft.com/office/word/2010/wordprocessingCanvas" xmlns:cx="http://schemas.microsoft.com/office/drawing/2014/chartex" xmlns:cx1="http://schemas.microsoft.com/office/drawing/2015/9/8/chartex" xmlns:cx2="http://schemas.microsoft.com/office/drawing/2015/10/21/chartex" xmlns:cx3="http://schemas.microsoft.com/office/drawing/2016/5/9/chartex" xmlns:cx4="http://schemas.microsoft.com/office/drawing/2016/5/10/chartex" xmlns:cx5="http://schemas.microsoft.com/office/drawing/2016/5/11/chartex" xmlns:cx6="http://schemas.microsoft.com/office/drawing/2016/5/12/chartex" xmlns:cx7="http://schemas.microsoft.com/office/drawing/2016/5/13/chartex" xmlns:cx8="http://schemas.microsoft.com/office/drawing/2016/5/14/chartex" xmlns:mc="http://schemas.openxmlformats.org/markup-compatibility/2006" xmlns:aink="http://schemas.microsoft.com/office/drawing/2016/ink" xmlns:am3d="http://schemas.microsoft.com/office/drawing/2017/model3d" xmlns:o="urn:schemas-microsoft-com:office:office" xmlns:r="http://schemas.openxmlformats.org/officeDocument/2006/relationships" xmlns:m="http://schemas.openxmlformats.org/officeDocument/2006/math" xmlns:v="urn:schemas-microsoft-com:vml" xmlns:wp14="http://schemas.microsoft.com/office/word/2010/wordprocessingDrawing" xmlns:wp="http://schemas.openxmlformats.org/drawingml/2006/wordprocessingDrawing" xmlns:w10="urn:schemas-microsoft-com:office:word" xmlns:w="http://schemas.openxmlformats.org/wordprocessingml/2006/main" xmlns:w14="http://schemas.microsoft.com/office/word/2010/wordml" xmlns:w15="http://schemas.microsoft.com/office/word/2012/wordml" xmlns:w16cex="http://schemas.microsoft.com/office/word/2018/wordml/cex" xmlns:w16cid="http://schemas.microsoft.com/office/word/2016/wordml/cid" xmlns:w16="http://schemas.microsoft.com/office/word/2018/wordml" xmlns:w16sdtdh="http://schemas.microsoft.com/office/word/2020/wordml/sdtdatahash" xmlns:w16se="http://schemas.microsoft.com/office/word/2015/wordml/symex" xmlns:wpg="http://schemas.microsoft.com/office/word/2010/wordprocessingGroup" xmlns:wpi="http://schemas.microsoft.com/office/word/2010/wordprocessingInk" xmlns:wne="http://schemas.microsoft.com/office/word/2006/wordml" xmlns:wps="http://schemas.microsoft.com/office/word/2010/wordprocessingShape" mc:Ignorable="w14 w15 w16se w16cid w16 w16cex w16sdtdh wp14">
+<w:endnotes xmlns:wpc="http://schemas.microsoft.com/office/word/2010/wordprocessingCanvas" xmlns:cx="http://schemas.microsoft.com/office/drawing/2014/chartex" xmlns:cx1="http://schemas.microsoft.com/office/drawing/2015/9/8/chartex" xmlns:cx2="http://schemas.microsoft.com/office/drawing/2015/10/21/chartex" xmlns:cx3="http://schemas.microsoft.com/office/drawing/2016/5/9/chartex" xmlns:cx4="http://schemas.microsoft.com/office/drawing/2016/5/10/chartex" xmlns:cx5="http://schemas.microsoft.com/office/drawing/2016/5/11/chartex" xmlns:cx6="http://schemas.microsoft.com/office/drawing/2016/5/12/chartex" xmlns:cx7="http://schemas.microsoft.com/office/drawing/2016/5/13/chartex" xmlns:cx8="http://schemas.microsoft.com/office/drawing/2016/5/14/chartex" xmlns:mc="http://schemas.openxmlformats.org/markup-compatibility/2006" xmlns:aink="http://schemas.microsoft.com/office/drawing/2016/ink" xmlns:am3d="http://schemas.microsoft.com/office/drawing/2017/model3d" xmlns:o="urn:schemas-microsoft-com:office:office" xmlns:oel="http://schemas.microsoft.com/office/2019/extlst" xmlns:r="http://schemas.openxmlformats.org/officeDocument/2006/relationships" xmlns:m="http://schemas.openxmlformats.org/officeDocument/2006/math" xmlns:v="urn:schemas-microsoft-com:vml" xmlns:wp14="http://schemas.microsoft.com/office/word/2010/wordprocessingDrawing" xmlns:wp="http://schemas.openxmlformats.org/drawingml/2006/wordprocessingDrawing" xmlns:w10="urn:schemas-microsoft-com:office:word" xmlns:w="http://schemas.openxmlformats.org/wordprocessingml/2006/main" xmlns:w14="http://schemas.microsoft.com/office/word/2010/wordml" xmlns:w15="http://schemas.microsoft.com/office/word/2012/wordml" xmlns:w16cex="http://schemas.microsoft.com/office/word/2018/wordml/cex" xmlns:w16cid="http://schemas.microsoft.com/office/word/2016/wordml/cid" xmlns:w16="http://schemas.microsoft.com/office/word/2018/wordml" xmlns:w16sdtdh="http://schemas.microsoft.com/office/word/2020/wordml/sdtdatahash" xmlns:w16se="http://schemas.microsoft.com/office/word/2015/wordml/symex" xmlns:wpg="http://schemas.microsoft.com/office/word/2010/wordprocessingGroup" xmlns:wpi="http://schemas.microsoft.com/office/word/2010/wordprocessingInk" xmlns:wne="http://schemas.microsoft.com/office/word/2006/wordml" xmlns:wps="http://schemas.microsoft.com/office/word/2010/wordprocessingShape" mc:Ignorable="w14 w15 w16se w16cid w16 w16cex w16sdtdh wp14">
   <w:endnote w:type="separator" w:id="-1">
     <w:p>
       <w:r>
@@ -42,17 +38,7 @@
 </file>
 
 <file path=word/footer1.xml><?xml version="1.0" encoding="utf-8"?>
-<w:ftr xmlns:wpc="http://schemas.microsoft.com/office/word/2010/wordprocessingCanvas" xmlns:cx="http://schemas.microsoft.com/office/drawing/2014/chartex" xmlns:cx1="http://schemas.microsoft.com/office/drawing/2015/9/8/chartex" xmlns:cx2="http://schemas.microsoft.com/office/drawing/2015/10/21/chartex" xmlns:cx3="http://schemas.microsoft.com/office/drawing/2016/5/9/chartex" xmlns:cx4="http://schemas.microsoft.com/office/drawing/2016/5/10/chartex" xmlns:cx5="http://schemas.microsoft.com/office/drawing/2016/5/11/chartex" xmlns:cx6="http://schemas.microsoft.com/office/drawing/2016/5/12/chartex" xmlns:cx7="http://schemas.microsoft.com/office/drawing/2016/5/13/chartex" xmlns:cx8="http://schemas.microsoft.com/office/drawing/2016/5/14/chartex" xmlns:mc="http://schemas.openxmlformats.org/markup-compatibility/2006" xmlns:aink="http://schemas.microsoft.com/office/drawing/2016/ink" xmlns:am3d="http://schemas.microsoft.com/office/drawing/2017/model3d" xmlns:o="urn:schemas-microsoft-com:office:office" xmlns:r="http://schemas.openxmlformats.org/officeDocument/2006/relationships" xmlns:m="http://schemas.openxmlformats.org/officeDocument/2006/math" xmlns:v="urn:schemas-microsoft-com:vml" xmlns:wp14="http://schemas.microsoft.com/office/word/2010/wordprocessingDrawing" xmlns:wp="http://schemas.openxmlformats.org/drawingml/2006/wordprocessingDrawing" xmlns:w10="urn:schemas-microsoft-com:office:word" xmlns:w="http://schemas.openxmlformats.org/wordprocessingml/2006/main" xmlns:w14="http://schemas.microsoft.com/office/word/2010/wordml" xmlns:w15="http://schemas.microsoft.com/office/word/2012/wordml" xmlns:w16cex="http://schemas.microsoft.com/office/word/2018/wordml/cex" xmlns:w16cid="http://schemas.microsoft.com/office/word/2016/wordml/cid" xmlns:w16="http://schemas.microsoft.com/office/word/2018/wordml" xmlns:w16sdtdh="http://schemas.microsoft.com/office/word/2020/wordml/sdtdatahash" xmlns:w16se="http://schemas.microsoft.com/office/word/2015/wordml/symex" xmlns:wpg="http://schemas.microsoft.com/office/word/2010/wordprocessingGroup" xmlns:wpi="http://schemas.microsoft.com/office/word/2010/wordprocessingInk" xmlns:wne="http://schemas.microsoft.com/office/word/2006/wordml" xmlns:wps="http://schemas.microsoft.com/office/word/2010/wordprocessingShape" mc:Ignorable="w14 w15 w16se w16cid w16 w16cex w16sdtdh wp14">
-  <w:p>
-    <w:pPr>
-      <w:pStyle w:val="Footer"/>
-    </w:pPr>
-  </w:p>
-</w:ftr>
-</file>
-
-<file path=word/footer2.xml><?xml version="1.0" encoding="utf-8"?>
-<w:ftr xmlns:wpc="http://schemas.microsoft.com/office/word/2010/wordprocessingCanvas" xmlns:cx="http://schemas.microsoft.com/office/drawing/2014/chartex" xmlns:cx1="http://schemas.microsoft.com/office/drawing/2015/9/8/chartex" xmlns:cx2="http://schemas.microsoft.com/office/drawing/2015/10/21/chartex" xmlns:cx3="http://schemas.microsoft.com/office/drawing/2016/5/9/chartex" xmlns:cx4="http://schemas.microsoft.com/office/drawing/2016/5/10/chartex" xmlns:cx5="http://schemas.microsoft.com/office/drawing/2016/5/11/chartex" xmlns:cx6="http://schemas.microsoft.com/office/drawing/2016/5/12/chartex" xmlns:cx7="http://schemas.microsoft.com/office/drawing/2016/5/13/chartex" xmlns:cx8="http://schemas.microsoft.com/office/drawing/2016/5/14/chartex" xmlns:mc="http://schemas.openxmlformats.org/markup-compatibility/2006" xmlns:aink="http://schemas.microsoft.com/office/drawing/2016/ink" xmlns:am3d="http://schemas.microsoft.com/office/drawing/2017/model3d" xmlns:o="urn:schemas-microsoft-com:office:office" xmlns:r="http://schemas.openxmlformats.org/officeDocument/2006/relationships" xmlns:m="http://schemas.openxmlformats.org/officeDocument/2006/math" xmlns:v="urn:schemas-microsoft-com:vml" xmlns:wp14="http://schemas.microsoft.com/office/word/2010/wordprocessingDrawing" xmlns:wp="http://schemas.openxmlformats.org/drawingml/2006/wordprocessingDrawing" xmlns:w10="urn:schemas-microsoft-com:office:word" xmlns:w="http://schemas.openxmlformats.org/wordprocessingml/2006/main" xmlns:w14="http://schemas.microsoft.com/office/word/2010/wordml" xmlns:w15="http://schemas.microsoft.com/office/word/2012/wordml" xmlns:w16cex="http://schemas.microsoft.com/office/word/2018/wordml/cex" xmlns:w16cid="http://schemas.microsoft.com/office/word/2016/wordml/cid" xmlns:w16="http://schemas.microsoft.com/office/word/2018/wordml" xmlns:w16sdtdh="http://schemas.microsoft.com/office/word/2020/wordml/sdtdatahash" xmlns:w16se="http://schemas.microsoft.com/office/word/2015/wordml/symex" xmlns:wpg="http://schemas.microsoft.com/office/word/2010/wordprocessingGroup" xmlns:wpi="http://schemas.microsoft.com/office/word/2010/wordprocessingInk" xmlns:wne="http://schemas.microsoft.com/office/word/2006/wordml" xmlns:wps="http://schemas.microsoft.com/office/word/2010/wordprocessingShape" mc:Ignorable="w14 w15 w16se w16cid w16 w16cex w16sdtdh wp14">
+<w:ftr xmlns:wpc="http://schemas.microsoft.com/office/word/2010/wordprocessingCanvas" xmlns:cx="http://schemas.microsoft.com/office/drawing/2014/chartex" xmlns:cx1="http://schemas.microsoft.com/office/drawing/2015/9/8/chartex" xmlns:cx2="http://schemas.microsoft.com/office/drawing/2015/10/21/chartex" xmlns:cx3="http://schemas.microsoft.com/office/drawing/2016/5/9/chartex" xmlns:cx4="http://schemas.microsoft.com/office/drawing/2016/5/10/chartex" xmlns:cx5="http://schemas.microsoft.com/office/drawing/2016/5/11/chartex" xmlns:cx6="http://schemas.microsoft.com/office/drawing/2016/5/12/chartex" xmlns:cx7="http://schemas.microsoft.com/office/drawing/2016/5/13/chartex" xmlns:cx8="http://schemas.microsoft.com/office/drawing/2016/5/14/chartex" xmlns:mc="http://schemas.openxmlformats.org/markup-compatibility/2006" xmlns:aink="http://schemas.microsoft.com/office/drawing/2016/ink" xmlns:am3d="http://schemas.microsoft.com/office/drawing/2017/model3d" xmlns:o="urn:schemas-microsoft-com:office:office" xmlns:oel="http://schemas.microsoft.com/office/2019/extlst" xmlns:r="http://schemas.openxmlformats.org/officeDocument/2006/relationships" xmlns:m="http://schemas.openxmlformats.org/officeDocument/2006/math" xmlns:v="urn:schemas-microsoft-com:vml" xmlns:wp14="http://schemas.microsoft.com/office/word/2010/wordprocessingDrawing" xmlns:wp="http://schemas.openxmlformats.org/drawingml/2006/wordprocessingDrawing" xmlns:w10="urn:schemas-microsoft-com:office:word" xmlns:w="http://schemas.openxmlformats.org/wordprocessingml/2006/main" xmlns:w14="http://schemas.microsoft.com/office/word/2010/wordml" xmlns:w15="http://schemas.microsoft.com/office/word/2012/wordml" xmlns:w16cex="http://schemas.microsoft.com/office/word/2018/wordml/cex" xmlns:w16cid="http://schemas.microsoft.com/office/word/2016/wordml/cid" xmlns:w16="http://schemas.microsoft.com/office/word/2018/wordml" xmlns:w16sdtdh="http://schemas.microsoft.com/office/word/2020/wordml/sdtdatahash" xmlns:w16se="http://schemas.microsoft.com/office/word/2015/wordml/symex" xmlns:wpg="http://schemas.microsoft.com/office/word/2010/wordprocessingGroup" xmlns:wpi="http://schemas.microsoft.com/office/word/2010/wordprocessingInk" xmlns:wne="http://schemas.microsoft.com/office/word/2006/wordml" xmlns:wps="http://schemas.microsoft.com/office/word/2010/wordprocessingShape" mc:Ignorable="w14 w15 w16se w16cid w16 w16cex w16sdtdh wp14">
   <w:p>
     <w:pPr>
       <w:pStyle w:val="Footer"/>
@@ -215,18 +201,8 @@
 </w:ftr>
 </file>
 
-<file path=word/footer3.xml><?xml version="1.0" encoding="utf-8"?>
-<w:ftr xmlns:wpc="http://schemas.microsoft.com/office/word/2010/wordprocessingCanvas" xmlns:cx="http://schemas.microsoft.com/office/drawing/2014/chartex" xmlns:cx1="http://schemas.microsoft.com/office/drawing/2015/9/8/chartex" xmlns:cx2="http://schemas.microsoft.com/office/drawing/2015/10/21/chartex" xmlns:cx3="http://schemas.microsoft.com/office/drawing/2016/5/9/chartex" xmlns:cx4="http://schemas.microsoft.com/office/drawing/2016/5/10/chartex" xmlns:cx5="http://schemas.microsoft.com/office/drawing/2016/5/11/chartex" xmlns:cx6="http://schemas.microsoft.com/office/drawing/2016/5/12/chartex" xmlns:cx7="http://schemas.microsoft.com/office/drawing/2016/5/13/chartex" xmlns:cx8="http://schemas.microsoft.com/office/drawing/2016/5/14/chartex" xmlns:mc="http://schemas.openxmlformats.org/markup-compatibility/2006" xmlns:aink="http://schemas.microsoft.com/office/drawing/2016/ink" xmlns:am3d="http://schemas.microsoft.com/office/drawing/2017/model3d" xmlns:o="urn:schemas-microsoft-com:office:office" xmlns:r="http://schemas.openxmlformats.org/officeDocument/2006/relationships" xmlns:m="http://schemas.openxmlformats.org/officeDocument/2006/math" xmlns:v="urn:schemas-microsoft-com:vml" xmlns:wp14="http://schemas.microsoft.com/office/word/2010/wordprocessingDrawing" xmlns:wp="http://schemas.openxmlformats.org/drawingml/2006/wordprocessingDrawing" xmlns:w10="urn:schemas-microsoft-com:office:word" xmlns:w="http://schemas.openxmlformats.org/wordprocessingml/2006/main" xmlns:w14="http://schemas.microsoft.com/office/word/2010/wordml" xmlns:w15="http://schemas.microsoft.com/office/word/2012/wordml" xmlns:w16cex="http://schemas.microsoft.com/office/word/2018/wordml/cex" xmlns:w16cid="http://schemas.microsoft.com/office/word/2016/wordml/cid" xmlns:w16="http://schemas.microsoft.com/office/word/2018/wordml" xmlns:w16sdtdh="http://schemas.microsoft.com/office/word/2020/wordml/sdtdatahash" xmlns:w16se="http://schemas.microsoft.com/office/word/2015/wordml/symex" xmlns:wpg="http://schemas.microsoft.com/office/word/2010/wordprocessingGroup" xmlns:wpi="http://schemas.microsoft.com/office/word/2010/wordprocessingInk" xmlns:wne="http://schemas.microsoft.com/office/word/2006/wordml" xmlns:wps="http://schemas.microsoft.com/office/word/2010/wordprocessingShape" mc:Ignorable="w14 w15 w16se w16cid w16 w16cex w16sdtdh wp14">
-  <w:p>
-    <w:pPr>
-      <w:pStyle w:val="Footer"/>
-    </w:pPr>
-  </w:p>
-</w:ftr>
-</file>
-
 <file path=word/footnotes.xml><?xml version="1.0" encoding="utf-8"?>
-<w:footnotes xmlns:wpc="http://schemas.microsoft.com/office/word/2010/wordprocessingCanvas" xmlns:cx="http://schemas.microsoft.com/office/drawing/2014/chartex" xmlns:cx1="http://schemas.microsoft.com/office/drawing/2015/9/8/chartex" xmlns:cx2="http://schemas.microsoft.com/office/drawing/2015/10/21/chartex" xmlns:cx3="http://schemas.microsoft.com/office/drawing/2016/5/9/chartex" xmlns:cx4="http://schemas.microsoft.com/office/drawing/2016/5/10/chartex" xmlns:cx5="http://schemas.microsoft.com/office/drawing/2016/5/11/chartex" xmlns:cx6="http://schemas.microsoft.com/office/drawing/2016/5/12/chartex" xmlns:cx7="http://schemas.microsoft.com/office/drawing/2016/5/13/chartex" xmlns:cx8="http://schemas.microsoft.com/office/drawing/2016/5/14/chartex" xmlns:mc="http://schemas.openxmlformats.org/markup-compatibility/2006" xmlns:aink="http://schemas.microsoft.com/office/drawing/2016/ink" xmlns:am3d="http://schemas.microsoft.com/office/drawing/2017/model3d" xmlns:o="urn:schemas-microsoft-com:office:office" xmlns:r="http://schemas.openxmlformats.org/officeDocument/2006/relationships" xmlns:m="http://schemas.openxmlformats.org/officeDocument/2006/math" xmlns:v="urn:schemas-microsoft-com:vml" xmlns:wp14="http://schemas.microsoft.com/office/word/2010/wordprocessingDrawing" xmlns:wp="http://schemas.openxmlformats.org/drawingml/2006/wordprocessingDrawing" xmlns:w10="urn:schemas-microsoft-com:office:word" xmlns:w="http://schemas.openxmlformats.org/wordprocessingml/2006/main" xmlns:w14="http://schemas.microsoft.com/office/word/2010/wordml" xmlns:w15="http://schemas.microsoft.com/office/word/2012/wordml" xmlns:w16cex="http://schemas.microsoft.com/office/word/2018/wordml/cex" xmlns:w16cid="http://schemas.microsoft.com/office/word/2016/wordml/cid" xmlns:w16="http://schemas.microsoft.com/office/word/2018/wordml" xmlns:w16sdtdh="http://schemas.microsoft.com/office/word/2020/wordml/sdtdatahash" xmlns:w16se="http://schemas.microsoft.com/office/word/2015/wordml/symex" xmlns:wpg="http://schemas.microsoft.com/office/word/2010/wordprocessingGroup" xmlns:wpi="http://schemas.microsoft.com/office/word/2010/wordprocessingInk" xmlns:wne="http://schemas.microsoft.com/office/word/2006/wordml" xmlns:wps="http://schemas.microsoft.com/office/word/2010/wordprocessingShape" mc:Ignorable="w14 w15 w16se w16cid w16 w16cex w16sdtdh wp14">
+<w:footnotes xmlns:wpc="http://schemas.microsoft.com/office/word/2010/wordprocessingCanvas" xmlns:cx="http://schemas.microsoft.com/office/drawing/2014/chartex" xmlns:cx1="http://schemas.microsoft.com/office/drawing/2015/9/8/chartex" xmlns:cx2="http://schemas.microsoft.com/office/drawing/2015/10/21/chartex" xmlns:cx3="http://schemas.microsoft.com/office/drawing/2016/5/9/chartex" xmlns:cx4="http://schemas.microsoft.com/office/drawing/2016/5/10/chartex" xmlns:cx5="http://schemas.microsoft.com/office/drawing/2016/5/11/chartex" xmlns:cx6="http://schemas.microsoft.com/office/drawing/2016/5/12/chartex" xmlns:cx7="http://schemas.microsoft.com/office/drawing/2016/5/13/chartex" xmlns:cx8="http://schemas.microsoft.com/office/drawing/2016/5/14/chartex" xmlns:mc="http://schemas.openxmlformats.org/markup-compatibility/2006" xmlns:aink="http://schemas.microsoft.com/office/drawing/2016/ink" xmlns:am3d="http://schemas.microsoft.com/office/drawing/2017/model3d" xmlns:o="urn:schemas-microsoft-com:office:office" xmlns:oel="http://schemas.microsoft.com/office/2019/extlst" xmlns:r="http://schemas.openxmlformats.org/officeDocument/2006/relationships" xmlns:m="http://schemas.openxmlformats.org/officeDocument/2006/math" xmlns:v="urn:schemas-microsoft-com:vml" xmlns:wp14="http://schemas.microsoft.com/office/word/2010/wordprocessingDrawing" xmlns:wp="http://schemas.openxmlformats.org/drawingml/2006/wordprocessingDrawing" xmlns:w10="urn:schemas-microsoft-com:office:word" xmlns:w="http://schemas.openxmlformats.org/wordprocessingml/2006/main" xmlns:w14="http://schemas.microsoft.com/office/word/2010/wordml" xmlns:w15="http://schemas.microsoft.com/office/word/2012/wordml" xmlns:w16cex="http://schemas.microsoft.com/office/word/2018/wordml/cex" xmlns:w16cid="http://schemas.microsoft.com/office/word/2016/wordml/cid" xmlns:w16="http://schemas.microsoft.com/office/word/2018/wordml" xmlns:w16sdtdh="http://schemas.microsoft.com/office/word/2020/wordml/sdtdatahash" xmlns:w16se="http://schemas.microsoft.com/office/word/2015/wordml/symex" xmlns:wpg="http://schemas.microsoft.com/office/word/2010/wordprocessingGroup" xmlns:wpi="http://schemas.microsoft.com/office/word/2010/wordprocessingInk" xmlns:wne="http://schemas.microsoft.com/office/word/2006/wordml" xmlns:wps="http://schemas.microsoft.com/office/word/2010/wordprocessingShape" mc:Ignorable="w14 w15 w16se w16cid w16 w16cex w16sdtdh wp14">
   <w:footnote w:type="separator" w:id="-1">
     <w:p>
       <w:r>
@@ -245,17 +221,7 @@
 </file>
 
 <file path=word/header1.xml><?xml version="1.0" encoding="utf-8"?>
-<w:hdr xmlns:wpc="http://schemas.microsoft.com/office/word/2010/wordprocessingCanvas" xmlns:cx="http://schemas.microsoft.com/office/drawing/2014/chartex" xmlns:cx1="http://schemas.microsoft.com/office/drawing/2015/9/8/chartex" xmlns:cx2="http://schemas.microsoft.com/office/drawing/2015/10/21/chartex" xmlns:cx3="http://schemas.microsoft.com/office/drawing/2016/5/9/chartex" xmlns:cx4="http://schemas.microsoft.com/office/drawing/2016/5/10/chartex" xmlns:cx5="http://schemas.microsoft.com/office/drawing/2016/5/11/chartex" xmlns:cx6="http://schemas.microsoft.com/office/drawing/2016/5/12/chartex" xmlns:cx7="http://schemas.microsoft.com/office/drawing/2016/5/13/chartex" xmlns:cx8="http://schemas.microsoft.com/office/drawing/2016/5/14/chartex" xmlns:mc="http://schemas.openxmlformats.org/markup-compatibility/2006" xmlns:aink="http://schemas.microsoft.com/office/drawing/2016/ink" xmlns:am3d="http://schemas.microsoft.com/office/drawing/2017/model3d" xmlns:o="urn:schemas-microsoft-com:office:office" xmlns:r="http://schemas.openxmlformats.org/officeDocument/2006/relationships" xmlns:m="http://schemas.openxmlformats.org/officeDocument/2006/math" xmlns:v="urn:schemas-microsoft-com:vml" xmlns:wp14="http://schemas.microsoft.com/office/word/2010/wordprocessingDrawing" xmlns:wp="http://schemas.openxmlformats.org/drawingml/2006/wordprocessingDrawing" xmlns:w10="urn:schemas-microsoft-com:office:word" xmlns:w="http://schemas.openxmlformats.org/wordprocessingml/2006/main" xmlns:w14="http://schemas.microsoft.com/office/word/2010/wordml" xmlns:w15="http://schemas.microsoft.com/office/word/2012/wordml" xmlns:w16cex="http://schemas.microsoft.com/office/word/2018/wordml/cex" xmlns:w16cid="http://schemas.microsoft.com/office/word/2016/wordml/cid" xmlns:w16="http://schemas.microsoft.com/office/word/2018/wordml" xmlns:w16sdtdh="http://schemas.microsoft.com/office/word/2020/wordml/sdtdatahash" xmlns:w16se="http://schemas.microsoft.com/office/word/2015/wordml/symex" xmlns:wpg="http://schemas.microsoft.com/office/word/2010/wordprocessingGroup" xmlns:wpi="http://schemas.microsoft.com/office/word/2010/wordprocessingInk" xmlns:wne="http://schemas.microsoft.com/office/word/2006/wordml" xmlns:wps="http://schemas.microsoft.com/office/word/2010/wordprocessingShape" mc:Ignorable="w14 w15 w16se w16cid w16 w16cex w16sdtdh wp14">
-  <w:p>
-    <w:pPr>
-      <w:pStyle w:val="Header"/>
-    </w:pPr>
-  </w:p>
-</w:hdr>
-</file>
-
-<file path=word/header2.xml><?xml version="1.0" encoding="utf-8"?>
-<w:hdr xmlns:wpc="http://schemas.microsoft.com/office/word/2010/wordprocessingCanvas" xmlns:cx="http://schemas.microsoft.com/office/drawing/2014/chartex" xmlns:cx1="http://schemas.microsoft.com/office/drawing/2015/9/8/chartex" xmlns:cx2="http://schemas.microsoft.com/office/drawing/2015/10/21/chartex" xmlns:cx3="http://schemas.microsoft.com/office/drawing/2016/5/9/chartex" xmlns:cx4="http://schemas.microsoft.com/office/drawing/2016/5/10/chartex" xmlns:cx5="http://schemas.microsoft.com/office/drawing/2016/5/11/chartex" xmlns:cx6="http://schemas.microsoft.com/office/drawing/2016/5/12/chartex" xmlns:cx7="http://schemas.microsoft.com/office/drawing/2016/5/13/chartex" xmlns:cx8="http://schemas.microsoft.com/office/drawing/2016/5/14/chartex" xmlns:mc="http://schemas.openxmlformats.org/markup-compatibility/2006" xmlns:aink="http://schemas.microsoft.com/office/drawing/2016/ink" xmlns:am3d="http://schemas.microsoft.com/office/drawing/2017/model3d" xmlns:o="urn:schemas-microsoft-com:office:office" xmlns:r="http://schemas.openxmlformats.org/officeDocument/2006/relationships" xmlns:m="http://schemas.openxmlformats.org/officeDocument/2006/math" xmlns:v="urn:schemas-microsoft-com:vml" xmlns:wp14="http://schemas.microsoft.com/office/word/2010/wordprocessingDrawing" xmlns:wp="http://schemas.openxmlformats.org/drawingml/2006/wordprocessingDrawing" xmlns:w10="urn:schemas-microsoft-com:office:word" xmlns:w="http://schemas.openxmlformats.org/wordprocessingml/2006/main" xmlns:w14="http://schemas.microsoft.com/office/word/2010/wordml" xmlns:w15="http://schemas.microsoft.com/office/word/2012/wordml" xmlns:w16cex="http://schemas.microsoft.com/office/word/2018/wordml/cex" xmlns:w16cid="http://schemas.microsoft.com/office/word/2016/wordml/cid" xmlns:w16="http://schemas.microsoft.com/office/word/2018/wordml" xmlns:w16sdtdh="http://schemas.microsoft.com/office/word/2020/wordml/sdtdatahash" xmlns:w16se="http://schemas.microsoft.com/office/word/2015/wordml/symex" xmlns:wpg="http://schemas.microsoft.com/office/word/2010/wordprocessingGroup" xmlns:wpi="http://schemas.microsoft.com/office/word/2010/wordprocessingInk" xmlns:wne="http://schemas.microsoft.com/office/word/2006/wordml" xmlns:wps="http://schemas.microsoft.com/office/word/2010/wordprocessingShape" mc:Ignorable="w14 w15 w16se w16cid w16 w16cex w16sdtdh wp14">
+<w:hdr xmlns:wpc="http://schemas.microsoft.com/office/word/2010/wordprocessingCanvas" xmlns:cx="http://schemas.microsoft.com/office/drawing/2014/chartex" xmlns:cx1="http://schemas.microsoft.com/office/drawing/2015/9/8/chartex" xmlns:cx2="http://schemas.microsoft.com/office/drawing/2015/10/21/chartex" xmlns:cx3="http://schemas.microsoft.com/office/drawing/2016/5/9/chartex" xmlns:cx4="http://schemas.microsoft.com/office/drawing/2016/5/10/chartex" xmlns:cx5="http://schemas.microsoft.com/office/drawing/2016/5/11/chartex" xmlns:cx6="http://schemas.microsoft.com/office/drawing/2016/5/12/chartex" xmlns:cx7="http://schemas.microsoft.com/office/drawing/2016/5/13/chartex" xmlns:cx8="http://schemas.microsoft.com/office/drawing/2016/5/14/chartex" xmlns:mc="http://schemas.openxmlformats.org/markup-compatibility/2006" xmlns:aink="http://schemas.microsoft.com/office/drawing/2016/ink" xmlns:am3d="http://schemas.microsoft.com/office/drawing/2017/model3d" xmlns:o="urn:schemas-microsoft-com:office:office" xmlns:oel="http://schemas.microsoft.com/office/2019/extlst" xmlns:r="http://schemas.openxmlformats.org/officeDocument/2006/relationships" xmlns:m="http://schemas.openxmlformats.org/officeDocument/2006/math" xmlns:v="urn:schemas-microsoft-com:vml" xmlns:wp14="http://schemas.microsoft.com/office/word/2010/wordprocessingDrawing" xmlns:wp="http://schemas.openxmlformats.org/drawingml/2006/wordprocessingDrawing" xmlns:w10="urn:schemas-microsoft-com:office:word" xmlns:w="http://schemas.openxmlformats.org/wordprocessingml/2006/main" xmlns:w14="http://schemas.microsoft.com/office/word/2010/wordml" xmlns:w15="http://schemas.microsoft.com/office/word/2012/wordml" xmlns:w16cex="http://schemas.microsoft.com/office/word/2018/wordml/cex" xmlns:w16cid="http://schemas.microsoft.com/office/word/2016/wordml/cid" xmlns:w16="http://schemas.microsoft.com/office/word/2018/wordml" xmlns:w16sdtdh="http://schemas.microsoft.com/office/word/2020/wordml/sdtdatahash" xmlns:w16se="http://schemas.microsoft.com/office/word/2015/wordml/symex" xmlns:wpg="http://schemas.microsoft.com/office/word/2010/wordprocessingGroup" xmlns:wpi="http://schemas.microsoft.com/office/word/2010/wordprocessingInk" xmlns:wne="http://schemas.microsoft.com/office/word/2006/wordml" xmlns:wps="http://schemas.microsoft.com/office/word/2010/wordprocessingShape" mc:Ignorable="w14 w15 w16se w16cid w16 w16cex w16sdtdh wp14">
   <w:tbl>
     <w:tblPr>
       <w:tblStyle w:val="TableGrid"/>
@@ -333,18 +299,8 @@
 </w:hdr>
 </file>
 
-<file path=word/header3.xml><?xml version="1.0" encoding="utf-8"?>
-<w:hdr xmlns:wpc="http://schemas.microsoft.com/office/word/2010/wordprocessingCanvas" xmlns:cx="http://schemas.microsoft.com/office/drawing/2014/chartex" xmlns:cx1="http://schemas.microsoft.com/office/drawing/2015/9/8/chartex" xmlns:cx2="http://schemas.microsoft.com/office/drawing/2015/10/21/chartex" xmlns:cx3="http://schemas.microsoft.com/office/drawing/2016/5/9/chartex" xmlns:cx4="http://schemas.microsoft.com/office/drawing/2016/5/10/chartex" xmlns:cx5="http://schemas.microsoft.com/office/drawing/2016/5/11/chartex" xmlns:cx6="http://schemas.microsoft.com/office/drawing/2016/5/12/chartex" xmlns:cx7="http://schemas.microsoft.com/office/drawing/2016/5/13/chartex" xmlns:cx8="http://schemas.microsoft.com/office/drawing/2016/5/14/chartex" xmlns:mc="http://schemas.openxmlformats.org/markup-compatibility/2006" xmlns:aink="http://schemas.microsoft.com/office/drawing/2016/ink" xmlns:am3d="http://schemas.microsoft.com/office/drawing/2017/model3d" xmlns:o="urn:schemas-microsoft-com:office:office" xmlns:r="http://schemas.openxmlformats.org/officeDocument/2006/relationships" xmlns:m="http://schemas.openxmlformats.org/officeDocument/2006/math" xmlns:v="urn:schemas-microsoft-com:vml" xmlns:wp14="http://schemas.microsoft.com/office/word/2010/wordprocessingDrawing" xmlns:wp="http://schemas.openxmlformats.org/drawingml/2006/wordprocessingDrawing" xmlns:w10="urn:schemas-microsoft-com:office:word" xmlns:w="http://schemas.openxmlformats.org/wordprocessingml/2006/main" xmlns:w14="http://schemas.microsoft.com/office/word/2010/wordml" xmlns:w15="http://schemas.microsoft.com/office/word/2012/wordml" xmlns:w16cex="http://schemas.microsoft.com/office/word/2018/wordml/cex" xmlns:w16cid="http://schemas.microsoft.com/office/word/2016/wordml/cid" xmlns:w16="http://schemas.microsoft.com/office/word/2018/wordml" xmlns:w16sdtdh="http://schemas.microsoft.com/office/word/2020/wordml/sdtdatahash" xmlns:w16se="http://schemas.microsoft.com/office/word/2015/wordml/symex" xmlns:wpg="http://schemas.microsoft.com/office/word/2010/wordprocessingGroup" xmlns:wpi="http://schemas.microsoft.com/office/word/2010/wordprocessingInk" xmlns:wne="http://schemas.microsoft.com/office/word/2006/wordml" xmlns:wps="http://schemas.microsoft.com/office/word/2010/wordprocessingShape" mc:Ignorable="w14 w15 w16se w16cid w16 w16cex w16sdtdh wp14">
-  <w:p>
-    <w:pPr>
-      <w:pStyle w:val="Header"/>
-    </w:pPr>
-  </w:p>
-</w:hdr>
-</file>
-
 <file path=word/numbering.xml><?xml version="1.0" encoding="utf-8"?>
-<w:numbering xmlns:wpc="http://schemas.microsoft.com/office/word/2010/wordprocessingCanvas" xmlns:cx="http://schemas.microsoft.com/office/drawing/2014/chartex" xmlns:cx1="http://schemas.microsoft.com/office/drawing/2015/9/8/chartex" xmlns:cx2="http://schemas.microsoft.com/office/drawing/2015/10/21/chartex" xmlns:cx3="http://schemas.microsoft.com/office/drawing/2016/5/9/chartex" xmlns:cx4="http://schemas.microsoft.com/office/drawing/2016/5/10/chartex" xmlns:cx5="http://schemas.microsoft.com/office/drawing/2016/5/11/chartex" xmlns:cx6="http://schemas.microsoft.com/office/drawing/2016/5/12/chartex" xmlns:cx7="http://schemas.microsoft.com/office/drawing/2016/5/13/chartex" xmlns:cx8="http://schemas.microsoft.com/office/drawing/2016/5/14/chartex" xmlns:mc="http://schemas.openxmlformats.org/markup-compatibility/2006" xmlns:aink="http://schemas.microsoft.com/office/drawing/2016/ink" xmlns:am3d="http://schemas.microsoft.com/office/drawing/2017/model3d" xmlns:o="urn:schemas-microsoft-com:office:office" xmlns:r="http://schemas.openxmlformats.org/officeDocument/2006/relationships" xmlns:m="http://schemas.openxmlformats.org/officeDocument/2006/math" xmlns:v="urn:schemas-microsoft-com:vml" xmlns:wp14="http://schemas.microsoft.com/office/word/2010/wordprocessingDrawing" xmlns:wp="http://schemas.openxmlformats.org/drawingml/2006/wordprocessingDrawing" xmlns:w10="urn:schemas-microsoft-com:office:word" xmlns:w="http://schemas.openxmlformats.org/wordprocessingml/2006/main" xmlns:w14="http://schemas.microsoft.com/office/word/2010/wordml" xmlns:w15="http://schemas.microsoft.com/office/word/2012/wordml" xmlns:w16cex="http://schemas.microsoft.com/office/word/2018/wordml/cex" xmlns:w16cid="http://schemas.microsoft.com/office/word/2016/wordml/cid" xmlns:w16="http://schemas.microsoft.com/office/word/2018/wordml" xmlns:w16sdtdh="http://schemas.microsoft.com/office/word/2020/wordml/sdtdatahash" xmlns:w16se="http://schemas.microsoft.com/office/word/2015/wordml/symex" xmlns:wpg="http://schemas.microsoft.com/office/word/2010/wordprocessingGroup" xmlns:wpi="http://schemas.microsoft.com/office/word/2010/wordprocessingInk" xmlns:wne="http://schemas.microsoft.com/office/word/2006/wordml" xmlns:wps="http://schemas.microsoft.com/office/word/2010/wordprocessingShape" mc:Ignorable="w14 w15 w16se w16cid w16 w16cex w16sdtdh wp14">
+<w:numbering xmlns:wpc="http://schemas.microsoft.com/office/word/2010/wordprocessingCanvas" xmlns:cx="http://schemas.microsoft.com/office/drawing/2014/chartex" xmlns:cx1="http://schemas.microsoft.com/office/drawing/2015/9/8/chartex" xmlns:cx2="http://schemas.microsoft.com/office/drawing/2015/10/21/chartex" xmlns:cx3="http://schemas.microsoft.com/office/drawing/2016/5/9/chartex" xmlns:cx4="http://schemas.microsoft.com/office/drawing/2016/5/10/chartex" xmlns:cx5="http://schemas.microsoft.com/office/drawing/2016/5/11/chartex" xmlns:cx6="http://schemas.microsoft.com/office/drawing/2016/5/12/chartex" xmlns:cx7="http://schemas.microsoft.com/office/drawing/2016/5/13/chartex" xmlns:cx8="http://schemas.microsoft.com/office/drawing/2016/5/14/chartex" xmlns:mc="http://schemas.openxmlformats.org/markup-compatibility/2006" xmlns:aink="http://schemas.microsoft.com/office/drawing/2016/ink" xmlns:am3d="http://schemas.microsoft.com/office/drawing/2017/model3d" xmlns:o="urn:schemas-microsoft-com:office:office" xmlns:oel="http://schemas.microsoft.com/office/2019/extlst" xmlns:r="http://schemas.openxmlformats.org/officeDocument/2006/relationships" xmlns:m="http://schemas.openxmlformats.org/officeDocument/2006/math" xmlns:v="urn:schemas-microsoft-com:vml" xmlns:wp14="http://schemas.microsoft.com/office/word/2010/wordprocessingDrawing" xmlns:wp="http://schemas.openxmlformats.org/drawingml/2006/wordprocessingDrawing" xmlns:w10="urn:schemas-microsoft-com:office:word" xmlns:w="http://schemas.openxmlformats.org/wordprocessingml/2006/main" xmlns:w14="http://schemas.microsoft.com/office/word/2010/wordml" xmlns:w15="http://schemas.microsoft.com/office/word/2012/wordml" xmlns:w16cex="http://schemas.microsoft.com/office/word/2018/wordml/cex" xmlns:w16cid="http://schemas.microsoft.com/office/word/2016/wordml/cid" xmlns:w16="http://schemas.microsoft.com/office/word/2018/wordml" xmlns:w16sdtdh="http://schemas.microsoft.com/office/word/2020/wordml/sdtdatahash" xmlns:w16se="http://schemas.microsoft.com/office/word/2015/wordml/symex" xmlns:wpg="http://schemas.microsoft.com/office/word/2010/wordprocessingGroup" xmlns:wpi="http://schemas.microsoft.com/office/word/2010/wordprocessingInk" xmlns:wne="http://schemas.microsoft.com/office/word/2006/wordml" xmlns:wps="http://schemas.microsoft.com/office/word/2010/wordprocessingShape" mc:Ignorable="w14 w15 w16se w16cid w16 w16cex w16sdtdh wp14">
   <w:abstractNum w:abstractNumId="0" w15:restartNumberingAfterBreak="0">
     <w:nsid w:val="062F70A5"/>
     <w:multiLevelType w:val="singleLevel"/>
@@ -1463,76 +1419,76 @@
       </w:pPr>
     </w:lvl>
   </w:abstractNum>
-  <w:num w:numId="1">
+  <w:num w:numId="1" w16cid:durableId="777866951">
     <w:abstractNumId w:val="2"/>
   </w:num>
-  <w:num w:numId="2">
+  <w:num w:numId="2" w16cid:durableId="1322075002">
     <w:abstractNumId w:val="12"/>
   </w:num>
-  <w:num w:numId="3">
+  <w:num w:numId="3" w16cid:durableId="436869542">
     <w:abstractNumId w:val="7"/>
   </w:num>
-  <w:num w:numId="4">
+  <w:num w:numId="4" w16cid:durableId="1510869472">
     <w:abstractNumId w:val="4"/>
   </w:num>
-  <w:num w:numId="5">
+  <w:num w:numId="5" w16cid:durableId="178546375">
     <w:abstractNumId w:val="8"/>
   </w:num>
-  <w:num w:numId="6">
+  <w:num w:numId="6" w16cid:durableId="1137603439">
     <w:abstractNumId w:val="14"/>
   </w:num>
-  <w:num w:numId="7">
+  <w:num w:numId="7" w16cid:durableId="1666981119">
     <w:abstractNumId w:val="13"/>
   </w:num>
-  <w:num w:numId="8">
+  <w:num w:numId="8" w16cid:durableId="2130472847">
     <w:abstractNumId w:val="3"/>
   </w:num>
-  <w:num w:numId="9">
+  <w:num w:numId="9" w16cid:durableId="1833258555">
     <w:abstractNumId w:val="0"/>
   </w:num>
-  <w:num w:numId="10">
+  <w:num w:numId="10" w16cid:durableId="1699742787">
     <w:abstractNumId w:val="6"/>
   </w:num>
-  <w:num w:numId="11">
+  <w:num w:numId="11" w16cid:durableId="2005161132">
     <w:abstractNumId w:val="9"/>
   </w:num>
-  <w:num w:numId="12">
+  <w:num w:numId="12" w16cid:durableId="588543440">
     <w:abstractNumId w:val="4"/>
   </w:num>
-  <w:num w:numId="13">
+  <w:num w:numId="13" w16cid:durableId="1932928549">
     <w:abstractNumId w:val="11"/>
   </w:num>
-  <w:num w:numId="14">
+  <w:num w:numId="14" w16cid:durableId="1661613393">
     <w:abstractNumId w:val="15"/>
   </w:num>
-  <w:num w:numId="15">
+  <w:num w:numId="15" w16cid:durableId="1768767309">
     <w:abstractNumId w:val="1"/>
   </w:num>
-  <w:num w:numId="16">
+  <w:num w:numId="16" w16cid:durableId="1616711511">
     <w:abstractNumId w:val="5"/>
   </w:num>
-  <w:num w:numId="17">
+  <w:num w:numId="17" w16cid:durableId="563445637">
     <w:abstractNumId w:val="10"/>
   </w:num>
-  <w:num w:numId="18">
+  <w:num w:numId="18" w16cid:durableId="1454834288">
     <w:abstractNumId w:val="16"/>
   </w:num>
-  <w:num w:numId="19">
+  <w:num w:numId="19" w16cid:durableId="1512260280">
     <w:abstractNumId w:val="4"/>
   </w:num>
-  <w:num w:numId="20">
+  <w:num w:numId="20" w16cid:durableId="1112016833">
     <w:abstractNumId w:val="4"/>
   </w:num>
-  <w:num w:numId="21">
+  <w:num w:numId="21" w16cid:durableId="342781371">
     <w:abstractNumId w:val="4"/>
   </w:num>
-  <w:num w:numId="22">
+  <w:num w:numId="22" w16cid:durableId="702171560">
     <w:abstractNumId w:val="4"/>
   </w:num>
-  <w:num w:numId="23">
+  <w:num w:numId="23" w16cid:durableId="1758406118">
     <w:abstractNumId w:val="4"/>
   </w:num>
-  <w:num w:numId="24">
+  <w:num w:numId="24" w16cid:durableId="1914701963">
     <w:abstractNumId w:val="4"/>
   </w:num>
   <w:numIdMacAtCleanup w:val="11"/>
@@ -1932,7 +1888,7 @@
   <w:style w:type="paragraph" w:default="1" w:styleId="Normal">
     <w:name w:val="Normal"/>
     <w:qFormat/>
-    <w:rsid w:val="007F550B"/>
+    <w:rsid w:val="00030462"/>
     <w:pPr>
       <w:spacing w:before="40"/>
     </w:pPr>
@@ -1943,14 +1899,15 @@
     <w:next w:val="Text"/>
     <w:link w:val="Heading1Char"/>
     <w:qFormat/>
-    <w:rsid w:val="002E2E79"/>
+    <w:rsid w:val="009821CF"/>
     <w:pPr>
       <w:keepNext/>
       <w:keepLines/>
       <w:numPr>
         <w:numId w:val="24"/>
       </w:numPr>
-      <w:spacing w:before="360"/>
+      <w:spacing w:before="180"/>
+      <w:ind w:left="1009" w:hanging="1009"/>
       <w:outlineLvl w:val="0"/>
     </w:pPr>
     <w:rPr>
@@ -2312,6 +2269,7 @@
   <w:style w:type="paragraph" w:styleId="Header">
     <w:name w:val="header"/>
     <w:basedOn w:val="Normal"/>
+    <w:link w:val="HeaderChar"/>
     <w:rsid w:val="00093D29"/>
     <w:pPr>
       <w:widowControl w:val="0"/>
@@ -16691,13 +16649,23 @@
     <w:name w:val="Heading 1 Char"/>
     <w:basedOn w:val="DefaultParagraphFont"/>
     <w:link w:val="Heading1"/>
-    <w:rsid w:val="002E2E79"/>
+    <w:rsid w:val="009821CF"/>
     <w:rPr>
       <w:rFonts w:eastAsia="MS Gothic" w:cs="Arial"/>
       <w:b/>
       <w:sz w:val="28"/>
       <w:szCs w:val="20"/>
       <w:lang w:eastAsia="zh-CN"/>
+    </w:rPr>
+  </w:style>
+  <w:style w:type="character" w:customStyle="1" w:styleId="HeaderChar">
+    <w:name w:val="Header Char"/>
+    <w:basedOn w:val="DefaultParagraphFont"/>
+    <w:link w:val="Header"/>
+    <w:rsid w:val="009821CF"/>
+    <w:rPr>
+      <w:rFonts w:eastAsia="MS Gothic" w:cs="Arial"/>
+      <w:sz w:val="20"/>
     </w:rPr>
   </w:style>
 </w:styles>
@@ -16989,10 +16957,21 @@
 </file>
 
 <file path=customXml/item1.xml><?xml version="1.0" encoding="utf-8"?>
-<b:Sources xmlns:b="http://schemas.openxmlformats.org/officeDocument/2006/bibliography" xmlns="http://schemas.openxmlformats.org/officeDocument/2006/bibliography" SelectedStyle="\APA.XSL" StyleName="APA"/>
+<p:properties xmlns:p="http://schemas.microsoft.com/office/2006/metadata/properties" xmlns:xsi="http://www.w3.org/2001/XMLSchema-instance" xmlns:pc="http://schemas.microsoft.com/office/infopath/2007/PartnerControls">
+  <documentManagement/>
+</p:properties>
 </file>
 
 <file path=customXml/item2.xml><?xml version="1.0" encoding="utf-8"?>
+<?mso-contentType ?>
+<FormTemplates xmlns="http://schemas.microsoft.com/sharepoint/v3/contenttype/forms">
+  <Display>DocumentLibraryForm</Display>
+  <Edit>DocumentLibraryForm</Edit>
+  <New>DocumentLibraryForm</New>
+</FormTemplates>
+</file>
+
+<file path=customXml/item3.xml><?xml version="1.0" encoding="utf-8"?>
 <ct:contentTypeSchema xmlns:ct="http://schemas.microsoft.com/office/2006/metadata/contentType" xmlns:ma="http://schemas.microsoft.com/office/2006/metadata/properties/metaAttributes" ct:_="" ma:_="" ma:contentTypeName="Document" ma:contentTypeID="0x0101006CD819919156C74F9E80DEFAAA1872C9" ma:contentTypeVersion="13" ma:contentTypeDescription="Create a new document." ma:contentTypeScope="" ma:versionID="50fe0e456e6faea8f88245a91881c3b5">
   <xsd:schema xmlns:xsd="http://www.w3.org/2001/XMLSchema" xmlns:xs="http://www.w3.org/2001/XMLSchema" xmlns:p="http://schemas.microsoft.com/office/2006/metadata/properties" xmlns:ns3="ad003f3d-2e17-4db5-b60d-526df86ad0f0" xmlns:ns4="fe03d810-5ba5-4302-839c-9214d405f10a" targetNamespace="http://schemas.microsoft.com/office/2006/metadata/properties" ma:root="true" ma:fieldsID="6e6e107fec7a88999611c5ac4043d74e" ns3:_="" ns4:_="">
     <xsd:import namespace="ad003f3d-2e17-4db5-b60d-526df86ad0f0"/>
@@ -17215,30 +17194,28 @@
 </ct:contentTypeSchema>
 </file>
 
-<file path=customXml/item3.xml><?xml version="1.0" encoding="utf-8"?>
-<?mso-contentType ?>
-<FormTemplates xmlns="http://schemas.microsoft.com/sharepoint/v3/contenttype/forms">
-  <Display>DocumentLibraryForm</Display>
-  <Edit>DocumentLibraryForm</Edit>
-  <New>DocumentLibraryForm</New>
-</FormTemplates>
-</file>
-
 <file path=customXml/item4.xml><?xml version="1.0" encoding="utf-8"?>
-<p:properties xmlns:p="http://schemas.microsoft.com/office/2006/metadata/properties" xmlns:xsi="http://www.w3.org/2001/XMLSchema-instance" xmlns:pc="http://schemas.microsoft.com/office/infopath/2007/PartnerControls">
-  <documentManagement/>
-</p:properties>
+<b:Sources xmlns:b="http://schemas.openxmlformats.org/officeDocument/2006/bibliography" xmlns="http://schemas.openxmlformats.org/officeDocument/2006/bibliography" SelectedStyle="\APA.XSL" StyleName="APA"/>
 </file>
 
 <file path=customXml/itemProps1.xml><?xml version="1.0" encoding="utf-8"?>
-<ds:datastoreItem xmlns:ds="http://schemas.openxmlformats.org/officeDocument/2006/customXml" ds:itemID="{1C73CA8F-0D0F-4C99-8EE8-8C153284B2D9}">
+<ds:datastoreItem xmlns:ds="http://schemas.openxmlformats.org/officeDocument/2006/customXml" ds:itemID="{FCF06B24-A51F-4A21-B53C-33296C61BF86}">
   <ds:schemaRefs>
-    <ds:schemaRef ds:uri="http://schemas.openxmlformats.org/officeDocument/2006/bibliography"/>
+    <ds:schemaRef ds:uri="http://schemas.microsoft.com/office/2006/metadata/properties"/>
+    <ds:schemaRef ds:uri="http://schemas.microsoft.com/office/infopath/2007/PartnerControls"/>
   </ds:schemaRefs>
 </ds:datastoreItem>
 </file>
 
 <file path=customXml/itemProps2.xml><?xml version="1.0" encoding="utf-8"?>
+<ds:datastoreItem xmlns:ds="http://schemas.openxmlformats.org/officeDocument/2006/customXml" ds:itemID="{33FCBF9B-6E0C-4F57-AC32-FF1FD3666DDF}">
+  <ds:schemaRefs>
+    <ds:schemaRef ds:uri="http://schemas.microsoft.com/sharepoint/v3/contenttype/forms"/>
+  </ds:schemaRefs>
+</ds:datastoreItem>
+</file>
+
+<file path=customXml/itemProps3.xml><?xml version="1.0" encoding="utf-8"?>
 <ds:datastoreItem xmlns:ds="http://schemas.openxmlformats.org/officeDocument/2006/customXml" ds:itemID="{6920E0C2-09F2-44E2-A637-8E6DCD4CC191}">
   <ds:schemaRefs>
     <ds:schemaRef ds:uri="http://schemas.microsoft.com/office/2006/metadata/contentType"/>
@@ -17257,19 +17234,10 @@
 </ds:datastoreItem>
 </file>
 
-<file path=customXml/itemProps3.xml><?xml version="1.0" encoding="utf-8"?>
-<ds:datastoreItem xmlns:ds="http://schemas.openxmlformats.org/officeDocument/2006/customXml" ds:itemID="{33FCBF9B-6E0C-4F57-AC32-FF1FD3666DDF}">
+<file path=customXml/itemProps4.xml><?xml version="1.0" encoding="utf-8"?>
+<ds:datastoreItem xmlns:ds="http://schemas.openxmlformats.org/officeDocument/2006/customXml" ds:itemID="{1C73CA8F-0D0F-4C99-8EE8-8C153284B2D9}">
   <ds:schemaRefs>
-    <ds:schemaRef ds:uri="http://schemas.microsoft.com/sharepoint/v3/contenttype/forms"/>
-  </ds:schemaRefs>
-</ds:datastoreItem>
-</file>
-
-<file path=customXml/itemProps4.xml><?xml version="1.0" encoding="utf-8"?>
-<ds:datastoreItem xmlns:ds="http://schemas.openxmlformats.org/officeDocument/2006/customXml" ds:itemID="{FCF06B24-A51F-4A21-B53C-33296C61BF86}">
-  <ds:schemaRefs>
-    <ds:schemaRef ds:uri="http://schemas.microsoft.com/office/2006/metadata/properties"/>
-    <ds:schemaRef ds:uri="http://schemas.microsoft.com/office/infopath/2007/PartnerControls"/>
+    <ds:schemaRef ds:uri="http://schemas.openxmlformats.org/officeDocument/2006/bibliography"/>
   </ds:schemaRefs>
 </ds:datastoreItem>
 </file>
</xml_diff>

<commit_message>
Changes relevant for validation
  - Add a reference to the governing WP and SOP
  - Add 521-ID besides user name in report
  - Add time in addition to date in report
  - Change support text and mail address in app footer
  - Change app name to Linearity
</commit_message>
<xml_diff>
--- a/www/template_officer.docx
+++ b/www/template_officer.docx
@@ -4,8 +4,12 @@
   <w:body>
     <w:p/>
     <w:sectPr>
-      <w:headerReference w:type="default" r:id="rId11"/>
-      <w:footerReference w:type="default" r:id="rId12"/>
+      <w:headerReference w:type="even" r:id="rId11"/>
+      <w:headerReference w:type="default" r:id="rId12"/>
+      <w:footerReference w:type="even" r:id="rId13"/>
+      <w:footerReference w:type="default" r:id="rId14"/>
+      <w:headerReference w:type="first" r:id="rId15"/>
+      <w:footerReference w:type="first" r:id="rId16"/>
       <w:endnotePr>
         <w:numFmt w:val="decimal"/>
       </w:endnotePr>
@@ -42,6 +46,16 @@
   <w:p>
     <w:pPr>
       <w:pStyle w:val="Footer"/>
+    </w:pPr>
+  </w:p>
+</w:ftr>
+</file>
+
+<file path=word/footer2.xml><?xml version="1.0" encoding="utf-8"?>
+<w:ftr xmlns:wpc="http://schemas.microsoft.com/office/word/2010/wordprocessingCanvas" xmlns:cx="http://schemas.microsoft.com/office/drawing/2014/chartex" xmlns:cx1="http://schemas.microsoft.com/office/drawing/2015/9/8/chartex" xmlns:cx2="http://schemas.microsoft.com/office/drawing/2015/10/21/chartex" xmlns:cx3="http://schemas.microsoft.com/office/drawing/2016/5/9/chartex" xmlns:cx4="http://schemas.microsoft.com/office/drawing/2016/5/10/chartex" xmlns:cx5="http://schemas.microsoft.com/office/drawing/2016/5/11/chartex" xmlns:cx6="http://schemas.microsoft.com/office/drawing/2016/5/12/chartex" xmlns:cx7="http://schemas.microsoft.com/office/drawing/2016/5/13/chartex" xmlns:cx8="http://schemas.microsoft.com/office/drawing/2016/5/14/chartex" xmlns:mc="http://schemas.openxmlformats.org/markup-compatibility/2006" xmlns:aink="http://schemas.microsoft.com/office/drawing/2016/ink" xmlns:am3d="http://schemas.microsoft.com/office/drawing/2017/model3d" xmlns:o="urn:schemas-microsoft-com:office:office" xmlns:oel="http://schemas.microsoft.com/office/2019/extlst" xmlns:r="http://schemas.openxmlformats.org/officeDocument/2006/relationships" xmlns:m="http://schemas.openxmlformats.org/officeDocument/2006/math" xmlns:v="urn:schemas-microsoft-com:vml" xmlns:wp14="http://schemas.microsoft.com/office/word/2010/wordprocessingDrawing" xmlns:wp="http://schemas.openxmlformats.org/drawingml/2006/wordprocessingDrawing" xmlns:w10="urn:schemas-microsoft-com:office:word" xmlns:w="http://schemas.openxmlformats.org/wordprocessingml/2006/main" xmlns:w14="http://schemas.microsoft.com/office/word/2010/wordml" xmlns:w15="http://schemas.microsoft.com/office/word/2012/wordml" xmlns:w16cex="http://schemas.microsoft.com/office/word/2018/wordml/cex" xmlns:w16cid="http://schemas.microsoft.com/office/word/2016/wordml/cid" xmlns:w16="http://schemas.microsoft.com/office/word/2018/wordml" xmlns:w16sdtdh="http://schemas.microsoft.com/office/word/2020/wordml/sdtdatahash" xmlns:w16se="http://schemas.microsoft.com/office/word/2015/wordml/symex" xmlns:wpg="http://schemas.microsoft.com/office/word/2010/wordprocessingGroup" xmlns:wpi="http://schemas.microsoft.com/office/word/2010/wordprocessingInk" xmlns:wne="http://schemas.microsoft.com/office/word/2006/wordml" xmlns:wps="http://schemas.microsoft.com/office/word/2010/wordprocessingShape" mc:Ignorable="w14 w15 w16se w16cid w16 w16cex w16sdtdh wp14">
+  <w:p>
+    <w:pPr>
+      <w:pStyle w:val="Footer"/>
       <w:jc w:val="center"/>
       <w:rPr>
         <w:rFonts w:eastAsia="Times New Roman" w:cs="Times New Roman"/>
@@ -76,14 +90,14 @@
       <w:tblLook w:val="04A0" w:firstRow="1" w:lastRow="0" w:firstColumn="1" w:lastColumn="0" w:noHBand="0" w:noVBand="1"/>
     </w:tblPr>
     <w:tblGrid>
-      <w:gridCol w:w="3256"/>
-      <w:gridCol w:w="2551"/>
-      <w:gridCol w:w="3265"/>
+      <w:gridCol w:w="1838"/>
+      <w:gridCol w:w="5103"/>
+      <w:gridCol w:w="2131"/>
     </w:tblGrid>
     <w:tr>
       <w:tc>
         <w:tcPr>
-          <w:tcW w:w="3256" w:type="dxa"/>
+          <w:tcW w:w="1838" w:type="dxa"/>
         </w:tcPr>
         <w:p>
           <w:pPr>
@@ -96,7 +110,7 @@
       </w:tc>
       <w:tc>
         <w:tcPr>
-          <w:tcW w:w="2551" w:type="dxa"/>
+          <w:tcW w:w="5103" w:type="dxa"/>
         </w:tcPr>
         <w:p>
           <w:pPr>
@@ -116,7 +130,7 @@
       </w:tc>
       <w:tc>
         <w:tcPr>
-          <w:tcW w:w="3265" w:type="dxa"/>
+          <w:tcW w:w="2131" w:type="dxa"/>
         </w:tcPr>
         <w:p>
           <w:pPr>
@@ -201,6 +215,16 @@
 </w:ftr>
 </file>
 
+<file path=word/footer3.xml><?xml version="1.0" encoding="utf-8"?>
+<w:ftr xmlns:wpc="http://schemas.microsoft.com/office/word/2010/wordprocessingCanvas" xmlns:cx="http://schemas.microsoft.com/office/drawing/2014/chartex" xmlns:cx1="http://schemas.microsoft.com/office/drawing/2015/9/8/chartex" xmlns:cx2="http://schemas.microsoft.com/office/drawing/2015/10/21/chartex" xmlns:cx3="http://schemas.microsoft.com/office/drawing/2016/5/9/chartex" xmlns:cx4="http://schemas.microsoft.com/office/drawing/2016/5/10/chartex" xmlns:cx5="http://schemas.microsoft.com/office/drawing/2016/5/11/chartex" xmlns:cx6="http://schemas.microsoft.com/office/drawing/2016/5/12/chartex" xmlns:cx7="http://schemas.microsoft.com/office/drawing/2016/5/13/chartex" xmlns:cx8="http://schemas.microsoft.com/office/drawing/2016/5/14/chartex" xmlns:mc="http://schemas.openxmlformats.org/markup-compatibility/2006" xmlns:aink="http://schemas.microsoft.com/office/drawing/2016/ink" xmlns:am3d="http://schemas.microsoft.com/office/drawing/2017/model3d" xmlns:o="urn:schemas-microsoft-com:office:office" xmlns:oel="http://schemas.microsoft.com/office/2019/extlst" xmlns:r="http://schemas.openxmlformats.org/officeDocument/2006/relationships" xmlns:m="http://schemas.openxmlformats.org/officeDocument/2006/math" xmlns:v="urn:schemas-microsoft-com:vml" xmlns:wp14="http://schemas.microsoft.com/office/word/2010/wordprocessingDrawing" xmlns:wp="http://schemas.openxmlformats.org/drawingml/2006/wordprocessingDrawing" xmlns:w10="urn:schemas-microsoft-com:office:word" xmlns:w="http://schemas.openxmlformats.org/wordprocessingml/2006/main" xmlns:w14="http://schemas.microsoft.com/office/word/2010/wordml" xmlns:w15="http://schemas.microsoft.com/office/word/2012/wordml" xmlns:w16cex="http://schemas.microsoft.com/office/word/2018/wordml/cex" xmlns:w16cid="http://schemas.microsoft.com/office/word/2016/wordml/cid" xmlns:w16="http://schemas.microsoft.com/office/word/2018/wordml" xmlns:w16sdtdh="http://schemas.microsoft.com/office/word/2020/wordml/sdtdatahash" xmlns:w16se="http://schemas.microsoft.com/office/word/2015/wordml/symex" xmlns:wpg="http://schemas.microsoft.com/office/word/2010/wordprocessingGroup" xmlns:wpi="http://schemas.microsoft.com/office/word/2010/wordprocessingInk" xmlns:wne="http://schemas.microsoft.com/office/word/2006/wordml" xmlns:wps="http://schemas.microsoft.com/office/word/2010/wordprocessingShape" mc:Ignorable="w14 w15 w16se w16cid w16 w16cex w16sdtdh wp14">
+  <w:p>
+    <w:pPr>
+      <w:pStyle w:val="Footer"/>
+    </w:pPr>
+  </w:p>
+</w:ftr>
+</file>
+
 <file path=word/footnotes.xml><?xml version="1.0" encoding="utf-8"?>
 <w:footnotes xmlns:wpc="http://schemas.microsoft.com/office/word/2010/wordprocessingCanvas" xmlns:cx="http://schemas.microsoft.com/office/drawing/2014/chartex" xmlns:cx1="http://schemas.microsoft.com/office/drawing/2015/9/8/chartex" xmlns:cx2="http://schemas.microsoft.com/office/drawing/2015/10/21/chartex" xmlns:cx3="http://schemas.microsoft.com/office/drawing/2016/5/9/chartex" xmlns:cx4="http://schemas.microsoft.com/office/drawing/2016/5/10/chartex" xmlns:cx5="http://schemas.microsoft.com/office/drawing/2016/5/11/chartex" xmlns:cx6="http://schemas.microsoft.com/office/drawing/2016/5/12/chartex" xmlns:cx7="http://schemas.microsoft.com/office/drawing/2016/5/13/chartex" xmlns:cx8="http://schemas.microsoft.com/office/drawing/2016/5/14/chartex" xmlns:mc="http://schemas.openxmlformats.org/markup-compatibility/2006" xmlns:aink="http://schemas.microsoft.com/office/drawing/2016/ink" xmlns:am3d="http://schemas.microsoft.com/office/drawing/2017/model3d" xmlns:o="urn:schemas-microsoft-com:office:office" xmlns:oel="http://schemas.microsoft.com/office/2019/extlst" xmlns:r="http://schemas.openxmlformats.org/officeDocument/2006/relationships" xmlns:m="http://schemas.openxmlformats.org/officeDocument/2006/math" xmlns:v="urn:schemas-microsoft-com:vml" xmlns:wp14="http://schemas.microsoft.com/office/word/2010/wordprocessingDrawing" xmlns:wp="http://schemas.openxmlformats.org/drawingml/2006/wordprocessingDrawing" xmlns:w10="urn:schemas-microsoft-com:office:word" xmlns:w="http://schemas.openxmlformats.org/wordprocessingml/2006/main" xmlns:w14="http://schemas.microsoft.com/office/word/2010/wordml" xmlns:w15="http://schemas.microsoft.com/office/word/2012/wordml" xmlns:w16cex="http://schemas.microsoft.com/office/word/2018/wordml/cex" xmlns:w16cid="http://schemas.microsoft.com/office/word/2016/wordml/cid" xmlns:w16="http://schemas.microsoft.com/office/word/2018/wordml" xmlns:w16sdtdh="http://schemas.microsoft.com/office/word/2020/wordml/sdtdatahash" xmlns:w16se="http://schemas.microsoft.com/office/word/2015/wordml/symex" xmlns:wpg="http://schemas.microsoft.com/office/word/2010/wordprocessingGroup" xmlns:wpi="http://schemas.microsoft.com/office/word/2010/wordprocessingInk" xmlns:wne="http://schemas.microsoft.com/office/word/2006/wordml" xmlns:wps="http://schemas.microsoft.com/office/word/2010/wordprocessingShape" mc:Ignorable="w14 w15 w16se w16cid w16 w16cex w16sdtdh wp14">
   <w:footnote w:type="separator" w:id="-1">
@@ -221,6 +245,16 @@
 </file>
 
 <file path=word/header1.xml><?xml version="1.0" encoding="utf-8"?>
+<w:hdr xmlns:wpc="http://schemas.microsoft.com/office/word/2010/wordprocessingCanvas" xmlns:cx="http://schemas.microsoft.com/office/drawing/2014/chartex" xmlns:cx1="http://schemas.microsoft.com/office/drawing/2015/9/8/chartex" xmlns:cx2="http://schemas.microsoft.com/office/drawing/2015/10/21/chartex" xmlns:cx3="http://schemas.microsoft.com/office/drawing/2016/5/9/chartex" xmlns:cx4="http://schemas.microsoft.com/office/drawing/2016/5/10/chartex" xmlns:cx5="http://schemas.microsoft.com/office/drawing/2016/5/11/chartex" xmlns:cx6="http://schemas.microsoft.com/office/drawing/2016/5/12/chartex" xmlns:cx7="http://schemas.microsoft.com/office/drawing/2016/5/13/chartex" xmlns:cx8="http://schemas.microsoft.com/office/drawing/2016/5/14/chartex" xmlns:mc="http://schemas.openxmlformats.org/markup-compatibility/2006" xmlns:aink="http://schemas.microsoft.com/office/drawing/2016/ink" xmlns:am3d="http://schemas.microsoft.com/office/drawing/2017/model3d" xmlns:o="urn:schemas-microsoft-com:office:office" xmlns:oel="http://schemas.microsoft.com/office/2019/extlst" xmlns:r="http://schemas.openxmlformats.org/officeDocument/2006/relationships" xmlns:m="http://schemas.openxmlformats.org/officeDocument/2006/math" xmlns:v="urn:schemas-microsoft-com:vml" xmlns:wp14="http://schemas.microsoft.com/office/word/2010/wordprocessingDrawing" xmlns:wp="http://schemas.openxmlformats.org/drawingml/2006/wordprocessingDrawing" xmlns:w10="urn:schemas-microsoft-com:office:word" xmlns:w="http://schemas.openxmlformats.org/wordprocessingml/2006/main" xmlns:w14="http://schemas.microsoft.com/office/word/2010/wordml" xmlns:w15="http://schemas.microsoft.com/office/word/2012/wordml" xmlns:w16cex="http://schemas.microsoft.com/office/word/2018/wordml/cex" xmlns:w16cid="http://schemas.microsoft.com/office/word/2016/wordml/cid" xmlns:w16="http://schemas.microsoft.com/office/word/2018/wordml" xmlns:w16sdtdh="http://schemas.microsoft.com/office/word/2020/wordml/sdtdatahash" xmlns:w16se="http://schemas.microsoft.com/office/word/2015/wordml/symex" xmlns:wpg="http://schemas.microsoft.com/office/word/2010/wordprocessingGroup" xmlns:wpi="http://schemas.microsoft.com/office/word/2010/wordprocessingInk" xmlns:wne="http://schemas.microsoft.com/office/word/2006/wordml" xmlns:wps="http://schemas.microsoft.com/office/word/2010/wordprocessingShape" mc:Ignorable="w14 w15 w16se w16cid w16 w16cex w16sdtdh wp14">
+  <w:p>
+    <w:pPr>
+      <w:pStyle w:val="Header"/>
+    </w:pPr>
+  </w:p>
+</w:hdr>
+</file>
+
+<file path=word/header2.xml><?xml version="1.0" encoding="utf-8"?>
 <w:hdr xmlns:wpc="http://schemas.microsoft.com/office/word/2010/wordprocessingCanvas" xmlns:cx="http://schemas.microsoft.com/office/drawing/2014/chartex" xmlns:cx1="http://schemas.microsoft.com/office/drawing/2015/9/8/chartex" xmlns:cx2="http://schemas.microsoft.com/office/drawing/2015/10/21/chartex" xmlns:cx3="http://schemas.microsoft.com/office/drawing/2016/5/9/chartex" xmlns:cx4="http://schemas.microsoft.com/office/drawing/2016/5/10/chartex" xmlns:cx5="http://schemas.microsoft.com/office/drawing/2016/5/11/chartex" xmlns:cx6="http://schemas.microsoft.com/office/drawing/2016/5/12/chartex" xmlns:cx7="http://schemas.microsoft.com/office/drawing/2016/5/13/chartex" xmlns:cx8="http://schemas.microsoft.com/office/drawing/2016/5/14/chartex" xmlns:mc="http://schemas.openxmlformats.org/markup-compatibility/2006" xmlns:aink="http://schemas.microsoft.com/office/drawing/2016/ink" xmlns:am3d="http://schemas.microsoft.com/office/drawing/2017/model3d" xmlns:o="urn:schemas-microsoft-com:office:office" xmlns:oel="http://schemas.microsoft.com/office/2019/extlst" xmlns:r="http://schemas.openxmlformats.org/officeDocument/2006/relationships" xmlns:m="http://schemas.openxmlformats.org/officeDocument/2006/math" xmlns:v="urn:schemas-microsoft-com:vml" xmlns:wp14="http://schemas.microsoft.com/office/word/2010/wordprocessingDrawing" xmlns:wp="http://schemas.openxmlformats.org/drawingml/2006/wordprocessingDrawing" xmlns:w10="urn:schemas-microsoft-com:office:word" xmlns:w="http://schemas.openxmlformats.org/wordprocessingml/2006/main" xmlns:w14="http://schemas.microsoft.com/office/word/2010/wordml" xmlns:w15="http://schemas.microsoft.com/office/word/2012/wordml" xmlns:w16cex="http://schemas.microsoft.com/office/word/2018/wordml/cex" xmlns:w16cid="http://schemas.microsoft.com/office/word/2016/wordml/cid" xmlns:w16="http://schemas.microsoft.com/office/word/2018/wordml" xmlns:w16sdtdh="http://schemas.microsoft.com/office/word/2020/wordml/sdtdatahash" xmlns:w16se="http://schemas.microsoft.com/office/word/2015/wordml/symex" xmlns:wpg="http://schemas.microsoft.com/office/word/2010/wordprocessingGroup" xmlns:wpi="http://schemas.microsoft.com/office/word/2010/wordprocessingInk" xmlns:wne="http://schemas.microsoft.com/office/word/2006/wordml" xmlns:wps="http://schemas.microsoft.com/office/word/2010/wordprocessingShape" mc:Ignorable="w14 w15 w16se w16cid w16 w16cex w16sdtdh wp14">
   <w:tbl>
     <w:tblPr>
@@ -294,6 +328,16 @@
         <w:szCs w:val="2"/>
         <w:lang w:val="de-CH"/>
       </w:rPr>
+    </w:pPr>
+  </w:p>
+</w:hdr>
+</file>
+
+<file path=word/header3.xml><?xml version="1.0" encoding="utf-8"?>
+<w:hdr xmlns:wpc="http://schemas.microsoft.com/office/word/2010/wordprocessingCanvas" xmlns:cx="http://schemas.microsoft.com/office/drawing/2014/chartex" xmlns:cx1="http://schemas.microsoft.com/office/drawing/2015/9/8/chartex" xmlns:cx2="http://schemas.microsoft.com/office/drawing/2015/10/21/chartex" xmlns:cx3="http://schemas.microsoft.com/office/drawing/2016/5/9/chartex" xmlns:cx4="http://schemas.microsoft.com/office/drawing/2016/5/10/chartex" xmlns:cx5="http://schemas.microsoft.com/office/drawing/2016/5/11/chartex" xmlns:cx6="http://schemas.microsoft.com/office/drawing/2016/5/12/chartex" xmlns:cx7="http://schemas.microsoft.com/office/drawing/2016/5/13/chartex" xmlns:cx8="http://schemas.microsoft.com/office/drawing/2016/5/14/chartex" xmlns:mc="http://schemas.openxmlformats.org/markup-compatibility/2006" xmlns:aink="http://schemas.microsoft.com/office/drawing/2016/ink" xmlns:am3d="http://schemas.microsoft.com/office/drawing/2017/model3d" xmlns:o="urn:schemas-microsoft-com:office:office" xmlns:oel="http://schemas.microsoft.com/office/2019/extlst" xmlns:r="http://schemas.openxmlformats.org/officeDocument/2006/relationships" xmlns:m="http://schemas.openxmlformats.org/officeDocument/2006/math" xmlns:v="urn:schemas-microsoft-com:vml" xmlns:wp14="http://schemas.microsoft.com/office/word/2010/wordprocessingDrawing" xmlns:wp="http://schemas.openxmlformats.org/drawingml/2006/wordprocessingDrawing" xmlns:w10="urn:schemas-microsoft-com:office:word" xmlns:w="http://schemas.openxmlformats.org/wordprocessingml/2006/main" xmlns:w14="http://schemas.microsoft.com/office/word/2010/wordml" xmlns:w15="http://schemas.microsoft.com/office/word/2012/wordml" xmlns:w16cex="http://schemas.microsoft.com/office/word/2018/wordml/cex" xmlns:w16cid="http://schemas.microsoft.com/office/word/2016/wordml/cid" xmlns:w16="http://schemas.microsoft.com/office/word/2018/wordml" xmlns:w16sdtdh="http://schemas.microsoft.com/office/word/2020/wordml/sdtdatahash" xmlns:w16se="http://schemas.microsoft.com/office/word/2015/wordml/symex" xmlns:wpg="http://schemas.microsoft.com/office/word/2010/wordprocessingGroup" xmlns:wpi="http://schemas.microsoft.com/office/word/2010/wordprocessingInk" xmlns:wne="http://schemas.microsoft.com/office/word/2006/wordml" xmlns:wps="http://schemas.microsoft.com/office/word/2010/wordprocessingShape" mc:Ignorable="w14 w15 w16se w16cid w16 w16cex w16sdtdh wp14">
+  <w:p>
+    <w:pPr>
+      <w:pStyle w:val="Header"/>
     </w:pPr>
   </w:p>
 </w:hdr>
@@ -16957,21 +17001,6 @@
 </file>
 
 <file path=customXml/item1.xml><?xml version="1.0" encoding="utf-8"?>
-<p:properties xmlns:p="http://schemas.microsoft.com/office/2006/metadata/properties" xmlns:xsi="http://www.w3.org/2001/XMLSchema-instance" xmlns:pc="http://schemas.microsoft.com/office/infopath/2007/PartnerControls">
-  <documentManagement/>
-</p:properties>
-</file>
-
-<file path=customXml/item2.xml><?xml version="1.0" encoding="utf-8"?>
-<?mso-contentType ?>
-<FormTemplates xmlns="http://schemas.microsoft.com/sharepoint/v3/contenttype/forms">
-  <Display>DocumentLibraryForm</Display>
-  <Edit>DocumentLibraryForm</Edit>
-  <New>DocumentLibraryForm</New>
-</FormTemplates>
-</file>
-
-<file path=customXml/item3.xml><?xml version="1.0" encoding="utf-8"?>
 <ct:contentTypeSchema xmlns:ct="http://schemas.microsoft.com/office/2006/metadata/contentType" xmlns:ma="http://schemas.microsoft.com/office/2006/metadata/properties/metaAttributes" ct:_="" ma:_="" ma:contentTypeName="Document" ma:contentTypeID="0x0101006CD819919156C74F9E80DEFAAA1872C9" ma:contentTypeVersion="13" ma:contentTypeDescription="Create a new document." ma:contentTypeScope="" ma:versionID="50fe0e456e6faea8f88245a91881c3b5">
   <xsd:schema xmlns:xsd="http://www.w3.org/2001/XMLSchema" xmlns:xs="http://www.w3.org/2001/XMLSchema" xmlns:p="http://schemas.microsoft.com/office/2006/metadata/properties" xmlns:ns3="ad003f3d-2e17-4db5-b60d-526df86ad0f0" xmlns:ns4="fe03d810-5ba5-4302-839c-9214d405f10a" targetNamespace="http://schemas.microsoft.com/office/2006/metadata/properties" ma:root="true" ma:fieldsID="6e6e107fec7a88999611c5ac4043d74e" ns3:_="" ns4:_="">
     <xsd:import namespace="ad003f3d-2e17-4db5-b60d-526df86ad0f0"/>
@@ -17194,28 +17223,26 @@
 </ct:contentTypeSchema>
 </file>
 
+<file path=customXml/item2.xml><?xml version="1.0" encoding="utf-8"?>
+<?mso-contentType ?>
+<FormTemplates xmlns="http://schemas.microsoft.com/sharepoint/v3/contenttype/forms">
+  <Display>DocumentLibraryForm</Display>
+  <Edit>DocumentLibraryForm</Edit>
+  <New>DocumentLibraryForm</New>
+</FormTemplates>
+</file>
+
+<file path=customXml/item3.xml><?xml version="1.0" encoding="utf-8"?>
+<p:properties xmlns:p="http://schemas.microsoft.com/office/2006/metadata/properties" xmlns:xsi="http://www.w3.org/2001/XMLSchema-instance" xmlns:pc="http://schemas.microsoft.com/office/infopath/2007/PartnerControls">
+  <documentManagement/>
+</p:properties>
+</file>
+
 <file path=customXml/item4.xml><?xml version="1.0" encoding="utf-8"?>
 <b:Sources xmlns:b="http://schemas.openxmlformats.org/officeDocument/2006/bibliography" xmlns="http://schemas.openxmlformats.org/officeDocument/2006/bibliography" SelectedStyle="\APA.XSL" StyleName="APA"/>
 </file>
 
 <file path=customXml/itemProps1.xml><?xml version="1.0" encoding="utf-8"?>
-<ds:datastoreItem xmlns:ds="http://schemas.openxmlformats.org/officeDocument/2006/customXml" ds:itemID="{FCF06B24-A51F-4A21-B53C-33296C61BF86}">
-  <ds:schemaRefs>
-    <ds:schemaRef ds:uri="http://schemas.microsoft.com/office/2006/metadata/properties"/>
-    <ds:schemaRef ds:uri="http://schemas.microsoft.com/office/infopath/2007/PartnerControls"/>
-  </ds:schemaRefs>
-</ds:datastoreItem>
-</file>
-
-<file path=customXml/itemProps2.xml><?xml version="1.0" encoding="utf-8"?>
-<ds:datastoreItem xmlns:ds="http://schemas.openxmlformats.org/officeDocument/2006/customXml" ds:itemID="{33FCBF9B-6E0C-4F57-AC32-FF1FD3666DDF}">
-  <ds:schemaRefs>
-    <ds:schemaRef ds:uri="http://schemas.microsoft.com/sharepoint/v3/contenttype/forms"/>
-  </ds:schemaRefs>
-</ds:datastoreItem>
-</file>
-
-<file path=customXml/itemProps3.xml><?xml version="1.0" encoding="utf-8"?>
 <ds:datastoreItem xmlns:ds="http://schemas.openxmlformats.org/officeDocument/2006/customXml" ds:itemID="{6920E0C2-09F2-44E2-A637-8E6DCD4CC191}">
   <ds:schemaRefs>
     <ds:schemaRef ds:uri="http://schemas.microsoft.com/office/2006/metadata/contentType"/>
@@ -17234,6 +17261,23 @@
 </ds:datastoreItem>
 </file>
 
+<file path=customXml/itemProps2.xml><?xml version="1.0" encoding="utf-8"?>
+<ds:datastoreItem xmlns:ds="http://schemas.openxmlformats.org/officeDocument/2006/customXml" ds:itemID="{33FCBF9B-6E0C-4F57-AC32-FF1FD3666DDF}">
+  <ds:schemaRefs>
+    <ds:schemaRef ds:uri="http://schemas.microsoft.com/sharepoint/v3/contenttype/forms"/>
+  </ds:schemaRefs>
+</ds:datastoreItem>
+</file>
+
+<file path=customXml/itemProps3.xml><?xml version="1.0" encoding="utf-8"?>
+<ds:datastoreItem xmlns:ds="http://schemas.openxmlformats.org/officeDocument/2006/customXml" ds:itemID="{FCF06B24-A51F-4A21-B53C-33296C61BF86}">
+  <ds:schemaRefs>
+    <ds:schemaRef ds:uri="http://schemas.microsoft.com/office/2006/metadata/properties"/>
+    <ds:schemaRef ds:uri="http://schemas.microsoft.com/office/infopath/2007/PartnerControls"/>
+  </ds:schemaRefs>
+</ds:datastoreItem>
+</file>
+
 <file path=customXml/itemProps4.xml><?xml version="1.0" encoding="utf-8"?>
 <ds:datastoreItem xmlns:ds="http://schemas.openxmlformats.org/officeDocument/2006/customXml" ds:itemID="{1C73CA8F-0D0F-4C99-8EE8-8C153284B2D9}">
   <ds:schemaRefs>

</xml_diff>

<commit_message>
Change version to 1.0
</commit_message>
<xml_diff>
--- a/www/template_officer.docx
+++ b/www/template_officer.docx
@@ -106,6 +106,12 @@
               <w:lang w:val="de-CH"/>
             </w:rPr>
           </w:pPr>
+          <w:r>
+            <w:rPr>
+              <w:rFonts w:eastAsia="Times New Roman" w:cs="Times New Roman"/>
+            </w:rPr>
+            <w:t>version</w:t>
+          </w:r>
         </w:p>
       </w:tc>
       <w:tc>
@@ -17001,6 +17007,25 @@
 </file>
 
 <file path=customXml/item1.xml><?xml version="1.0" encoding="utf-8"?>
+<b:Sources xmlns:b="http://schemas.openxmlformats.org/officeDocument/2006/bibliography" xmlns="http://schemas.openxmlformats.org/officeDocument/2006/bibliography" SelectedStyle="\APA.XSL" StyleName="APA"/>
+</file>
+
+<file path=customXml/item2.xml><?xml version="1.0" encoding="utf-8"?>
+<p:properties xmlns:p="http://schemas.microsoft.com/office/2006/metadata/properties" xmlns:xsi="http://www.w3.org/2001/XMLSchema-instance" xmlns:pc="http://schemas.microsoft.com/office/infopath/2007/PartnerControls">
+  <documentManagement/>
+</p:properties>
+</file>
+
+<file path=customXml/item3.xml><?xml version="1.0" encoding="utf-8"?>
+<?mso-contentType ?>
+<FormTemplates xmlns="http://schemas.microsoft.com/sharepoint/v3/contenttype/forms">
+  <Display>DocumentLibraryForm</Display>
+  <Edit>DocumentLibraryForm</Edit>
+  <New>DocumentLibraryForm</New>
+</FormTemplates>
+</file>
+
+<file path=customXml/item4.xml><?xml version="1.0" encoding="utf-8"?>
 <ct:contentTypeSchema xmlns:ct="http://schemas.microsoft.com/office/2006/metadata/contentType" xmlns:ma="http://schemas.microsoft.com/office/2006/metadata/properties/metaAttributes" ct:_="" ma:_="" ma:contentTypeName="Document" ma:contentTypeID="0x0101006CD819919156C74F9E80DEFAAA1872C9" ma:contentTypeVersion="13" ma:contentTypeDescription="Create a new document." ma:contentTypeScope="" ma:versionID="50fe0e456e6faea8f88245a91881c3b5">
   <xsd:schema xmlns:xsd="http://www.w3.org/2001/XMLSchema" xmlns:xs="http://www.w3.org/2001/XMLSchema" xmlns:p="http://schemas.microsoft.com/office/2006/metadata/properties" xmlns:ns3="ad003f3d-2e17-4db5-b60d-526df86ad0f0" xmlns:ns4="fe03d810-5ba5-4302-839c-9214d405f10a" targetNamespace="http://schemas.microsoft.com/office/2006/metadata/properties" ma:root="true" ma:fieldsID="6e6e107fec7a88999611c5ac4043d74e" ns3:_="" ns4:_="">
     <xsd:import namespace="ad003f3d-2e17-4db5-b60d-526df86ad0f0"/>
@@ -17223,26 +17248,32 @@
 </ct:contentTypeSchema>
 </file>
 
-<file path=customXml/item2.xml><?xml version="1.0" encoding="utf-8"?>
-<?mso-contentType ?>
-<FormTemplates xmlns="http://schemas.microsoft.com/sharepoint/v3/contenttype/forms">
-  <Display>DocumentLibraryForm</Display>
-  <Edit>DocumentLibraryForm</Edit>
-  <New>DocumentLibraryForm</New>
-</FormTemplates>
+<file path=customXml/itemProps1.xml><?xml version="1.0" encoding="utf-8"?>
+<ds:datastoreItem xmlns:ds="http://schemas.openxmlformats.org/officeDocument/2006/customXml" ds:itemID="{1C73CA8F-0D0F-4C99-8EE8-8C153284B2D9}">
+  <ds:schemaRefs>
+    <ds:schemaRef ds:uri="http://schemas.openxmlformats.org/officeDocument/2006/bibliography"/>
+  </ds:schemaRefs>
+</ds:datastoreItem>
 </file>
 
-<file path=customXml/item3.xml><?xml version="1.0" encoding="utf-8"?>
-<p:properties xmlns:p="http://schemas.microsoft.com/office/2006/metadata/properties" xmlns:xsi="http://www.w3.org/2001/XMLSchema-instance" xmlns:pc="http://schemas.microsoft.com/office/infopath/2007/PartnerControls">
-  <documentManagement/>
-</p:properties>
+<file path=customXml/itemProps2.xml><?xml version="1.0" encoding="utf-8"?>
+<ds:datastoreItem xmlns:ds="http://schemas.openxmlformats.org/officeDocument/2006/customXml" ds:itemID="{FCF06B24-A51F-4A21-B53C-33296C61BF86}">
+  <ds:schemaRefs>
+    <ds:schemaRef ds:uri="http://schemas.microsoft.com/office/2006/metadata/properties"/>
+    <ds:schemaRef ds:uri="http://schemas.microsoft.com/office/infopath/2007/PartnerControls"/>
+  </ds:schemaRefs>
+</ds:datastoreItem>
 </file>
 
-<file path=customXml/item4.xml><?xml version="1.0" encoding="utf-8"?>
-<b:Sources xmlns:b="http://schemas.openxmlformats.org/officeDocument/2006/bibliography" xmlns="http://schemas.openxmlformats.org/officeDocument/2006/bibliography" SelectedStyle="\APA.XSL" StyleName="APA"/>
+<file path=customXml/itemProps3.xml><?xml version="1.0" encoding="utf-8"?>
+<ds:datastoreItem xmlns:ds="http://schemas.openxmlformats.org/officeDocument/2006/customXml" ds:itemID="{33FCBF9B-6E0C-4F57-AC32-FF1FD3666DDF}">
+  <ds:schemaRefs>
+    <ds:schemaRef ds:uri="http://schemas.microsoft.com/sharepoint/v3/contenttype/forms"/>
+  </ds:schemaRefs>
+</ds:datastoreItem>
 </file>
 
-<file path=customXml/itemProps1.xml><?xml version="1.0" encoding="utf-8"?>
+<file path=customXml/itemProps4.xml><?xml version="1.0" encoding="utf-8"?>
 <ds:datastoreItem xmlns:ds="http://schemas.openxmlformats.org/officeDocument/2006/customXml" ds:itemID="{6920E0C2-09F2-44E2-A637-8E6DCD4CC191}">
   <ds:schemaRefs>
     <ds:schemaRef ds:uri="http://schemas.microsoft.com/office/2006/metadata/contentType"/>
@@ -17259,29 +17290,4 @@
     <ds:schemaRef ds:uri="http://schemas.microsoft.com/internal/obd"/>
   </ds:schemaRefs>
 </ds:datastoreItem>
-</file>
-
-<file path=customXml/itemProps2.xml><?xml version="1.0" encoding="utf-8"?>
-<ds:datastoreItem xmlns:ds="http://schemas.openxmlformats.org/officeDocument/2006/customXml" ds:itemID="{33FCBF9B-6E0C-4F57-AC32-FF1FD3666DDF}">
-  <ds:schemaRefs>
-    <ds:schemaRef ds:uri="http://schemas.microsoft.com/sharepoint/v3/contenttype/forms"/>
-  </ds:schemaRefs>
-</ds:datastoreItem>
-</file>
-
-<file path=customXml/itemProps3.xml><?xml version="1.0" encoding="utf-8"?>
-<ds:datastoreItem xmlns:ds="http://schemas.openxmlformats.org/officeDocument/2006/customXml" ds:itemID="{FCF06B24-A51F-4A21-B53C-33296C61BF86}">
-  <ds:schemaRefs>
-    <ds:schemaRef ds:uri="http://schemas.microsoft.com/office/2006/metadata/properties"/>
-    <ds:schemaRef ds:uri="http://schemas.microsoft.com/office/infopath/2007/PartnerControls"/>
-  </ds:schemaRefs>
-</ds:datastoreItem>
-</file>
-
-<file path=customXml/itemProps4.xml><?xml version="1.0" encoding="utf-8"?>
-<ds:datastoreItem xmlns:ds="http://schemas.openxmlformats.org/officeDocument/2006/customXml" ds:itemID="{1C73CA8F-0D0F-4C99-8EE8-8C153284B2D9}">
-  <ds:schemaRefs>
-    <ds:schemaRef ds:uri="http://schemas.openxmlformats.org/officeDocument/2006/bibliography"/>
-  </ds:schemaRefs>
-</ds:datastoreItem>
 </file>
</xml_diff>